<commit_message>
ansible - aad-hoc updated
</commit_message>
<xml_diff>
--- a/Ansible/4-ad‑hoc-commands.docx
+++ b/Ansible/4-ad‑hoc-commands.docx
@@ -4055,19 +4055,7 @@
           <w:sz w:val="28"/>
           <w:szCs w:val="28"/>
         </w:rPr>
-        <w:t>--</w:t>
-      </w:r>
-      <w:r>
-        <w:rPr>
-          <w:rFonts w:asciiTheme="majorBidi" w:hAnsiTheme="majorBidi" w:cstheme="majorBidi"/>
-          <w:b/>
-          <w:bCs/>
-          <w:i/>
-          <w:iCs/>
-          <w:sz w:val="28"/>
-          <w:szCs w:val="28"/>
-        </w:rPr>
-        <w:t>private-key</w:t>
+        <w:t>--private-key</w:t>
       </w:r>
       <w:r>
         <w:rPr>
@@ -16260,7 +16248,19 @@
           <w:sz w:val="28"/>
           <w:szCs w:val="28"/>
         </w:rPr>
-        <w:t>Forks</w:t>
+        <w:t>f</w:t>
+      </w:r>
+      <w:r>
+        <w:rPr>
+          <w:rFonts w:asciiTheme="majorBidi" w:hAnsiTheme="majorBidi" w:cstheme="majorBidi"/>
+          <w:b/>
+          <w:bCs/>
+          <w:i/>
+          <w:iCs/>
+          <w:sz w:val="28"/>
+          <w:szCs w:val="28"/>
+        </w:rPr>
+        <w:t>orks</w:t>
       </w:r>
       <w:r>
         <w:rPr>

</xml_diff>

<commit_message>
ansible - ad-hoc-commands updated
</commit_message>
<xml_diff>
--- a/Ansible/4-ad‑hoc-commands.docx
+++ b/Ansible/4-ad‑hoc-commands.docx
@@ -4348,6 +4348,7 @@
       <w:pPr>
         <w:spacing w:after="80"/>
         <w:ind w:left="360"/>
+        <w:jc w:val="both"/>
         <w:rPr>
           <w:rFonts w:asciiTheme="majorBidi" w:hAnsiTheme="majorBidi" w:cstheme="majorBidi"/>
           <w:sz w:val="28"/>
@@ -4398,6 +4399,7 @@
         </w:numPr>
         <w:spacing w:after="60"/>
         <w:ind w:left="720"/>
+        <w:jc w:val="both"/>
         <w:rPr>
           <w:rFonts w:asciiTheme="majorBidi" w:hAnsiTheme="majorBidi" w:cstheme="majorBidi"/>
           <w:sz w:val="28"/>
@@ -4417,6 +4419,7 @@
       <w:pPr>
         <w:spacing w:after="60"/>
         <w:ind w:left="720"/>
+        <w:jc w:val="both"/>
         <w:rPr>
           <w:rFonts w:asciiTheme="majorBidi" w:hAnsiTheme="majorBidi" w:cstheme="majorBidi"/>
           <w:b/>
@@ -4470,6 +4473,7 @@
       <w:pPr>
         <w:spacing w:after="100"/>
         <w:ind w:left="720"/>
+        <w:jc w:val="both"/>
         <w:rPr>
           <w:rFonts w:asciiTheme="majorBidi" w:hAnsiTheme="majorBidi" w:cstheme="majorBidi"/>
           <w:sz w:val="28"/>
@@ -4512,6 +4516,7 @@
         </w:numPr>
         <w:spacing w:after="60"/>
         <w:ind w:left="720"/>
+        <w:jc w:val="both"/>
         <w:rPr>
           <w:rFonts w:asciiTheme="majorBidi" w:hAnsiTheme="majorBidi" w:cstheme="majorBidi"/>
           <w:sz w:val="28"/>
@@ -4531,6 +4536,7 @@
       <w:pPr>
         <w:spacing w:after="60"/>
         <w:ind w:left="720"/>
+        <w:jc w:val="both"/>
         <w:rPr>
           <w:rFonts w:asciiTheme="majorBidi" w:hAnsiTheme="majorBidi" w:cstheme="majorBidi"/>
           <w:b/>
@@ -4584,6 +4590,7 @@
       <w:pPr>
         <w:spacing w:after="100"/>
         <w:ind w:left="720"/>
+        <w:jc w:val="both"/>
         <w:rPr>
           <w:rFonts w:asciiTheme="majorBidi" w:hAnsiTheme="majorBidi" w:cstheme="majorBidi"/>
           <w:sz w:val="28"/>
@@ -4619,6 +4626,7 @@
       <w:pPr>
         <w:spacing w:after="60"/>
         <w:ind w:left="360"/>
+        <w:jc w:val="both"/>
         <w:rPr>
           <w:rFonts w:asciiTheme="majorBidi" w:hAnsiTheme="majorBidi" w:cstheme="majorBidi"/>
           <w:sz w:val="28"/>
@@ -4636,22 +4644,149 @@
     </w:p>
     <w:p>
       <w:pPr>
+        <w:spacing w:after="120"/>
+        <w:ind w:left="360"/>
+        <w:jc w:val="both"/>
+        <w:rPr>
+          <w:rFonts w:asciiTheme="majorBidi" w:hAnsiTheme="majorBidi" w:cstheme="majorBidi"/>
+          <w:sz w:val="28"/>
+          <w:szCs w:val="28"/>
+        </w:rPr>
+      </w:pPr>
+      <w:r>
+        <w:rPr>
+          <w:rFonts w:asciiTheme="majorBidi" w:hAnsiTheme="majorBidi" w:cstheme="majorBidi"/>
+          <w:sz w:val="28"/>
+          <w:szCs w:val="28"/>
+        </w:rPr>
+        <w:t xml:space="preserve">Ansible never prompts for a password unless you explicitly ask it to with </w:t>
+      </w:r>
+      <w:r>
+        <w:rPr>
+          <w:rFonts w:asciiTheme="majorBidi" w:hAnsiTheme="majorBidi" w:cstheme="majorBidi"/>
+          <w:b/>
+          <w:bCs/>
+          <w:i/>
+          <w:iCs/>
+          <w:sz w:val="28"/>
+          <w:szCs w:val="28"/>
+        </w:rPr>
+        <w:t>--ask-pass</w:t>
+      </w:r>
+      <w:r>
+        <w:rPr>
+          <w:rFonts w:asciiTheme="majorBidi" w:hAnsiTheme="majorBidi" w:cstheme="majorBidi"/>
+          <w:sz w:val="28"/>
+          <w:szCs w:val="28"/>
+        </w:rPr>
+        <w:t xml:space="preserve"> or </w:t>
+      </w:r>
+      <w:r>
+        <w:rPr>
+          <w:rFonts w:asciiTheme="majorBidi" w:hAnsiTheme="majorBidi" w:cstheme="majorBidi"/>
+          <w:b/>
+          <w:bCs/>
+          <w:i/>
+          <w:iCs/>
+          <w:sz w:val="28"/>
+          <w:szCs w:val="28"/>
+        </w:rPr>
+        <w:t>-k</w:t>
+      </w:r>
+      <w:r>
+        <w:rPr>
+          <w:rFonts w:asciiTheme="majorBidi" w:hAnsiTheme="majorBidi" w:cstheme="majorBidi"/>
+          <w:sz w:val="28"/>
+          <w:szCs w:val="28"/>
+        </w:rPr>
+        <w:t>.</w:t>
+      </w:r>
+    </w:p>
+    <w:p>
+      <w:pPr>
+        <w:pStyle w:val="ListParagraph"/>
+        <w:numPr>
+          <w:ilvl w:val="0"/>
+          <w:numId w:val="73"/>
+        </w:numPr>
         <w:spacing w:after="100"/>
         <w:ind w:left="360"/>
-        <w:rPr>
-          <w:rFonts w:asciiTheme="majorBidi" w:hAnsiTheme="majorBidi" w:cstheme="majorBidi"/>
-          <w:sz w:val="28"/>
-          <w:szCs w:val="28"/>
-        </w:rPr>
-      </w:pPr>
-      <w:r>
-        <w:rPr>
-          <w:rFonts w:asciiTheme="majorBidi" w:hAnsiTheme="majorBidi" w:cstheme="majorBidi"/>
-          <w:sz w:val="28"/>
-          <w:szCs w:val="28"/>
-        </w:rPr>
-        <w:t xml:space="preserve">Ansible never prompts for a password unless you explicitly ask it to with </w:t>
-      </w:r>
+        <w:jc w:val="both"/>
+        <w:rPr>
+          <w:rFonts w:asciiTheme="majorBidi" w:hAnsiTheme="majorBidi" w:cstheme="majorBidi"/>
+          <w:b/>
+          <w:bCs/>
+          <w:sz w:val="32"/>
+          <w:szCs w:val="32"/>
+        </w:rPr>
+      </w:pPr>
+      <w:r>
+        <w:rPr>
+          <w:rFonts w:asciiTheme="majorBidi" w:hAnsiTheme="majorBidi" w:cstheme="majorBidi"/>
+          <w:b/>
+          <w:bCs/>
+          <w:sz w:val="32"/>
+          <w:szCs w:val="32"/>
+        </w:rPr>
+        <w:t>Why Ansible Needs the Private Key</w:t>
+      </w:r>
+    </w:p>
+    <w:p>
+      <w:pPr>
+        <w:spacing w:after="60"/>
+        <w:ind w:left="360"/>
+        <w:jc w:val="both"/>
+        <w:rPr>
+          <w:rFonts w:asciiTheme="majorBidi" w:hAnsiTheme="majorBidi" w:cstheme="majorBidi"/>
+          <w:sz w:val="32"/>
+          <w:szCs w:val="32"/>
+        </w:rPr>
+      </w:pPr>
+      <w:r>
+        <w:rPr>
+          <w:rFonts w:asciiTheme="majorBidi" w:hAnsiTheme="majorBidi" w:cstheme="majorBidi"/>
+          <w:sz w:val="32"/>
+          <w:szCs w:val="32"/>
+        </w:rPr>
+        <w:t xml:space="preserve">SSH uses asymmetric cryptography </w:t>
+      </w:r>
+      <w:r>
+        <w:rPr>
+          <w:rFonts w:asciiTheme="majorBidi" w:hAnsiTheme="majorBidi" w:cstheme="majorBidi"/>
+          <w:sz w:val="32"/>
+          <w:szCs w:val="32"/>
+        </w:rPr>
+        <w:t>-</w:t>
+      </w:r>
+      <w:r>
+        <w:rPr>
+          <w:rFonts w:asciiTheme="majorBidi" w:hAnsiTheme="majorBidi" w:cstheme="majorBidi"/>
+          <w:sz w:val="32"/>
+          <w:szCs w:val="32"/>
+        </w:rPr>
+        <w:t xml:space="preserve"> a private key on your control node and a public key on the target host.</w:t>
+      </w:r>
+    </w:p>
+    <w:p>
+      <w:pPr>
+        <w:spacing w:after="60"/>
+        <w:ind w:left="360"/>
+        <w:jc w:val="both"/>
+        <w:rPr>
+          <w:rFonts w:asciiTheme="majorBidi" w:hAnsiTheme="majorBidi" w:cstheme="majorBidi"/>
+          <w:sz w:val="32"/>
+          <w:szCs w:val="32"/>
+        </w:rPr>
+      </w:pPr>
+      <w:r>
+        <w:rPr>
+          <w:rFonts w:asciiTheme="majorBidi" w:hAnsiTheme="majorBidi" w:cstheme="majorBidi"/>
+          <w:sz w:val="32"/>
+          <w:szCs w:val="32"/>
+        </w:rPr>
+        <w:t xml:space="preserve">When Ansible connects to a target, it performs an SSH handshake: the target issues a cryptographic challenge, and the control node must sign it with the private key. The target verifies that signature against the public key it already has in </w:t>
+      </w:r>
+      <w:proofErr w:type="spellStart"/>
       <w:r>
         <w:rPr>
           <w:rFonts w:asciiTheme="majorBidi" w:hAnsiTheme="majorBidi" w:cstheme="majorBidi"/>
@@ -4659,38 +4794,949 @@
           <w:bCs/>
           <w:i/>
           <w:iCs/>
-          <w:sz w:val="28"/>
-          <w:szCs w:val="28"/>
-        </w:rPr>
-        <w:t>--ask-pass</w:t>
-      </w:r>
-      <w:r>
-        <w:rPr>
-          <w:rFonts w:asciiTheme="majorBidi" w:hAnsiTheme="majorBidi" w:cstheme="majorBidi"/>
-          <w:sz w:val="28"/>
-          <w:szCs w:val="28"/>
-        </w:rPr>
-        <w:t xml:space="preserve"> or </w:t>
-      </w:r>
-      <w:r>
+          <w:sz w:val="32"/>
+          <w:szCs w:val="32"/>
+        </w:rPr>
+        <w:t>authorized_keys</w:t>
+      </w:r>
+      <w:proofErr w:type="spellEnd"/>
+      <w:r>
+        <w:rPr>
+          <w:rFonts w:asciiTheme="majorBidi" w:hAnsiTheme="majorBidi" w:cstheme="majorBidi"/>
+          <w:sz w:val="32"/>
+          <w:szCs w:val="32"/>
+        </w:rPr>
+        <w:t>.</w:t>
+      </w:r>
+    </w:p>
+    <w:p>
+      <w:pPr>
+        <w:spacing w:after="120"/>
+        <w:ind w:left="360"/>
+        <w:jc w:val="both"/>
+        <w:rPr>
+          <w:rFonts w:asciiTheme="majorBidi" w:hAnsiTheme="majorBidi" w:cstheme="majorBidi"/>
+          <w:sz w:val="32"/>
+          <w:szCs w:val="32"/>
+        </w:rPr>
+      </w:pPr>
+      <w:r>
+        <w:rPr>
+          <w:rFonts w:asciiTheme="majorBidi" w:hAnsiTheme="majorBidi" w:cstheme="majorBidi"/>
+          <w:sz w:val="32"/>
+          <w:szCs w:val="32"/>
+        </w:rPr>
+        <w:t xml:space="preserve">Ansible needs the private key because it is the entity performing this handshake </w:t>
+      </w:r>
+      <w:r>
+        <w:rPr>
+          <w:rFonts w:asciiTheme="majorBidi" w:hAnsiTheme="majorBidi" w:cstheme="majorBidi"/>
+          <w:sz w:val="32"/>
+          <w:szCs w:val="32"/>
+        </w:rPr>
+        <w:t>-</w:t>
+      </w:r>
+      <w:r>
+        <w:rPr>
+          <w:rFonts w:asciiTheme="majorBidi" w:hAnsiTheme="majorBidi" w:cstheme="majorBidi"/>
+          <w:sz w:val="32"/>
+          <w:szCs w:val="32"/>
+        </w:rPr>
+        <w:t xml:space="preserve"> not you manually. This is a mathematical requirement of how asymmetric cryptography works, not an Ansible design choice.</w:t>
+      </w:r>
+    </w:p>
+    <w:p>
+      <w:pPr>
+        <w:spacing w:after="120"/>
+        <w:ind w:left="360"/>
+        <w:rPr>
+          <w:rFonts w:asciiTheme="majorBidi" w:hAnsiTheme="majorBidi" w:cstheme="majorBidi"/>
+          <w:b/>
+          <w:bCs/>
+          <w:sz w:val="32"/>
+          <w:szCs w:val="32"/>
+        </w:rPr>
+      </w:pPr>
+      <w:r>
+        <w:rPr>
+          <w:rFonts w:asciiTheme="majorBidi" w:hAnsiTheme="majorBidi" w:cstheme="majorBidi"/>
+          <w:b/>
+          <w:bCs/>
+          <w:sz w:val="32"/>
+          <w:szCs w:val="32"/>
+        </w:rPr>
+        <w:t>The production-correct approach:</w:t>
+      </w:r>
+    </w:p>
+    <w:p>
+      <w:pPr>
+        <w:spacing w:after="120"/>
+        <w:ind w:left="360"/>
+        <w:rPr>
+          <w:rFonts w:asciiTheme="majorBidi" w:hAnsiTheme="majorBidi" w:cstheme="majorBidi"/>
+          <w:sz w:val="32"/>
+          <w:szCs w:val="32"/>
+        </w:rPr>
+      </w:pPr>
+      <w:r>
+        <w:rPr>
+          <w:rFonts w:asciiTheme="majorBidi" w:hAnsiTheme="majorBidi" w:cstheme="majorBidi"/>
+          <w:sz w:val="32"/>
+          <w:szCs w:val="32"/>
+        </w:rPr>
+        <w:lastRenderedPageBreak/>
+        <w:t>In serious infrastructure you should not use a personal key for Ansible. Instead:</w:t>
+      </w:r>
+    </w:p>
+    <w:p>
+      <w:pPr>
+        <w:pStyle w:val="ListParagraph"/>
+        <w:numPr>
+          <w:ilvl w:val="0"/>
+          <w:numId w:val="74"/>
+        </w:numPr>
+        <w:spacing w:after="60"/>
+        <w:rPr>
+          <w:rFonts w:asciiTheme="majorBidi" w:hAnsiTheme="majorBidi" w:cstheme="majorBidi"/>
+          <w:b/>
+          <w:bCs/>
+          <w:sz w:val="32"/>
+          <w:szCs w:val="32"/>
+        </w:rPr>
+      </w:pPr>
+      <w:r>
+        <w:rPr>
+          <w:rFonts w:asciiTheme="majorBidi" w:hAnsiTheme="majorBidi" w:cstheme="majorBidi"/>
+          <w:b/>
+          <w:bCs/>
+          <w:sz w:val="32"/>
+          <w:szCs w:val="32"/>
+        </w:rPr>
+        <w:t>Generate a dedicated key pair for Ansible automation</w:t>
+      </w:r>
+    </w:p>
+    <w:p>
+      <w:pPr>
+        <w:spacing w:after="120"/>
+        <w:ind w:left="720"/>
         <w:rPr>
           <w:rFonts w:asciiTheme="majorBidi" w:hAnsiTheme="majorBidi" w:cstheme="majorBidi"/>
           <w:b/>
           <w:bCs/>
           <w:i/>
           <w:iCs/>
-          <w:sz w:val="28"/>
-          <w:szCs w:val="28"/>
-        </w:rPr>
-        <w:t>-k</w:t>
-      </w:r>
-      <w:r>
-        <w:rPr>
-          <w:rFonts w:asciiTheme="majorBidi" w:hAnsiTheme="majorBidi" w:cstheme="majorBidi"/>
-          <w:sz w:val="28"/>
-          <w:szCs w:val="28"/>
-        </w:rPr>
-        <w:t>.</w:t>
+          <w:sz w:val="32"/>
+          <w:szCs w:val="32"/>
+        </w:rPr>
+      </w:pPr>
+      <w:r>
+        <w:rPr>
+          <w:rFonts w:asciiTheme="majorBidi" w:hAnsiTheme="majorBidi" w:cstheme="majorBidi"/>
+          <w:b/>
+          <w:bCs/>
+          <w:i/>
+          <w:iCs/>
+          <w:sz w:val="32"/>
+          <w:szCs w:val="32"/>
+        </w:rPr>
+        <w:t>ssh-keygen -t ed25519 -f ~/.ssh/</w:t>
+      </w:r>
+      <w:proofErr w:type="spellStart"/>
+      <w:r>
+        <w:rPr>
+          <w:rFonts w:asciiTheme="majorBidi" w:hAnsiTheme="majorBidi" w:cstheme="majorBidi"/>
+          <w:b/>
+          <w:bCs/>
+          <w:i/>
+          <w:iCs/>
+          <w:sz w:val="32"/>
+          <w:szCs w:val="32"/>
+        </w:rPr>
+        <w:t>ansible_automation</w:t>
+      </w:r>
+      <w:proofErr w:type="spellEnd"/>
+      <w:r>
+        <w:rPr>
+          <w:rFonts w:asciiTheme="majorBidi" w:hAnsiTheme="majorBidi" w:cstheme="majorBidi"/>
+          <w:b/>
+          <w:bCs/>
+          <w:i/>
+          <w:iCs/>
+          <w:sz w:val="32"/>
+          <w:szCs w:val="32"/>
+        </w:rPr>
+        <w:t xml:space="preserve"> -C "ansible-service-account"</w:t>
+      </w:r>
+    </w:p>
+    <w:p>
+      <w:pPr>
+        <w:pStyle w:val="ListParagraph"/>
+        <w:numPr>
+          <w:ilvl w:val="0"/>
+          <w:numId w:val="74"/>
+        </w:numPr>
+        <w:spacing w:after="60"/>
+        <w:rPr>
+          <w:rFonts w:asciiTheme="majorBidi" w:hAnsiTheme="majorBidi" w:cstheme="majorBidi"/>
+          <w:b/>
+          <w:bCs/>
+          <w:sz w:val="32"/>
+          <w:szCs w:val="32"/>
+        </w:rPr>
+      </w:pPr>
+      <w:r>
+        <w:rPr>
+          <w:rFonts w:asciiTheme="majorBidi" w:hAnsiTheme="majorBidi" w:cstheme="majorBidi"/>
+          <w:b/>
+          <w:bCs/>
+          <w:sz w:val="32"/>
+          <w:szCs w:val="32"/>
+        </w:rPr>
+        <w:t>Distribute the public key to all target hosts</w:t>
+      </w:r>
+    </w:p>
+    <w:p>
+      <w:pPr>
+        <w:spacing w:after="120"/>
+        <w:ind w:left="720"/>
+        <w:rPr>
+          <w:rFonts w:asciiTheme="majorBidi" w:hAnsiTheme="majorBidi" w:cstheme="majorBidi"/>
+          <w:b/>
+          <w:bCs/>
+          <w:i/>
+          <w:iCs/>
+          <w:sz w:val="32"/>
+          <w:szCs w:val="32"/>
+        </w:rPr>
+      </w:pPr>
+      <w:r>
+        <w:rPr>
+          <w:rFonts w:asciiTheme="majorBidi" w:hAnsiTheme="majorBidi" w:cstheme="majorBidi"/>
+          <w:b/>
+          <w:bCs/>
+          <w:i/>
+          <w:iCs/>
+          <w:sz w:val="32"/>
+          <w:szCs w:val="32"/>
+        </w:rPr>
+        <w:t>ssh-copy-id -</w:t>
+      </w:r>
+      <w:proofErr w:type="spellStart"/>
+      <w:r>
+        <w:rPr>
+          <w:rFonts w:asciiTheme="majorBidi" w:hAnsiTheme="majorBidi" w:cstheme="majorBidi"/>
+          <w:b/>
+          <w:bCs/>
+          <w:i/>
+          <w:iCs/>
+          <w:sz w:val="32"/>
+          <w:szCs w:val="32"/>
+        </w:rPr>
+        <w:t>i</w:t>
+      </w:r>
+      <w:proofErr w:type="spellEnd"/>
+      <w:r>
+        <w:rPr>
+          <w:rFonts w:asciiTheme="majorBidi" w:hAnsiTheme="majorBidi" w:cstheme="majorBidi"/>
+          <w:b/>
+          <w:bCs/>
+          <w:i/>
+          <w:iCs/>
+          <w:sz w:val="32"/>
+          <w:szCs w:val="32"/>
+        </w:rPr>
+        <w:t xml:space="preserve"> ~/.ssh/ansible_automation.pub </w:t>
+      </w:r>
+      <w:proofErr w:type="spellStart"/>
+      <w:r>
+        <w:rPr>
+          <w:rFonts w:asciiTheme="majorBidi" w:hAnsiTheme="majorBidi" w:cstheme="majorBidi"/>
+          <w:b/>
+          <w:bCs/>
+          <w:i/>
+          <w:iCs/>
+          <w:sz w:val="32"/>
+          <w:szCs w:val="32"/>
+        </w:rPr>
+        <w:t>ubuntu@target-host</w:t>
+      </w:r>
+      <w:proofErr w:type="spellEnd"/>
+    </w:p>
+    <w:p>
+      <w:pPr>
+        <w:pStyle w:val="ListParagraph"/>
+        <w:numPr>
+          <w:ilvl w:val="0"/>
+          <w:numId w:val="74"/>
+        </w:numPr>
+        <w:spacing w:after="120"/>
+        <w:rPr>
+          <w:rFonts w:asciiTheme="majorBidi" w:hAnsiTheme="majorBidi" w:cstheme="majorBidi"/>
+          <w:b/>
+          <w:bCs/>
+          <w:sz w:val="32"/>
+          <w:szCs w:val="32"/>
+        </w:rPr>
+      </w:pPr>
+      <w:r>
+        <w:rPr>
+          <w:rFonts w:asciiTheme="majorBidi" w:hAnsiTheme="majorBidi" w:cstheme="majorBidi"/>
+          <w:b/>
+          <w:bCs/>
+          <w:noProof/>
+          <w:sz w:val="32"/>
+          <w:szCs w:val="32"/>
+        </w:rPr>
+        <mc:AlternateContent>
+          <mc:Choice Requires="wps">
+            <w:drawing>
+              <wp:anchor distT="0" distB="0" distL="114300" distR="114300" simplePos="0" relativeHeight="251682816" behindDoc="0" locked="0" layoutInCell="1" allowOverlap="1" wp14:anchorId="1849AF03" wp14:editId="67569BB9">
+                <wp:simplePos x="0" y="0"/>
+                <wp:positionH relativeFrom="column">
+                  <wp:posOffset>457200</wp:posOffset>
+                </wp:positionH>
+                <wp:positionV relativeFrom="paragraph">
+                  <wp:posOffset>292740</wp:posOffset>
+                </wp:positionV>
+                <wp:extent cx="3995697" cy="653143"/>
+                <wp:effectExtent l="0" t="0" r="24130" b="13970"/>
+                <wp:wrapNone/>
+                <wp:docPr id="159541945" name="Rectangle 22"/>
+                <wp:cNvGraphicFramePr/>
+                <a:graphic xmlns:a="http://schemas.openxmlformats.org/drawingml/2006/main">
+                  <a:graphicData uri="http://schemas.microsoft.com/office/word/2010/wordprocessingShape">
+                    <wps:wsp>
+                      <wps:cNvSpPr/>
+                      <wps:spPr>
+                        <a:xfrm>
+                          <a:off x="0" y="0"/>
+                          <a:ext cx="3995697" cy="653143"/>
+                        </a:xfrm>
+                        <a:prstGeom prst="rect">
+                          <a:avLst/>
+                        </a:prstGeom>
+                      </wps:spPr>
+                      <wps:style>
+                        <a:lnRef idx="2">
+                          <a:schemeClr val="dk1">
+                            <a:shade val="15000"/>
+                          </a:schemeClr>
+                        </a:lnRef>
+                        <a:fillRef idx="1">
+                          <a:schemeClr val="dk1"/>
+                        </a:fillRef>
+                        <a:effectRef idx="0">
+                          <a:schemeClr val="dk1"/>
+                        </a:effectRef>
+                        <a:fontRef idx="minor">
+                          <a:schemeClr val="lt1"/>
+                        </a:fontRef>
+                      </wps:style>
+                      <wps:txbx>
+                        <w:txbxContent>
+                          <w:p>
+                            <w:pPr>
+                              <w:spacing w:after="0"/>
+                              <w:rPr>
+                                <w:rFonts w:asciiTheme="majorBidi" w:hAnsiTheme="majorBidi" w:cstheme="majorBidi"/>
+                                <w:b/>
+                                <w:bCs/>
+                                <w:i/>
+                                <w:iCs/>
+                                <w:sz w:val="32"/>
+                                <w:szCs w:val="32"/>
+                              </w:rPr>
+                            </w:pPr>
+                            <w:r>
+                              <w:rPr>
+                                <w:rFonts w:asciiTheme="majorBidi" w:hAnsiTheme="majorBidi" w:cstheme="majorBidi"/>
+                                <w:sz w:val="32"/>
+                                <w:szCs w:val="32"/>
+                              </w:rPr>
+                              <w:t>[</w:t>
+                            </w:r>
+                            <w:r>
+                              <w:rPr>
+                                <w:rFonts w:asciiTheme="majorBidi" w:hAnsiTheme="majorBidi" w:cstheme="majorBidi"/>
+                                <w:b/>
+                                <w:bCs/>
+                                <w:i/>
+                                <w:iCs/>
+                                <w:sz w:val="32"/>
+                                <w:szCs w:val="32"/>
+                              </w:rPr>
+                              <w:t>defaults]</w:t>
+                            </w:r>
+                          </w:p>
+                          <w:p>
+                            <w:pPr>
+                              <w:spacing w:after="0"/>
+                              <w:jc w:val="both"/>
+                              <w:rPr>
+                                <w:rFonts w:asciiTheme="majorBidi" w:hAnsiTheme="majorBidi" w:cstheme="majorBidi"/>
+                                <w:b/>
+                                <w:bCs/>
+                                <w:i/>
+                                <w:iCs/>
+                                <w:sz w:val="32"/>
+                                <w:szCs w:val="32"/>
+                              </w:rPr>
+                            </w:pPr>
+                            <w:proofErr w:type="spellStart"/>
+                            <w:r>
+                              <w:rPr>
+                                <w:rFonts w:asciiTheme="majorBidi" w:hAnsiTheme="majorBidi" w:cstheme="majorBidi"/>
+                                <w:b/>
+                                <w:bCs/>
+                                <w:i/>
+                                <w:iCs/>
+                                <w:sz w:val="32"/>
+                                <w:szCs w:val="32"/>
+                              </w:rPr>
+                              <w:t>private_key_file</w:t>
+                            </w:r>
+                            <w:proofErr w:type="spellEnd"/>
+                            <w:r>
+                              <w:rPr>
+                                <w:rFonts w:asciiTheme="majorBidi" w:hAnsiTheme="majorBidi" w:cstheme="majorBidi"/>
+                                <w:b/>
+                                <w:bCs/>
+                                <w:i/>
+                                <w:iCs/>
+                                <w:sz w:val="32"/>
+                                <w:szCs w:val="32"/>
+                              </w:rPr>
+                              <w:t xml:space="preserve"> = ~/.ssh/</w:t>
+                            </w:r>
+                            <w:proofErr w:type="spellStart"/>
+                            <w:r>
+                              <w:rPr>
+                                <w:rFonts w:asciiTheme="majorBidi" w:hAnsiTheme="majorBidi" w:cstheme="majorBidi"/>
+                                <w:b/>
+                                <w:bCs/>
+                                <w:i/>
+                                <w:iCs/>
+                                <w:sz w:val="32"/>
+                                <w:szCs w:val="32"/>
+                              </w:rPr>
+                              <w:t>ansible_automation</w:t>
+                            </w:r>
+                            <w:proofErr w:type="spellEnd"/>
+                          </w:p>
+                          <w:p>
+                            <w:pPr>
+                              <w:jc w:val="center"/>
+                            </w:pPr>
+                          </w:p>
+                        </w:txbxContent>
+                      </wps:txbx>
+                      <wps:bodyPr rot="0" spcFirstLastPara="0" vertOverflow="overflow" horzOverflow="overflow" vert="horz" wrap="square" lIns="91440" tIns="45720" rIns="91440" bIns="45720" numCol="1" spcCol="0" rtlCol="0" fromWordArt="0" anchor="ctr" anchorCtr="0" forceAA="0" compatLnSpc="1">
+                        <a:prstTxWarp prst="textNoShape">
+                          <a:avLst/>
+                        </a:prstTxWarp>
+                        <a:noAutofit/>
+                      </wps:bodyPr>
+                    </wps:wsp>
+                  </a:graphicData>
+                </a:graphic>
+                <wp14:sizeRelH relativeFrom="margin">
+                  <wp14:pctWidth>0</wp14:pctWidth>
+                </wp14:sizeRelH>
+                <wp14:sizeRelV relativeFrom="margin">
+                  <wp14:pctHeight>0</wp14:pctHeight>
+                </wp14:sizeRelV>
+              </wp:anchor>
+            </w:drawing>
+          </mc:Choice>
+          <mc:Fallback>
+            <w:pict>
+              <v:rect w14:anchorId="1849AF03" id="Rectangle 22" o:spid="_x0000_s1028" style="position:absolute;left:0;text-align:left;margin-left:36pt;margin-top:23.05pt;width:314.6pt;height:51.45pt;z-index:251682816;visibility:visible;mso-wrap-style:square;mso-width-percent:0;mso-height-percent:0;mso-wrap-distance-left:9pt;mso-wrap-distance-top:0;mso-wrap-distance-right:9pt;mso-wrap-distance-bottom:0;mso-position-horizontal:absolute;mso-position-horizontal-relative:text;mso-position-vertical:absolute;mso-position-vertical-relative:text;mso-width-percent:0;mso-height-percent:0;mso-width-relative:margin;mso-height-relative:margin;v-text-anchor:middle" o:gfxdata="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" fillcolor="black [3200]" strokecolor="black [480]" strokeweight="1pt">
+                <v:textbox>
+                  <w:txbxContent>
+                    <w:p>
+                      <w:pPr>
+                        <w:spacing w:after="0"/>
+                        <w:rPr>
+                          <w:rFonts w:asciiTheme="majorBidi" w:hAnsiTheme="majorBidi" w:cstheme="majorBidi"/>
+                          <w:b/>
+                          <w:bCs/>
+                          <w:i/>
+                          <w:iCs/>
+                          <w:sz w:val="32"/>
+                          <w:szCs w:val="32"/>
+                        </w:rPr>
+                      </w:pPr>
+                      <w:r>
+                        <w:rPr>
+                          <w:rFonts w:asciiTheme="majorBidi" w:hAnsiTheme="majorBidi" w:cstheme="majorBidi"/>
+                          <w:sz w:val="32"/>
+                          <w:szCs w:val="32"/>
+                        </w:rPr>
+                        <w:t>[</w:t>
+                      </w:r>
+                      <w:r>
+                        <w:rPr>
+                          <w:rFonts w:asciiTheme="majorBidi" w:hAnsiTheme="majorBidi" w:cstheme="majorBidi"/>
+                          <w:b/>
+                          <w:bCs/>
+                          <w:i/>
+                          <w:iCs/>
+                          <w:sz w:val="32"/>
+                          <w:szCs w:val="32"/>
+                        </w:rPr>
+                        <w:t>defaults]</w:t>
+                      </w:r>
+                    </w:p>
+                    <w:p>
+                      <w:pPr>
+                        <w:spacing w:after="0"/>
+                        <w:jc w:val="both"/>
+                        <w:rPr>
+                          <w:rFonts w:asciiTheme="majorBidi" w:hAnsiTheme="majorBidi" w:cstheme="majorBidi"/>
+                          <w:b/>
+                          <w:bCs/>
+                          <w:i/>
+                          <w:iCs/>
+                          <w:sz w:val="32"/>
+                          <w:szCs w:val="32"/>
+                        </w:rPr>
+                      </w:pPr>
+                      <w:proofErr w:type="spellStart"/>
+                      <w:r>
+                        <w:rPr>
+                          <w:rFonts w:asciiTheme="majorBidi" w:hAnsiTheme="majorBidi" w:cstheme="majorBidi"/>
+                          <w:b/>
+                          <w:bCs/>
+                          <w:i/>
+                          <w:iCs/>
+                          <w:sz w:val="32"/>
+                          <w:szCs w:val="32"/>
+                        </w:rPr>
+                        <w:t>private_key_file</w:t>
+                      </w:r>
+                      <w:proofErr w:type="spellEnd"/>
+                      <w:r>
+                        <w:rPr>
+                          <w:rFonts w:asciiTheme="majorBidi" w:hAnsiTheme="majorBidi" w:cstheme="majorBidi"/>
+                          <w:b/>
+                          <w:bCs/>
+                          <w:i/>
+                          <w:iCs/>
+                          <w:sz w:val="32"/>
+                          <w:szCs w:val="32"/>
+                        </w:rPr>
+                        <w:t xml:space="preserve"> = ~/.ssh/</w:t>
+                      </w:r>
+                      <w:proofErr w:type="spellStart"/>
+                      <w:r>
+                        <w:rPr>
+                          <w:rFonts w:asciiTheme="majorBidi" w:hAnsiTheme="majorBidi" w:cstheme="majorBidi"/>
+                          <w:b/>
+                          <w:bCs/>
+                          <w:i/>
+                          <w:iCs/>
+                          <w:sz w:val="32"/>
+                          <w:szCs w:val="32"/>
+                        </w:rPr>
+                        <w:t>ansible_automation</w:t>
+                      </w:r>
+                      <w:proofErr w:type="spellEnd"/>
+                    </w:p>
+                    <w:p>
+                      <w:pPr>
+                        <w:jc w:val="center"/>
+                      </w:pPr>
+                    </w:p>
+                  </w:txbxContent>
+                </v:textbox>
+              </v:rect>
+            </w:pict>
+          </mc:Fallback>
+        </mc:AlternateContent>
+      </w:r>
+      <w:r>
+        <w:rPr>
+          <w:rFonts w:asciiTheme="majorBidi" w:hAnsiTheme="majorBidi" w:cstheme="majorBidi"/>
+          <w:b/>
+          <w:bCs/>
+          <w:sz w:val="32"/>
+          <w:szCs w:val="32"/>
+        </w:rPr>
+        <w:t xml:space="preserve">Reference it explicitly in </w:t>
+      </w:r>
+      <w:proofErr w:type="spellStart"/>
+      <w:r>
+        <w:rPr>
+          <w:rFonts w:asciiTheme="majorBidi" w:hAnsiTheme="majorBidi" w:cstheme="majorBidi"/>
+          <w:b/>
+          <w:bCs/>
+          <w:sz w:val="32"/>
+          <w:szCs w:val="32"/>
+        </w:rPr>
+        <w:t>ansible.cfg</w:t>
+      </w:r>
+      <w:proofErr w:type="spellEnd"/>
+    </w:p>
+    <w:p>
+      <w:pPr>
+        <w:spacing w:after="80"/>
+        <w:jc w:val="both"/>
+        <w:rPr>
+          <w:rFonts w:asciiTheme="majorBidi" w:hAnsiTheme="majorBidi" w:cstheme="majorBidi"/>
+          <w:b/>
+          <w:bCs/>
+          <w:sz w:val="32"/>
+          <w:szCs w:val="32"/>
+        </w:rPr>
+      </w:pPr>
+    </w:p>
+    <w:p>
+      <w:pPr>
+        <w:spacing w:after="80"/>
+        <w:jc w:val="both"/>
+        <w:rPr>
+          <w:rFonts w:asciiTheme="majorBidi" w:hAnsiTheme="majorBidi" w:cstheme="majorBidi"/>
+          <w:b/>
+          <w:bCs/>
+          <w:sz w:val="48"/>
+          <w:szCs w:val="48"/>
+        </w:rPr>
+      </w:pPr>
+    </w:p>
+    <w:p>
+      <w:pPr>
+        <w:spacing w:after="80"/>
+        <w:ind w:left="360"/>
+        <w:rPr>
+          <w:rFonts w:asciiTheme="majorBidi" w:hAnsiTheme="majorBidi" w:cstheme="majorBidi"/>
+          <w:b/>
+          <w:bCs/>
+          <w:sz w:val="28"/>
+          <w:szCs w:val="28"/>
+        </w:rPr>
+      </w:pPr>
+      <w:r>
+        <w:rPr>
+          <w:rFonts w:asciiTheme="majorBidi" w:hAnsiTheme="majorBidi" w:cstheme="majorBidi"/>
+          <w:b/>
+          <w:bCs/>
+          <w:sz w:val="28"/>
+          <w:szCs w:val="28"/>
+        </w:rPr>
+        <w:t>Why Ansible Fails Without a Public Key on the Target</w:t>
+      </w:r>
+      <w:r>
+        <w:rPr>
+          <w:rFonts w:asciiTheme="majorBidi" w:hAnsiTheme="majorBidi" w:cstheme="majorBidi"/>
+          <w:b/>
+          <w:bCs/>
+          <w:sz w:val="28"/>
+          <w:szCs w:val="28"/>
+        </w:rPr>
+        <w:t>?</w:t>
+      </w:r>
+    </w:p>
+    <w:p>
+      <w:pPr>
+        <w:spacing w:after="80"/>
+        <w:ind w:left="360"/>
+        <w:rPr>
+          <w:rFonts w:asciiTheme="majorBidi" w:hAnsiTheme="majorBidi" w:cstheme="majorBidi"/>
+          <w:sz w:val="28"/>
+          <w:szCs w:val="28"/>
+        </w:rPr>
+      </w:pPr>
+      <w:r>
+        <w:rPr>
+          <w:rFonts w:asciiTheme="majorBidi" w:hAnsiTheme="majorBidi" w:cstheme="majorBidi"/>
+          <w:sz w:val="28"/>
+          <w:szCs w:val="28"/>
+        </w:rPr>
+        <w:t xml:space="preserve">SSH authentication is sequential. When Ansible attempts to connect, the target checks its </w:t>
+      </w:r>
+      <w:proofErr w:type="spellStart"/>
+      <w:r>
+        <w:rPr>
+          <w:rFonts w:asciiTheme="majorBidi" w:hAnsiTheme="majorBidi" w:cstheme="majorBidi"/>
+          <w:b/>
+          <w:bCs/>
+          <w:i/>
+          <w:iCs/>
+          <w:sz w:val="28"/>
+          <w:szCs w:val="28"/>
+        </w:rPr>
+        <w:t>authorized_keys</w:t>
+      </w:r>
+      <w:proofErr w:type="spellEnd"/>
+      <w:r>
+        <w:rPr>
+          <w:rFonts w:asciiTheme="majorBidi" w:hAnsiTheme="majorBidi" w:cstheme="majorBidi"/>
+          <w:sz w:val="28"/>
+          <w:szCs w:val="28"/>
+        </w:rPr>
+        <w:t xml:space="preserve"> for a matching public key. If none is found, key authentication fails and SSH falls through to the next permitted method </w:t>
+      </w:r>
+      <w:r>
+        <w:rPr>
+          <w:rFonts w:asciiTheme="majorBidi" w:hAnsiTheme="majorBidi" w:cstheme="majorBidi"/>
+          <w:sz w:val="28"/>
+          <w:szCs w:val="28"/>
+        </w:rPr>
+        <w:t>-</w:t>
+      </w:r>
+      <w:r>
+        <w:rPr>
+          <w:rFonts w:asciiTheme="majorBidi" w:hAnsiTheme="majorBidi" w:cstheme="majorBidi"/>
+          <w:sz w:val="28"/>
+          <w:szCs w:val="28"/>
+        </w:rPr>
+        <w:t xml:space="preserve"> typically password authentication.</w:t>
+      </w:r>
+    </w:p>
+    <w:p>
+      <w:pPr>
+        <w:spacing w:after="80"/>
+        <w:ind w:left="360"/>
+        <w:rPr>
+          <w:rFonts w:asciiTheme="majorBidi" w:hAnsiTheme="majorBidi" w:cstheme="majorBidi"/>
+          <w:sz w:val="28"/>
+          <w:szCs w:val="28"/>
+        </w:rPr>
+      </w:pPr>
+      <w:r>
+        <w:rPr>
+          <w:rFonts w:asciiTheme="majorBidi" w:hAnsiTheme="majorBidi" w:cstheme="majorBidi"/>
+          <w:sz w:val="28"/>
+          <w:szCs w:val="28"/>
+        </w:rPr>
+        <w:t xml:space="preserve">Since Ansible is non-interactive by nature, it has no mechanism to supply a password unless explicitly told to via --ask-pass. This means the connection fails with Permission denied, and Ansible marks the host as UNREACHABLE </w:t>
+      </w:r>
+      <w:r>
+        <w:rPr>
+          <w:rFonts w:asciiTheme="majorBidi" w:hAnsiTheme="majorBidi" w:cstheme="majorBidi"/>
+          <w:sz w:val="28"/>
+          <w:szCs w:val="28"/>
+        </w:rPr>
+        <w:t>-</w:t>
+      </w:r>
+      <w:r>
+        <w:rPr>
+          <w:rFonts w:asciiTheme="majorBidi" w:hAnsiTheme="majorBidi" w:cstheme="majorBidi"/>
+          <w:sz w:val="28"/>
+          <w:szCs w:val="28"/>
+        </w:rPr>
+        <w:t xml:space="preserve"> not FAILED. This distinction matters operationally: unreachable hosts are treated differently in error handling, retry logic, and reporting.</w:t>
+      </w:r>
+    </w:p>
+    <w:p>
+      <w:pPr>
+        <w:spacing w:after="80"/>
+        <w:ind w:left="360"/>
+        <w:rPr>
+          <w:rFonts w:asciiTheme="majorBidi" w:hAnsiTheme="majorBidi" w:cstheme="majorBidi"/>
+          <w:sz w:val="28"/>
+          <w:szCs w:val="28"/>
+        </w:rPr>
+      </w:pPr>
+      <w:r>
+        <w:rPr>
+          <w:rFonts w:asciiTheme="majorBidi" w:hAnsiTheme="majorBidi" w:cstheme="majorBidi"/>
+          <w:sz w:val="28"/>
+          <w:szCs w:val="28"/>
+        </w:rPr>
+        <w:t xml:space="preserve">The exact failure mode depends on the target's </w:t>
+      </w:r>
+      <w:proofErr w:type="spellStart"/>
+      <w:r>
+        <w:rPr>
+          <w:rFonts w:asciiTheme="majorBidi" w:hAnsiTheme="majorBidi" w:cstheme="majorBidi"/>
+          <w:sz w:val="28"/>
+          <w:szCs w:val="28"/>
+        </w:rPr>
+        <w:t>sshd_config</w:t>
+      </w:r>
+      <w:proofErr w:type="spellEnd"/>
+      <w:r>
+        <w:rPr>
+          <w:rFonts w:asciiTheme="majorBidi" w:hAnsiTheme="majorBidi" w:cstheme="majorBidi"/>
+          <w:sz w:val="28"/>
+          <w:szCs w:val="28"/>
+        </w:rPr>
+        <w:t>:</w:t>
+      </w:r>
+    </w:p>
+    <w:p>
+      <w:pPr>
+        <w:pStyle w:val="ListParagraph"/>
+        <w:numPr>
+          <w:ilvl w:val="0"/>
+          <w:numId w:val="75"/>
+        </w:numPr>
+        <w:spacing w:after="80"/>
+        <w:ind w:left="720"/>
+        <w:rPr>
+          <w:rFonts w:asciiTheme="majorBidi" w:hAnsiTheme="majorBidi" w:cstheme="majorBidi"/>
+          <w:sz w:val="28"/>
+          <w:szCs w:val="28"/>
+        </w:rPr>
+      </w:pPr>
+      <w:proofErr w:type="spellStart"/>
+      <w:r>
+        <w:rPr>
+          <w:rFonts w:asciiTheme="majorBidi" w:hAnsiTheme="majorBidi" w:cstheme="majorBidi"/>
+          <w:b/>
+          <w:bCs/>
+          <w:i/>
+          <w:iCs/>
+          <w:sz w:val="28"/>
+          <w:szCs w:val="28"/>
+        </w:rPr>
+        <w:t>PasswordAuthentication</w:t>
+      </w:r>
+      <w:proofErr w:type="spellEnd"/>
+      <w:r>
+        <w:rPr>
+          <w:rFonts w:asciiTheme="majorBidi" w:hAnsiTheme="majorBidi" w:cstheme="majorBidi"/>
+          <w:b/>
+          <w:bCs/>
+          <w:i/>
+          <w:iCs/>
+          <w:sz w:val="28"/>
+          <w:szCs w:val="28"/>
+        </w:rPr>
+        <w:t xml:space="preserve"> yes</w:t>
+      </w:r>
+      <w:r>
+        <w:rPr>
+          <w:rFonts w:asciiTheme="majorBidi" w:hAnsiTheme="majorBidi" w:cstheme="majorBidi"/>
+          <w:sz w:val="28"/>
+          <w:szCs w:val="28"/>
+        </w:rPr>
+        <w:t xml:space="preserve"> → SSH attempts password auth, Ansible has nothing to provide, fails</w:t>
+      </w:r>
+    </w:p>
+    <w:p>
+      <w:pPr>
+        <w:pStyle w:val="ListParagraph"/>
+        <w:numPr>
+          <w:ilvl w:val="0"/>
+          <w:numId w:val="75"/>
+        </w:numPr>
+        <w:spacing w:after="80"/>
+        <w:ind w:left="720"/>
+        <w:rPr>
+          <w:rFonts w:asciiTheme="majorBidi" w:hAnsiTheme="majorBidi" w:cstheme="majorBidi"/>
+          <w:sz w:val="28"/>
+          <w:szCs w:val="28"/>
+        </w:rPr>
+      </w:pPr>
+      <w:proofErr w:type="spellStart"/>
+      <w:r>
+        <w:rPr>
+          <w:rFonts w:asciiTheme="majorBidi" w:hAnsiTheme="majorBidi" w:cstheme="majorBidi"/>
+          <w:b/>
+          <w:bCs/>
+          <w:i/>
+          <w:iCs/>
+          <w:sz w:val="28"/>
+          <w:szCs w:val="28"/>
+        </w:rPr>
+        <w:t>PasswordAuthentication</w:t>
+      </w:r>
+      <w:proofErr w:type="spellEnd"/>
+      <w:r>
+        <w:rPr>
+          <w:rFonts w:asciiTheme="majorBidi" w:hAnsiTheme="majorBidi" w:cstheme="majorBidi"/>
+          <w:b/>
+          <w:bCs/>
+          <w:i/>
+          <w:iCs/>
+          <w:sz w:val="28"/>
+          <w:szCs w:val="28"/>
+        </w:rPr>
+        <w:t xml:space="preserve"> no</w:t>
+      </w:r>
+      <w:r>
+        <w:rPr>
+          <w:rFonts w:asciiTheme="majorBidi" w:hAnsiTheme="majorBidi" w:cstheme="majorBidi"/>
+          <w:sz w:val="28"/>
+          <w:szCs w:val="28"/>
+        </w:rPr>
+        <w:t xml:space="preserve"> → SSH rejects immediately after key failure, no fallback attempted</w:t>
+      </w:r>
+    </w:p>
+    <w:p>
+      <w:pPr>
+        <w:spacing w:after="80"/>
+        <w:ind w:left="360"/>
+        <w:jc w:val="both"/>
+        <w:rPr>
+          <w:rFonts w:asciiTheme="majorBidi" w:hAnsiTheme="majorBidi" w:cstheme="majorBidi"/>
+          <w:sz w:val="28"/>
+          <w:szCs w:val="28"/>
+        </w:rPr>
+      </w:pPr>
+      <w:r>
+        <w:rPr>
+          <w:rFonts w:asciiTheme="majorBidi" w:hAnsiTheme="majorBidi" w:cstheme="majorBidi"/>
+          <w:sz w:val="28"/>
+          <w:szCs w:val="28"/>
+        </w:rPr>
+        <w:t xml:space="preserve">The root fix is always ensuring public key distribution happens as a prerequisite bootstrap step </w:t>
+      </w:r>
+      <w:r>
+        <w:rPr>
+          <w:rFonts w:asciiTheme="majorBidi" w:hAnsiTheme="majorBidi" w:cstheme="majorBidi"/>
+          <w:sz w:val="28"/>
+          <w:szCs w:val="28"/>
+        </w:rPr>
+        <w:t>-</w:t>
+      </w:r>
+      <w:r>
+        <w:rPr>
+          <w:rFonts w:asciiTheme="majorBidi" w:hAnsiTheme="majorBidi" w:cstheme="majorBidi"/>
+          <w:sz w:val="28"/>
+          <w:szCs w:val="28"/>
+        </w:rPr>
+        <w:t xml:space="preserve"> via </w:t>
+      </w:r>
+      <w:r>
+        <w:rPr>
+          <w:rFonts w:asciiTheme="majorBidi" w:hAnsiTheme="majorBidi" w:cstheme="majorBidi"/>
+          <w:b/>
+          <w:bCs/>
+          <w:i/>
+          <w:iCs/>
+          <w:sz w:val="28"/>
+          <w:szCs w:val="28"/>
+        </w:rPr>
+        <w:t>ssh-copy-id</w:t>
+      </w:r>
+      <w:r>
+        <w:rPr>
+          <w:rFonts w:asciiTheme="majorBidi" w:hAnsiTheme="majorBidi" w:cstheme="majorBidi"/>
+          <w:sz w:val="28"/>
+          <w:szCs w:val="28"/>
+        </w:rPr>
+        <w:t xml:space="preserve">, cloud </w:t>
+      </w:r>
+      <w:proofErr w:type="spellStart"/>
+      <w:r>
+        <w:rPr>
+          <w:rFonts w:asciiTheme="majorBidi" w:hAnsiTheme="majorBidi" w:cstheme="majorBidi"/>
+          <w:sz w:val="28"/>
+          <w:szCs w:val="28"/>
+        </w:rPr>
+        <w:t>user_data</w:t>
+      </w:r>
+      <w:proofErr w:type="spellEnd"/>
+      <w:r>
+        <w:rPr>
+          <w:rFonts w:asciiTheme="majorBidi" w:hAnsiTheme="majorBidi" w:cstheme="majorBidi"/>
+          <w:sz w:val="28"/>
+          <w:szCs w:val="28"/>
+        </w:rPr>
+        <w:t>, or image baking — before Ansible is ever invoked against a host. Treating it as an afterthought is a common source of pipeline failures in fresh environment provisioning.</w:t>
       </w:r>
     </w:p>
     <w:p>
@@ -4834,6 +5880,7 @@
     </w:p>
     <w:p>
       <w:pPr>
+        <w:spacing w:after="60"/>
         <w:ind w:left="360"/>
         <w:jc w:val="both"/>
         <w:rPr>
@@ -5070,6 +6117,7 @@
           <w:sz w:val="32"/>
           <w:szCs w:val="32"/>
         </w:rPr>
+        <w:lastRenderedPageBreak/>
         <w:t>CLI Options for Privilege Escalation</w:t>
       </w:r>
       <w:r>
@@ -5171,7 +6219,6 @@
           <w:sz w:val="28"/>
           <w:szCs w:val="28"/>
         </w:rPr>
-        <w:lastRenderedPageBreak/>
         <w:t>--become</w:t>
       </w:r>
     </w:p>
@@ -6302,6 +7349,25 @@
       <w:r>
         <w:rPr>
           <w:rFonts w:asciiTheme="majorBidi" w:hAnsiTheme="majorBidi" w:cstheme="majorBidi"/>
+          <w:sz w:val="28"/>
+          <w:szCs w:val="28"/>
+          <w:u w:val="single"/>
+        </w:rPr>
+        <w:t>Example:</w:t>
+      </w:r>
+    </w:p>
+    <w:p>
+      <w:pPr>
+        <w:jc w:val="both"/>
+        <w:rPr>
+          <w:rFonts w:asciiTheme="majorBidi" w:hAnsiTheme="majorBidi" w:cstheme="majorBidi"/>
+          <w:sz w:val="28"/>
+          <w:szCs w:val="28"/>
+        </w:rPr>
+      </w:pPr>
+      <w:r>
+        <w:rPr>
+          <w:rFonts w:asciiTheme="majorBidi" w:hAnsiTheme="majorBidi" w:cstheme="majorBidi"/>
           <w:noProof/>
           <w:sz w:val="28"/>
           <w:szCs w:val="28"/>
@@ -6310,16 +7376,16 @@
         <mc:AlternateContent>
           <mc:Choice Requires="wps">
             <w:drawing>
-              <wp:anchor distT="0" distB="0" distL="114300" distR="114300" simplePos="0" relativeHeight="251660288" behindDoc="0" locked="0" layoutInCell="1" allowOverlap="1" wp14:anchorId="68BF7473" wp14:editId="6D5E2821">
+              <wp:anchor distT="0" distB="0" distL="114300" distR="114300" simplePos="0" relativeHeight="251660288" behindDoc="0" locked="0" layoutInCell="1" allowOverlap="1" wp14:anchorId="68BF7473" wp14:editId="392BC694">
                 <wp:simplePos x="0" y="0"/>
                 <wp:positionH relativeFrom="margin">
                   <wp:align>left</wp:align>
                 </wp:positionH>
                 <wp:positionV relativeFrom="paragraph">
-                  <wp:posOffset>297180</wp:posOffset>
+                  <wp:posOffset>8890</wp:posOffset>
                 </wp:positionV>
-                <wp:extent cx="1927860" cy="1722120"/>
-                <wp:effectExtent l="0" t="0" r="15240" b="11430"/>
+                <wp:extent cx="1927860" cy="1167914"/>
+                <wp:effectExtent l="0" t="0" r="15240" b="13335"/>
                 <wp:wrapNone/>
                 <wp:docPr id="1885821999" name="Rectangle 2"/>
                 <wp:cNvGraphicFramePr/>
@@ -6330,7 +7396,7 @@
                       <wps:spPr>
                         <a:xfrm>
                           <a:off x="0" y="0"/>
-                          <a:ext cx="1927860" cy="1722120"/>
+                          <a:ext cx="1927860" cy="1167914"/>
                         </a:xfrm>
                         <a:prstGeom prst="rect">
                           <a:avLst/>
@@ -6461,6 +7527,263 @@
                           <w:p>
                             <w:pPr>
                               <w:spacing w:after="0"/>
+                              <w:jc w:val="center"/>
+                              <w:rPr>
+                                <w:b/>
+                                <w:bCs/>
+                                <w:i/>
+                                <w:iCs/>
+                              </w:rPr>
+                            </w:pPr>
+                          </w:p>
+                        </w:txbxContent>
+                      </wps:txbx>
+                      <wps:bodyPr rot="0" spcFirstLastPara="0" vertOverflow="overflow" horzOverflow="overflow" vert="horz" wrap="square" lIns="91440" tIns="45720" rIns="91440" bIns="45720" numCol="1" spcCol="0" rtlCol="0" fromWordArt="0" anchor="ctr" anchorCtr="0" forceAA="0" compatLnSpc="1">
+                        <a:prstTxWarp prst="textNoShape">
+                          <a:avLst/>
+                        </a:prstTxWarp>
+                        <a:noAutofit/>
+                      </wps:bodyPr>
+                    </wps:wsp>
+                  </a:graphicData>
+                </a:graphic>
+                <wp14:sizeRelH relativeFrom="margin">
+                  <wp14:pctWidth>0</wp14:pctWidth>
+                </wp14:sizeRelH>
+                <wp14:sizeRelV relativeFrom="margin">
+                  <wp14:pctHeight>0</wp14:pctHeight>
+                </wp14:sizeRelV>
+              </wp:anchor>
+            </w:drawing>
+          </mc:Choice>
+          <mc:Fallback>
+            <w:pict>
+              <v:rect w14:anchorId="68BF7473" id="Rectangle 2" o:spid="_x0000_s1029" style="position:absolute;left:0;text-align:left;margin-left:0;margin-top:.7pt;width:151.8pt;height:91.95pt;z-index:251660288;visibility:visible;mso-wrap-style:square;mso-width-percent:0;mso-height-percent:0;mso-wrap-distance-left:9pt;mso-wrap-distance-top:0;mso-wrap-distance-right:9pt;mso-wrap-distance-bottom:0;mso-position-horizontal:left;mso-position-horizontal-relative:margin;mso-position-vertical:absolute;mso-position-vertical-relative:text;mso-width-percent:0;mso-height-percent:0;mso-width-relative:margin;mso-height-relative:margin;v-text-anchor:middle" o:gfxdata="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" fillcolor="black [3200]" strokecolor="black [480]" strokeweight="1pt">
+                <v:textbox>
+                  <w:txbxContent>
+                    <w:p>
+                      <w:pPr>
+                        <w:spacing w:after="0"/>
+                        <w:rPr>
+                          <w:rFonts w:asciiTheme="majorBidi" w:hAnsiTheme="majorBidi" w:cstheme="majorBidi"/>
+                          <w:b/>
+                          <w:bCs/>
+                          <w:i/>
+                          <w:iCs/>
+                          <w:sz w:val="28"/>
+                          <w:szCs w:val="28"/>
+                        </w:rPr>
+                      </w:pPr>
+                      <w:r>
+                        <w:rPr>
+                          <w:rFonts w:asciiTheme="majorBidi" w:hAnsiTheme="majorBidi" w:cstheme="majorBidi"/>
+                          <w:b/>
+                          <w:bCs/>
+                          <w:i/>
+                          <w:iCs/>
+                          <w:sz w:val="28"/>
+                          <w:szCs w:val="28"/>
+                        </w:rPr>
+                        <w:t>- hosts: web</w:t>
+                      </w:r>
+                    </w:p>
+                    <w:p>
+                      <w:pPr>
+                        <w:spacing w:after="120"/>
+                        <w:rPr>
+                          <w:rFonts w:asciiTheme="majorBidi" w:hAnsiTheme="majorBidi" w:cstheme="majorBidi"/>
+                          <w:b/>
+                          <w:bCs/>
+                          <w:i/>
+                          <w:iCs/>
+                          <w:sz w:val="28"/>
+                          <w:szCs w:val="28"/>
+                        </w:rPr>
+                      </w:pPr>
+                      <w:r>
+                        <w:rPr>
+                          <w:rFonts w:asciiTheme="majorBidi" w:hAnsiTheme="majorBidi" w:cstheme="majorBidi"/>
+                          <w:b/>
+                          <w:bCs/>
+                          <w:i/>
+                          <w:iCs/>
+                          <w:sz w:val="28"/>
+                          <w:szCs w:val="28"/>
+                        </w:rPr>
+                        <w:t xml:space="preserve">  become: true</w:t>
+                      </w:r>
+                    </w:p>
+                    <w:p>
+                      <w:pPr>
+                        <w:spacing w:after="0"/>
+                        <w:rPr>
+                          <w:rFonts w:asciiTheme="majorBidi" w:hAnsiTheme="majorBidi" w:cstheme="majorBidi"/>
+                          <w:b/>
+                          <w:bCs/>
+                          <w:i/>
+                          <w:iCs/>
+                          <w:sz w:val="28"/>
+                          <w:szCs w:val="28"/>
+                        </w:rPr>
+                      </w:pPr>
+                      <w:r>
+                        <w:rPr>
+                          <w:rFonts w:asciiTheme="majorBidi" w:hAnsiTheme="majorBidi" w:cstheme="majorBidi"/>
+                          <w:b/>
+                          <w:bCs/>
+                          <w:i/>
+                          <w:iCs/>
+                          <w:sz w:val="28"/>
+                          <w:szCs w:val="28"/>
+                        </w:rPr>
+                        <w:t xml:space="preserve">  tasks:</w:t>
+                      </w:r>
+                    </w:p>
+                    <w:p>
+                      <w:pPr>
+                        <w:spacing w:after="0"/>
+                        <w:rPr>
+                          <w:rFonts w:asciiTheme="majorBidi" w:hAnsiTheme="majorBidi" w:cstheme="majorBidi"/>
+                          <w:b/>
+                          <w:bCs/>
+                          <w:i/>
+                          <w:iCs/>
+                          <w:sz w:val="28"/>
+                          <w:szCs w:val="28"/>
+                        </w:rPr>
+                      </w:pPr>
+                      <w:r>
+                        <w:rPr>
+                          <w:rFonts w:asciiTheme="majorBidi" w:hAnsiTheme="majorBidi" w:cstheme="majorBidi"/>
+                          <w:b/>
+                          <w:bCs/>
+                          <w:i/>
+                          <w:iCs/>
+                          <w:sz w:val="28"/>
+                          <w:szCs w:val="28"/>
+                        </w:rPr>
+                        <w:t xml:space="preserve">    - name: install nginx</w:t>
+                      </w:r>
+                    </w:p>
+                    <w:p>
+                      <w:pPr>
+                        <w:spacing w:after="0"/>
+                        <w:jc w:val="center"/>
+                        <w:rPr>
+                          <w:b/>
+                          <w:bCs/>
+                          <w:i/>
+                          <w:iCs/>
+                        </w:rPr>
+                      </w:pPr>
+                    </w:p>
+                  </w:txbxContent>
+                </v:textbox>
+                <w10:wrap anchorx="margin"/>
+              </v:rect>
+            </w:pict>
+          </mc:Fallback>
+        </mc:AlternateContent>
+      </w:r>
+    </w:p>
+    <w:p>
+      <w:pPr>
+        <w:jc w:val="both"/>
+        <w:rPr>
+          <w:rFonts w:asciiTheme="majorBidi" w:hAnsiTheme="majorBidi" w:cstheme="majorBidi"/>
+          <w:sz w:val="28"/>
+          <w:szCs w:val="28"/>
+        </w:rPr>
+      </w:pPr>
+    </w:p>
+    <w:p>
+      <w:pPr>
+        <w:jc w:val="both"/>
+        <w:rPr>
+          <w:rFonts w:asciiTheme="majorBidi" w:hAnsiTheme="majorBidi" w:cstheme="majorBidi"/>
+          <w:sz w:val="28"/>
+          <w:szCs w:val="28"/>
+        </w:rPr>
+      </w:pPr>
+    </w:p>
+    <w:p>
+      <w:pPr>
+        <w:jc w:val="both"/>
+        <w:rPr>
+          <w:rFonts w:asciiTheme="majorBidi" w:hAnsiTheme="majorBidi" w:cstheme="majorBidi"/>
+          <w:sz w:val="28"/>
+          <w:szCs w:val="28"/>
+        </w:rPr>
+      </w:pPr>
+    </w:p>
+    <w:p>
+      <w:pPr>
+        <w:jc w:val="both"/>
+        <w:rPr>
+          <w:rFonts w:asciiTheme="majorBidi" w:hAnsiTheme="majorBidi" w:cstheme="majorBidi"/>
+          <w:sz w:val="28"/>
+          <w:szCs w:val="28"/>
+        </w:rPr>
+      </w:pPr>
+      <w:r>
+        <w:rPr>
+          <w:rFonts w:asciiTheme="majorBidi" w:hAnsiTheme="majorBidi" w:cstheme="majorBidi"/>
+          <w:noProof/>
+          <w:sz w:val="28"/>
+          <w:szCs w:val="28"/>
+          <w:u w:val="single"/>
+        </w:rPr>
+        <w:lastRenderedPageBreak/>
+        <mc:AlternateContent>
+          <mc:Choice Requires="wps">
+            <w:drawing>
+              <wp:anchor distT="0" distB="0" distL="114300" distR="114300" simplePos="0" relativeHeight="251684864" behindDoc="0" locked="0" layoutInCell="1" allowOverlap="1" wp14:anchorId="7CD5FF13" wp14:editId="1767D5FE">
+                <wp:simplePos x="0" y="0"/>
+                <wp:positionH relativeFrom="margin">
+                  <wp:align>left</wp:align>
+                </wp:positionH>
+                <wp:positionV relativeFrom="paragraph">
+                  <wp:posOffset>-4445</wp:posOffset>
+                </wp:positionV>
+                <wp:extent cx="1927860" cy="806765"/>
+                <wp:effectExtent l="0" t="0" r="15240" b="12700"/>
+                <wp:wrapNone/>
+                <wp:docPr id="913740416" name="Rectangle 2"/>
+                <wp:cNvGraphicFramePr/>
+                <a:graphic xmlns:a="http://schemas.openxmlformats.org/drawingml/2006/main">
+                  <a:graphicData uri="http://schemas.microsoft.com/office/word/2010/wordprocessingShape">
+                    <wps:wsp>
+                      <wps:cNvSpPr/>
+                      <wps:spPr>
+                        <a:xfrm>
+                          <a:off x="0" y="0"/>
+                          <a:ext cx="1927860" cy="806765"/>
+                        </a:xfrm>
+                        <a:prstGeom prst="rect">
+                          <a:avLst/>
+                        </a:prstGeom>
+                      </wps:spPr>
+                      <wps:style>
+                        <a:lnRef idx="2">
+                          <a:schemeClr val="dk1">
+                            <a:shade val="15000"/>
+                          </a:schemeClr>
+                        </a:lnRef>
+                        <a:fillRef idx="1">
+                          <a:schemeClr val="dk1"/>
+                        </a:fillRef>
+                        <a:effectRef idx="0">
+                          <a:schemeClr val="dk1"/>
+                        </a:effectRef>
+                        <a:fontRef idx="minor">
+                          <a:schemeClr val="lt1"/>
+                        </a:fontRef>
+                      </wps:style>
+                      <wps:txbx>
+                        <w:txbxContent>
+                          <w:p>
+                            <w:pPr>
+                              <w:spacing w:after="0"/>
                               <w:rPr>
                                 <w:rFonts w:asciiTheme="majorBidi" w:hAnsiTheme="majorBidi" w:cstheme="majorBidi"/>
                                 <w:b/>
@@ -6570,113 +7893,9 @@
           </mc:Choice>
           <mc:Fallback>
             <w:pict>
-              <v:rect w14:anchorId="68BF7473" id="Rectangle 2" o:spid="_x0000_s1028" style="position:absolute;left:0;text-align:left;margin-left:0;margin-top:23.4pt;width:151.8pt;height:135.6pt;z-index:251660288;visibility:visible;mso-wrap-style:square;mso-width-percent:0;mso-height-percent:0;mso-wrap-distance-left:9pt;mso-wrap-distance-top:0;mso-wrap-distance-right:9pt;mso-wrap-distance-bottom:0;mso-position-horizontal:left;mso-position-horizontal-relative:margin;mso-position-vertical:absolute;mso-position-vertical-relative:text;mso-width-percent:0;mso-height-percent:0;mso-width-relative:margin;mso-height-relative:margin;v-text-anchor:middle" o:gfxdata="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" fillcolor="black [3200]" strokecolor="black [480]" strokeweight="1pt">
+              <v:rect w14:anchorId="7CD5FF13" id="_x0000_s1030" style="position:absolute;left:0;text-align:left;margin-left:0;margin-top:-.35pt;width:151.8pt;height:63.5pt;z-index:251684864;visibility:visible;mso-wrap-style:square;mso-width-percent:0;mso-height-percent:0;mso-wrap-distance-left:9pt;mso-wrap-distance-top:0;mso-wrap-distance-right:9pt;mso-wrap-distance-bottom:0;mso-position-horizontal:left;mso-position-horizontal-relative:margin;mso-position-vertical:absolute;mso-position-vertical-relative:text;mso-width-percent:0;mso-height-percent:0;mso-width-relative:margin;mso-height-relative:margin;v-text-anchor:middle" o:gfxdata="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" fillcolor="black [3200]" strokecolor="black [480]" strokeweight="1pt">
                 <v:textbox>
                   <w:txbxContent>
-                    <w:p>
-                      <w:pPr>
-                        <w:spacing w:after="0"/>
-                        <w:rPr>
-                          <w:rFonts w:asciiTheme="majorBidi" w:hAnsiTheme="majorBidi" w:cstheme="majorBidi"/>
-                          <w:b/>
-                          <w:bCs/>
-                          <w:i/>
-                          <w:iCs/>
-                          <w:sz w:val="28"/>
-                          <w:szCs w:val="28"/>
-                        </w:rPr>
-                      </w:pPr>
-                      <w:r>
-                        <w:rPr>
-                          <w:rFonts w:asciiTheme="majorBidi" w:hAnsiTheme="majorBidi" w:cstheme="majorBidi"/>
-                          <w:b/>
-                          <w:bCs/>
-                          <w:i/>
-                          <w:iCs/>
-                          <w:sz w:val="28"/>
-                          <w:szCs w:val="28"/>
-                        </w:rPr>
-                        <w:t>- hosts: web</w:t>
-                      </w:r>
-                    </w:p>
-                    <w:p>
-                      <w:pPr>
-                        <w:spacing w:after="120"/>
-                        <w:rPr>
-                          <w:rFonts w:asciiTheme="majorBidi" w:hAnsiTheme="majorBidi" w:cstheme="majorBidi"/>
-                          <w:b/>
-                          <w:bCs/>
-                          <w:i/>
-                          <w:iCs/>
-                          <w:sz w:val="28"/>
-                          <w:szCs w:val="28"/>
-                        </w:rPr>
-                      </w:pPr>
-                      <w:r>
-                        <w:rPr>
-                          <w:rFonts w:asciiTheme="majorBidi" w:hAnsiTheme="majorBidi" w:cstheme="majorBidi"/>
-                          <w:b/>
-                          <w:bCs/>
-                          <w:i/>
-                          <w:iCs/>
-                          <w:sz w:val="28"/>
-                          <w:szCs w:val="28"/>
-                        </w:rPr>
-                        <w:t xml:space="preserve">  become: true</w:t>
-                      </w:r>
-                    </w:p>
-                    <w:p>
-                      <w:pPr>
-                        <w:spacing w:after="0"/>
-                        <w:rPr>
-                          <w:rFonts w:asciiTheme="majorBidi" w:hAnsiTheme="majorBidi" w:cstheme="majorBidi"/>
-                          <w:b/>
-                          <w:bCs/>
-                          <w:i/>
-                          <w:iCs/>
-                          <w:sz w:val="28"/>
-                          <w:szCs w:val="28"/>
-                        </w:rPr>
-                      </w:pPr>
-                      <w:r>
-                        <w:rPr>
-                          <w:rFonts w:asciiTheme="majorBidi" w:hAnsiTheme="majorBidi" w:cstheme="majorBidi"/>
-                          <w:b/>
-                          <w:bCs/>
-                          <w:i/>
-                          <w:iCs/>
-                          <w:sz w:val="28"/>
-                          <w:szCs w:val="28"/>
-                        </w:rPr>
-                        <w:t xml:space="preserve">  tasks:</w:t>
-                      </w:r>
-                    </w:p>
-                    <w:p>
-                      <w:pPr>
-                        <w:spacing w:after="0"/>
-                        <w:rPr>
-                          <w:rFonts w:asciiTheme="majorBidi" w:hAnsiTheme="majorBidi" w:cstheme="majorBidi"/>
-                          <w:b/>
-                          <w:bCs/>
-                          <w:i/>
-                          <w:iCs/>
-                          <w:sz w:val="28"/>
-                          <w:szCs w:val="28"/>
-                        </w:rPr>
-                      </w:pPr>
-                      <w:r>
-                        <w:rPr>
-                          <w:rFonts w:asciiTheme="majorBidi" w:hAnsiTheme="majorBidi" w:cstheme="majorBidi"/>
-                          <w:b/>
-                          <w:bCs/>
-                          <w:i/>
-                          <w:iCs/>
-                          <w:sz w:val="28"/>
-                          <w:szCs w:val="28"/>
-                        </w:rPr>
-                        <w:t xml:space="preserve">    - name: install nginx</w:t>
-                      </w:r>
-                    </w:p>
                     <w:p>
                       <w:pPr>
                         <w:spacing w:after="0"/>
@@ -6775,63 +7994,14 @@
           </mc:Fallback>
         </mc:AlternateContent>
       </w:r>
-      <w:r>
-        <w:rPr>
-          <w:rFonts w:asciiTheme="majorBidi" w:hAnsiTheme="majorBidi" w:cstheme="majorBidi"/>
-          <w:sz w:val="28"/>
-          <w:szCs w:val="28"/>
-          <w:u w:val="single"/>
-        </w:rPr>
-        <w:t>Example:</w:t>
-      </w:r>
-    </w:p>
-    <w:p>
-      <w:pPr>
-        <w:jc w:val="both"/>
-        <w:rPr>
-          <w:rFonts w:asciiTheme="majorBidi" w:hAnsiTheme="majorBidi" w:cstheme="majorBidi"/>
-          <w:sz w:val="28"/>
-          <w:szCs w:val="28"/>
-        </w:rPr>
-      </w:pPr>
-    </w:p>
-    <w:p>
-      <w:pPr>
-        <w:jc w:val="both"/>
-        <w:rPr>
-          <w:rFonts w:asciiTheme="majorBidi" w:hAnsiTheme="majorBidi" w:cstheme="majorBidi"/>
-          <w:sz w:val="28"/>
-          <w:szCs w:val="28"/>
-        </w:rPr>
-      </w:pPr>
-    </w:p>
-    <w:p>
-      <w:pPr>
-        <w:jc w:val="both"/>
-        <w:rPr>
-          <w:rFonts w:asciiTheme="majorBidi" w:hAnsiTheme="majorBidi" w:cstheme="majorBidi"/>
-          <w:sz w:val="28"/>
-          <w:szCs w:val="28"/>
-        </w:rPr>
-      </w:pPr>
-    </w:p>
-    <w:p>
-      <w:pPr>
-        <w:jc w:val="both"/>
-        <w:rPr>
-          <w:rFonts w:asciiTheme="majorBidi" w:hAnsiTheme="majorBidi" w:cstheme="majorBidi"/>
-          <w:sz w:val="28"/>
-          <w:szCs w:val="28"/>
-        </w:rPr>
-      </w:pPr>
-    </w:p>
-    <w:p>
-      <w:pPr>
-        <w:jc w:val="both"/>
-        <w:rPr>
-          <w:rFonts w:asciiTheme="majorBidi" w:hAnsiTheme="majorBidi" w:cstheme="majorBidi"/>
-          <w:sz w:val="28"/>
-          <w:szCs w:val="28"/>
+    </w:p>
+    <w:p>
+      <w:pPr>
+        <w:jc w:val="both"/>
+        <w:rPr>
+          <w:rFonts w:asciiTheme="majorBidi" w:hAnsiTheme="majorBidi" w:cstheme="majorBidi"/>
+          <w:sz w:val="40"/>
+          <w:szCs w:val="40"/>
         </w:rPr>
       </w:pPr>
     </w:p>
@@ -6884,7 +8054,6 @@
           <w:sz w:val="28"/>
           <w:szCs w:val="28"/>
         </w:rPr>
-        <w:lastRenderedPageBreak/>
         <w:t>Task-Level Escalation</w:t>
       </w:r>
     </w:p>
@@ -7087,7 +8256,7 @@
           </mc:Choice>
           <mc:Fallback>
             <w:pict>
-              <v:rect w14:anchorId="5CBB1E4C" id="Rectangle 3" o:spid="_x0000_s1029" style="position:absolute;left:0;text-align:left;margin-left:0;margin-top:23.15pt;width:202.2pt;height:61.8pt;z-index:251666432;visibility:visible;mso-wrap-style:square;mso-width-percent:0;mso-height-percent:0;mso-wrap-distance-left:9pt;mso-wrap-distance-top:0;mso-wrap-distance-right:9pt;mso-wrap-distance-bottom:0;mso-position-horizontal:left;mso-position-horizontal-relative:margin;mso-position-vertical:absolute;mso-position-vertical-relative:text;mso-width-percent:0;mso-height-percent:0;mso-width-relative:margin;mso-height-relative:margin;v-text-anchor:middle" o:gfxdata="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" fillcolor="black [3200]" strokecolor="black [480]" strokeweight="1pt">
+              <v:rect w14:anchorId="5CBB1E4C" id="Rectangle 3" o:spid="_x0000_s1031" style="position:absolute;left:0;text-align:left;margin-left:0;margin-top:23.15pt;width:202.2pt;height:61.8pt;z-index:251666432;visibility:visible;mso-wrap-style:square;mso-width-percent:0;mso-height-percent:0;mso-wrap-distance-left:9pt;mso-wrap-distance-top:0;mso-wrap-distance-right:9pt;mso-wrap-distance-bottom:0;mso-position-horizontal:left;mso-position-horizontal-relative:margin;mso-position-vertical:absolute;mso-position-vertical-relative:text;mso-width-percent:0;mso-height-percent:0;mso-width-relative:margin;mso-height-relative:margin;v-text-anchor:middle" o:gfxdata="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" fillcolor="black [3200]" strokecolor="black [480]" strokeweight="1pt">
                 <v:textbox>
                   <w:txbxContent>
                     <w:p>
@@ -7528,7 +8697,7 @@
           </mc:Choice>
           <mc:Fallback>
             <w:pict>
-              <v:rect w14:anchorId="71B9CA47" id="_x0000_s1030" style="position:absolute;left:0;text-align:left;margin-left:0;margin-top:.2pt;width:202.2pt;height:95.4pt;z-index:251661312;visibility:visible;mso-wrap-style:square;mso-width-percent:0;mso-height-percent:0;mso-wrap-distance-left:9pt;mso-wrap-distance-top:0;mso-wrap-distance-right:9pt;mso-wrap-distance-bottom:0;mso-position-horizontal:left;mso-position-horizontal-relative:margin;mso-position-vertical:absolute;mso-position-vertical-relative:text;mso-width-percent:0;mso-height-percent:0;mso-width-relative:margin;mso-height-relative:margin;v-text-anchor:middle" o:gfxdata="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" fillcolor="black [3200]" strokecolor="black [480]" strokeweight="1pt">
+              <v:rect w14:anchorId="71B9CA47" id="_x0000_s1032" style="position:absolute;left:0;text-align:left;margin-left:0;margin-top:.2pt;width:202.2pt;height:95.4pt;z-index:251661312;visibility:visible;mso-wrap-style:square;mso-width-percent:0;mso-height-percent:0;mso-wrap-distance-left:9pt;mso-wrap-distance-top:0;mso-wrap-distance-right:9pt;mso-wrap-distance-bottom:0;mso-position-horizontal:left;mso-position-horizontal-relative:margin;mso-position-vertical:absolute;mso-position-vertical-relative:text;mso-width-percent:0;mso-height-percent:0;mso-width-relative:margin;mso-height-relative:margin;v-text-anchor:middle" o:gfxdata="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" fillcolor="black [3200]" strokecolor="black [480]" strokeweight="1pt">
                 <v:textbox>
                   <w:txbxContent>
                     <w:p>
@@ -8036,7 +9205,7 @@
           </mc:Choice>
           <mc:Fallback>
             <w:pict>
-              <v:rect w14:anchorId="7B97FCD6" id="Rectangle 4" o:spid="_x0000_s1031" style="position:absolute;left:0;text-align:left;margin-left:0;margin-top:23.1pt;width:299.4pt;height:43.2pt;z-index:251662336;visibility:visible;mso-wrap-style:square;mso-width-percent:0;mso-height-percent:0;mso-wrap-distance-left:9pt;mso-wrap-distance-top:0;mso-wrap-distance-right:9pt;mso-wrap-distance-bottom:0;mso-position-horizontal:left;mso-position-horizontal-relative:margin;mso-position-vertical:absolute;mso-position-vertical-relative:text;mso-width-percent:0;mso-height-percent:0;mso-width-relative:margin;mso-height-relative:margin;v-text-anchor:middle" o:gfxdata="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" fillcolor="black [3200]" strokecolor="black [480]" strokeweight="1pt">
+              <v:rect w14:anchorId="7B97FCD6" id="Rectangle 4" o:spid="_x0000_s1033" style="position:absolute;left:0;text-align:left;margin-left:0;margin-top:23.1pt;width:299.4pt;height:43.2pt;z-index:251662336;visibility:visible;mso-wrap-style:square;mso-width-percent:0;mso-height-percent:0;mso-wrap-distance-left:9pt;mso-wrap-distance-top:0;mso-wrap-distance-right:9pt;mso-wrap-distance-bottom:0;mso-position-horizontal:left;mso-position-horizontal-relative:margin;mso-position-vertical:absolute;mso-position-vertical-relative:text;mso-width-percent:0;mso-height-percent:0;mso-width-relative:margin;mso-height-relative:margin;v-text-anchor:middle" o:gfxdata="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" fillcolor="black [3200]" strokecolor="black [480]" strokeweight="1pt">
                 <v:textbox>
                   <w:txbxContent>
                     <w:p>
@@ -8384,7 +9553,7 @@
           </mc:Choice>
           <mc:Fallback>
             <w:pict>
-              <v:rect w14:anchorId="6BDB4E40" id="Rectangle 5" o:spid="_x0000_s1032" style="position:absolute;left:0;text-align:left;margin-left:0;margin-top:20.95pt;width:139.8pt;height:43.8pt;z-index:251663360;visibility:visible;mso-wrap-style:square;mso-width-percent:0;mso-height-percent:0;mso-wrap-distance-left:9pt;mso-wrap-distance-top:0;mso-wrap-distance-right:9pt;mso-wrap-distance-bottom:0;mso-position-horizontal:left;mso-position-horizontal-relative:margin;mso-position-vertical:absolute;mso-position-vertical-relative:text;mso-width-percent:0;mso-height-percent:0;mso-width-relative:margin;mso-height-relative:margin;v-text-anchor:middle" o:gfxdata="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" fillcolor="black [3200]" strokecolor="black [480]" strokeweight="1pt">
+              <v:rect w14:anchorId="6BDB4E40" id="Rectangle 5" o:spid="_x0000_s1034" style="position:absolute;left:0;text-align:left;margin-left:0;margin-top:20.95pt;width:139.8pt;height:43.8pt;z-index:251663360;visibility:visible;mso-wrap-style:square;mso-width-percent:0;mso-height-percent:0;mso-wrap-distance-left:9pt;mso-wrap-distance-top:0;mso-wrap-distance-right:9pt;mso-wrap-distance-bottom:0;mso-position-horizontal:left;mso-position-horizontal-relative:margin;mso-position-vertical:absolute;mso-position-vertical-relative:text;mso-width-percent:0;mso-height-percent:0;mso-width-relative:margin;mso-height-relative:margin;v-text-anchor:middle" o:gfxdata="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" fillcolor="black [3200]" strokecolor="black [480]" strokeweight="1pt">
                 <v:textbox>
                   <w:txbxContent>
                     <w:p>
@@ -9020,6 +10189,7 @@
           <w:sz w:val="28"/>
           <w:szCs w:val="28"/>
         </w:rPr>
+        <w:lastRenderedPageBreak/>
         <mc:AlternateContent>
           <mc:Choice Requires="wps">
             <w:drawing>
@@ -9219,7 +10389,7 @@
           </mc:Choice>
           <mc:Fallback>
             <w:pict>
-              <v:rect w14:anchorId="2DA8F71F" id="Rectangle 6" o:spid="_x0000_s1033" style="position:absolute;left:0;text-align:left;margin-left:0;margin-top:.85pt;width:171pt;height:88.8pt;z-index:251664384;visibility:visible;mso-wrap-style:square;mso-width-percent:0;mso-height-percent:0;mso-wrap-distance-left:9pt;mso-wrap-distance-top:0;mso-wrap-distance-right:9pt;mso-wrap-distance-bottom:0;mso-position-horizontal:left;mso-position-horizontal-relative:margin;mso-position-vertical:absolute;mso-position-vertical-relative:text;mso-width-percent:0;mso-height-percent:0;mso-width-relative:margin;mso-height-relative:margin;v-text-anchor:middle" o:gfxdata="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" fillcolor="black [3200]" strokecolor="black [480]" strokeweight="1pt">
+              <v:rect w14:anchorId="2DA8F71F" id="Rectangle 6" o:spid="_x0000_s1035" style="position:absolute;left:0;text-align:left;margin-left:0;margin-top:.85pt;width:171pt;height:88.8pt;z-index:251664384;visibility:visible;mso-wrap-style:square;mso-width-percent:0;mso-height-percent:0;mso-wrap-distance-left:9pt;mso-wrap-distance-top:0;mso-wrap-distance-right:9pt;mso-wrap-distance-bottom:0;mso-position-horizontal:left;mso-position-horizontal-relative:margin;mso-position-vertical:absolute;mso-position-vertical-relative:text;mso-width-percent:0;mso-height-percent:0;mso-width-relative:margin;mso-height-relative:margin;v-text-anchor:middle" o:gfxdata="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" fillcolor="black [3200]" strokecolor="black [480]" strokeweight="1pt">
                 <v:textbox>
                   <w:txbxContent>
                     <w:p>
@@ -9397,7 +10567,6 @@
           <w:sz w:val="28"/>
           <w:szCs w:val="28"/>
         </w:rPr>
-        <w:lastRenderedPageBreak/>
         <mc:AlternateContent>
           <mc:Choice Requires="wps">
             <w:drawing>
@@ -9727,7 +10896,7 @@
           </mc:Choice>
           <mc:Fallback>
             <w:pict>
-              <v:rect w14:anchorId="33154F22" id="_x0000_s1034" style="position:absolute;left:0;text-align:left;margin-left:0;margin-top:.6pt;width:172.8pt;height:190.8pt;z-index:251668480;visibility:visible;mso-wrap-style:square;mso-width-percent:0;mso-height-percent:0;mso-wrap-distance-left:9pt;mso-wrap-distance-top:0;mso-wrap-distance-right:9pt;mso-wrap-distance-bottom:0;mso-position-horizontal:left;mso-position-horizontal-relative:margin;mso-position-vertical:absolute;mso-position-vertical-relative:text;mso-width-percent:0;mso-height-percent:0;mso-width-relative:margin;mso-height-relative:margin;v-text-anchor:middle" o:gfxdata="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" fillcolor="black [3200]" strokecolor="black [480]" strokeweight="1pt">
+              <v:rect w14:anchorId="33154F22" id="_x0000_s1036" style="position:absolute;left:0;text-align:left;margin-left:0;margin-top:.6pt;width:172.8pt;height:190.8pt;z-index:251668480;visibility:visible;mso-wrap-style:square;mso-width-percent:0;mso-height-percent:0;mso-wrap-distance-left:9pt;mso-wrap-distance-top:0;mso-wrap-distance-right:9pt;mso-wrap-distance-bottom:0;mso-position-horizontal:left;mso-position-horizontal-relative:margin;mso-position-vertical:absolute;mso-position-vertical-relative:text;mso-width-percent:0;mso-height-percent:0;mso-width-relative:margin;mso-height-relative:margin;v-text-anchor:middle" o:gfxdata="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" fillcolor="black [3200]" strokecolor="black [480]" strokeweight="1pt">
                 <v:textbox>
                   <w:txbxContent>
                     <w:p>
@@ -10527,160 +11696,6 @@
       <w:r>
         <w:rPr>
           <w:rFonts w:asciiTheme="majorBidi" w:hAnsiTheme="majorBidi" w:cstheme="majorBidi"/>
-          <w:sz w:val="28"/>
-          <w:szCs w:val="28"/>
-        </w:rPr>
-        <w:t>[</w:t>
-      </w:r>
-      <w:proofErr w:type="spellStart"/>
-      <w:r>
-        <w:rPr>
-          <w:rFonts w:asciiTheme="majorBidi" w:hAnsiTheme="majorBidi" w:cstheme="majorBidi"/>
-          <w:sz w:val="28"/>
-          <w:szCs w:val="28"/>
-        </w:rPr>
-        <w:t>sudo</w:t>
-      </w:r>
-      <w:proofErr w:type="spellEnd"/>
-      <w:r>
-        <w:rPr>
-          <w:rFonts w:asciiTheme="majorBidi" w:hAnsiTheme="majorBidi" w:cstheme="majorBidi"/>
-          <w:sz w:val="28"/>
-          <w:szCs w:val="28"/>
-        </w:rPr>
-        <w:t>] password for ubuntu:</w:t>
-      </w:r>
-      <w:r>
-        <w:rPr>
-          <w:rFonts w:asciiTheme="majorBidi" w:hAnsiTheme="majorBidi" w:cstheme="majorBidi"/>
-          <w:sz w:val="28"/>
-          <w:szCs w:val="28"/>
-        </w:rPr>
-        <w:t xml:space="preserve">”, </w:t>
-      </w:r>
-      <w:r>
-        <w:rPr>
-          <w:rFonts w:asciiTheme="majorBidi" w:hAnsiTheme="majorBidi" w:cstheme="majorBidi"/>
-          <w:sz w:val="28"/>
-          <w:szCs w:val="28"/>
-        </w:rPr>
-        <w:t>You type your password, then it proceeds.</w:t>
-      </w:r>
-    </w:p>
-    <w:p>
-      <w:pPr>
-        <w:spacing w:after="100"/>
-        <w:jc w:val="both"/>
-        <w:rPr>
-          <w:rFonts w:asciiTheme="majorBidi" w:hAnsiTheme="majorBidi" w:cstheme="majorBidi"/>
-          <w:sz w:val="28"/>
-          <w:szCs w:val="28"/>
-        </w:rPr>
-      </w:pPr>
-      <w:r>
-        <w:rPr>
-          <w:rFonts w:asciiTheme="majorBidi" w:hAnsiTheme="majorBidi" w:cstheme="majorBidi"/>
-          <w:sz w:val="28"/>
-          <w:szCs w:val="28"/>
-        </w:rPr>
-        <w:t xml:space="preserve">This is fine for humans. But Ansible is a script </w:t>
-      </w:r>
-      <w:r>
-        <w:rPr>
-          <w:rFonts w:asciiTheme="majorBidi" w:hAnsiTheme="majorBidi" w:cstheme="majorBidi"/>
-          <w:sz w:val="28"/>
-          <w:szCs w:val="28"/>
-        </w:rPr>
-        <w:t>-</w:t>
-      </w:r>
-      <w:r>
-        <w:rPr>
-          <w:rFonts w:asciiTheme="majorBidi" w:hAnsiTheme="majorBidi" w:cstheme="majorBidi"/>
-          <w:sz w:val="28"/>
-          <w:szCs w:val="28"/>
-        </w:rPr>
-        <w:t xml:space="preserve"> there is no human sitting there to type a password when it runs at 3am against 500 servers.</w:t>
-      </w:r>
-    </w:p>
-    <w:p>
-      <w:pPr>
-        <w:spacing w:after="60"/>
-        <w:rPr>
-          <w:rFonts w:asciiTheme="majorBidi" w:hAnsiTheme="majorBidi" w:cstheme="majorBidi"/>
-          <w:sz w:val="28"/>
-          <w:szCs w:val="28"/>
-        </w:rPr>
-      </w:pPr>
-      <w:r>
-        <w:rPr>
-          <w:rFonts w:asciiTheme="majorBidi" w:hAnsiTheme="majorBidi" w:cstheme="majorBidi"/>
-          <w:sz w:val="28"/>
-          <w:szCs w:val="28"/>
-        </w:rPr>
-        <w:t xml:space="preserve">What </w:t>
-      </w:r>
-      <w:r>
-        <w:rPr>
-          <w:rFonts w:asciiTheme="majorBidi" w:hAnsiTheme="majorBidi" w:cstheme="majorBidi"/>
-          <w:b/>
-          <w:bCs/>
-          <w:sz w:val="28"/>
-          <w:szCs w:val="28"/>
-        </w:rPr>
-        <w:t>NOPASSWD</w:t>
-      </w:r>
-      <w:r>
-        <w:rPr>
-          <w:rFonts w:asciiTheme="majorBidi" w:hAnsiTheme="majorBidi" w:cstheme="majorBidi"/>
-          <w:sz w:val="28"/>
-          <w:szCs w:val="28"/>
-        </w:rPr>
-        <w:t xml:space="preserve"> does:</w:t>
-      </w:r>
-    </w:p>
-    <w:p>
-      <w:pPr>
-        <w:spacing w:after="60"/>
-        <w:rPr>
-          <w:rFonts w:asciiTheme="majorBidi" w:hAnsiTheme="majorBidi" w:cstheme="majorBidi"/>
-          <w:sz w:val="28"/>
-          <w:szCs w:val="28"/>
-        </w:rPr>
-      </w:pPr>
-      <w:r>
-        <w:rPr>
-          <w:rFonts w:asciiTheme="majorBidi" w:hAnsiTheme="majorBidi" w:cstheme="majorBidi"/>
-          <w:sz w:val="28"/>
-          <w:szCs w:val="28"/>
-        </w:rPr>
-        <w:t xml:space="preserve">This </w:t>
-      </w:r>
-      <w:proofErr w:type="spellStart"/>
-      <w:r>
-        <w:rPr>
-          <w:rFonts w:asciiTheme="majorBidi" w:hAnsiTheme="majorBidi" w:cstheme="majorBidi"/>
-          <w:b/>
-          <w:bCs/>
-          <w:sz w:val="28"/>
-          <w:szCs w:val="28"/>
-        </w:rPr>
-        <w:t>sudoers</w:t>
-      </w:r>
-      <w:proofErr w:type="spellEnd"/>
-      <w:r>
-        <w:rPr>
-          <w:rFonts w:asciiTheme="majorBidi" w:hAnsiTheme="majorBidi" w:cstheme="majorBidi"/>
-          <w:sz w:val="28"/>
-          <w:szCs w:val="28"/>
-        </w:rPr>
-        <w:t xml:space="preserve"> entry:</w:t>
-      </w:r>
-    </w:p>
-    <w:p>
-      <w:pPr>
-        <w:spacing w:after="80"/>
-        <w:rPr>
-          <w:rFonts w:asciiTheme="majorBidi" w:hAnsiTheme="majorBidi" w:cstheme="majorBidi"/>
           <w:b/>
           <w:bCs/>
           <w:i/>
@@ -10688,7 +11703,9 @@
           <w:sz w:val="28"/>
           <w:szCs w:val="28"/>
         </w:rPr>
-      </w:pPr>
+        <w:t>[</w:t>
+      </w:r>
+      <w:proofErr w:type="spellStart"/>
       <w:r>
         <w:rPr>
           <w:rFonts w:asciiTheme="majorBidi" w:hAnsiTheme="majorBidi" w:cstheme="majorBidi"/>
@@ -10699,9 +11716,9 @@
           <w:sz w:val="28"/>
           <w:szCs w:val="28"/>
         </w:rPr>
-        <w:t xml:space="preserve">ubuntu ALL=(ALL) </w:t>
-      </w:r>
-      <w:proofErr w:type="gramStart"/>
+        <w:t>sudo</w:t>
+      </w:r>
+      <w:proofErr w:type="spellEnd"/>
       <w:r>
         <w:rPr>
           <w:rFonts w:asciiTheme="majorBidi" w:hAnsiTheme="majorBidi" w:cstheme="majorBidi"/>
@@ -10712,10 +11729,129 @@
           <w:sz w:val="28"/>
           <w:szCs w:val="28"/>
         </w:rPr>
-        <w:t>NOPASSWD:ALL</w:t>
-      </w:r>
-      <w:proofErr w:type="gramEnd"/>
-      <w:r>
+        <w:t xml:space="preserve">] password for ubuntu:”, </w:t>
+      </w:r>
+      <w:r>
+        <w:rPr>
+          <w:rFonts w:asciiTheme="majorBidi" w:hAnsiTheme="majorBidi" w:cstheme="majorBidi"/>
+          <w:sz w:val="28"/>
+          <w:szCs w:val="28"/>
+        </w:rPr>
+        <w:t>You type your password, then it proceeds.</w:t>
+      </w:r>
+    </w:p>
+    <w:p>
+      <w:pPr>
+        <w:spacing w:after="100"/>
+        <w:jc w:val="both"/>
+        <w:rPr>
+          <w:rFonts w:asciiTheme="majorBidi" w:hAnsiTheme="majorBidi" w:cstheme="majorBidi"/>
+          <w:sz w:val="28"/>
+          <w:szCs w:val="28"/>
+        </w:rPr>
+      </w:pPr>
+      <w:r>
+        <w:rPr>
+          <w:rFonts w:asciiTheme="majorBidi" w:hAnsiTheme="majorBidi" w:cstheme="majorBidi"/>
+          <w:sz w:val="28"/>
+          <w:szCs w:val="28"/>
+        </w:rPr>
+        <w:t xml:space="preserve">This is fine for humans. But Ansible is a script </w:t>
+      </w:r>
+      <w:r>
+        <w:rPr>
+          <w:rFonts w:asciiTheme="majorBidi" w:hAnsiTheme="majorBidi" w:cstheme="majorBidi"/>
+          <w:sz w:val="28"/>
+          <w:szCs w:val="28"/>
+        </w:rPr>
+        <w:t>-</w:t>
+      </w:r>
+      <w:r>
+        <w:rPr>
+          <w:rFonts w:asciiTheme="majorBidi" w:hAnsiTheme="majorBidi" w:cstheme="majorBidi"/>
+          <w:sz w:val="28"/>
+          <w:szCs w:val="28"/>
+        </w:rPr>
+        <w:t xml:space="preserve"> there is no human sitting there to type a password when it runs at 3am against 500 servers.</w:t>
+      </w:r>
+    </w:p>
+    <w:p>
+      <w:pPr>
+        <w:spacing w:after="60"/>
+        <w:rPr>
+          <w:rFonts w:asciiTheme="majorBidi" w:hAnsiTheme="majorBidi" w:cstheme="majorBidi"/>
+          <w:sz w:val="28"/>
+          <w:szCs w:val="28"/>
+        </w:rPr>
+      </w:pPr>
+      <w:r>
+        <w:rPr>
+          <w:rFonts w:asciiTheme="majorBidi" w:hAnsiTheme="majorBidi" w:cstheme="majorBidi"/>
+          <w:sz w:val="28"/>
+          <w:szCs w:val="28"/>
+        </w:rPr>
+        <w:t xml:space="preserve">What </w:t>
+      </w:r>
+      <w:r>
+        <w:rPr>
+          <w:rFonts w:asciiTheme="majorBidi" w:hAnsiTheme="majorBidi" w:cstheme="majorBidi"/>
+          <w:b/>
+          <w:bCs/>
+          <w:sz w:val="28"/>
+          <w:szCs w:val="28"/>
+        </w:rPr>
+        <w:t>NOPASSWD</w:t>
+      </w:r>
+      <w:r>
+        <w:rPr>
+          <w:rFonts w:asciiTheme="majorBidi" w:hAnsiTheme="majorBidi" w:cstheme="majorBidi"/>
+          <w:sz w:val="28"/>
+          <w:szCs w:val="28"/>
+        </w:rPr>
+        <w:t xml:space="preserve"> does:</w:t>
+      </w:r>
+    </w:p>
+    <w:p>
+      <w:pPr>
+        <w:spacing w:after="60"/>
+        <w:rPr>
+          <w:rFonts w:asciiTheme="majorBidi" w:hAnsiTheme="majorBidi" w:cstheme="majorBidi"/>
+          <w:sz w:val="28"/>
+          <w:szCs w:val="28"/>
+        </w:rPr>
+      </w:pPr>
+      <w:r>
+        <w:rPr>
+          <w:rFonts w:asciiTheme="majorBidi" w:hAnsiTheme="majorBidi" w:cstheme="majorBidi"/>
+          <w:sz w:val="28"/>
+          <w:szCs w:val="28"/>
+        </w:rPr>
+        <w:t xml:space="preserve">This </w:t>
+      </w:r>
+      <w:proofErr w:type="spellStart"/>
+      <w:r>
+        <w:rPr>
+          <w:rFonts w:asciiTheme="majorBidi" w:hAnsiTheme="majorBidi" w:cstheme="majorBidi"/>
+          <w:b/>
+          <w:bCs/>
+          <w:sz w:val="28"/>
+          <w:szCs w:val="28"/>
+        </w:rPr>
+        <w:t>sudoers</w:t>
+      </w:r>
+      <w:proofErr w:type="spellEnd"/>
+      <w:r>
+        <w:rPr>
+          <w:rFonts w:asciiTheme="majorBidi" w:hAnsiTheme="majorBidi" w:cstheme="majorBidi"/>
+          <w:sz w:val="28"/>
+          <w:szCs w:val="28"/>
+        </w:rPr>
+        <w:t xml:space="preserve"> entry:</w:t>
+      </w:r>
+    </w:p>
+    <w:p>
+      <w:pPr>
+        <w:spacing w:after="80"/>
         <w:rPr>
           <w:rFonts w:asciiTheme="majorBidi" w:hAnsiTheme="majorBidi" w:cstheme="majorBidi"/>
           <w:b/>
@@ -10725,8 +11861,7 @@
           <w:sz w:val="28"/>
           <w:szCs w:val="28"/>
         </w:rPr>
-        <w:t xml:space="preserve"> </w:t>
-      </w:r>
+      </w:pPr>
       <w:r>
         <w:rPr>
           <w:rFonts w:asciiTheme="majorBidi" w:hAnsiTheme="majorBidi" w:cstheme="majorBidi"/>
@@ -10737,69 +11872,9 @@
           <w:sz w:val="28"/>
           <w:szCs w:val="28"/>
         </w:rPr>
-        <w:t xml:space="preserve">→ </w:t>
-      </w:r>
-      <w:r>
-        <w:rPr>
-          <w:rFonts w:asciiTheme="majorBidi" w:hAnsiTheme="majorBidi" w:cstheme="majorBidi"/>
-          <w:sz w:val="28"/>
-          <w:szCs w:val="28"/>
-        </w:rPr>
-        <w:t xml:space="preserve">Means "the ubuntu user can run any </w:t>
-      </w:r>
-      <w:proofErr w:type="spellStart"/>
-      <w:r>
-        <w:rPr>
-          <w:rFonts w:asciiTheme="majorBidi" w:hAnsiTheme="majorBidi" w:cstheme="majorBidi"/>
-          <w:sz w:val="28"/>
-          <w:szCs w:val="28"/>
-        </w:rPr>
-        <w:t>sudo</w:t>
-      </w:r>
-      <w:proofErr w:type="spellEnd"/>
-      <w:r>
-        <w:rPr>
-          <w:rFonts w:asciiTheme="majorBidi" w:hAnsiTheme="majorBidi" w:cstheme="majorBidi"/>
-          <w:sz w:val="28"/>
-          <w:szCs w:val="28"/>
-        </w:rPr>
-        <w:t xml:space="preserve"> command on this machine without being asked for a password."</w:t>
-      </w:r>
-    </w:p>
-    <w:p>
-      <w:pPr>
-        <w:rPr>
-          <w:rFonts w:asciiTheme="majorBidi" w:hAnsiTheme="majorBidi" w:cstheme="majorBidi"/>
-          <w:sz w:val="28"/>
-          <w:szCs w:val="28"/>
-        </w:rPr>
-      </w:pPr>
+        <w:t xml:space="preserve">ubuntu ALL=(ALL) </w:t>
+      </w:r>
       <w:proofErr w:type="gramStart"/>
-      <w:r>
-        <w:rPr>
-          <w:rFonts w:asciiTheme="majorBidi" w:hAnsiTheme="majorBidi" w:cstheme="majorBidi"/>
-          <w:sz w:val="28"/>
-          <w:szCs w:val="28"/>
-        </w:rPr>
-        <w:t>So</w:t>
-      </w:r>
-      <w:proofErr w:type="gramEnd"/>
-      <w:r>
-        <w:rPr>
-          <w:rFonts w:asciiTheme="majorBidi" w:hAnsiTheme="majorBidi" w:cstheme="majorBidi"/>
-          <w:sz w:val="28"/>
-          <w:szCs w:val="28"/>
-        </w:rPr>
-        <w:t xml:space="preserve"> when Ansible does</w:t>
-      </w:r>
-      <w:r>
-        <w:rPr>
-          <w:rFonts w:asciiTheme="majorBidi" w:hAnsiTheme="majorBidi" w:cstheme="majorBidi"/>
-          <w:sz w:val="28"/>
-          <w:szCs w:val="28"/>
-        </w:rPr>
-        <w:t xml:space="preserve"> </w:t>
-      </w:r>
       <w:r>
         <w:rPr>
           <w:rFonts w:asciiTheme="majorBidi" w:hAnsiTheme="majorBidi" w:cstheme="majorBidi"/>
@@ -10810,6 +11885,104 @@
           <w:sz w:val="28"/>
           <w:szCs w:val="28"/>
         </w:rPr>
+        <w:t>NOPASSWD:ALL</w:t>
+      </w:r>
+      <w:proofErr w:type="gramEnd"/>
+      <w:r>
+        <w:rPr>
+          <w:rFonts w:asciiTheme="majorBidi" w:hAnsiTheme="majorBidi" w:cstheme="majorBidi"/>
+          <w:b/>
+          <w:bCs/>
+          <w:i/>
+          <w:iCs/>
+          <w:sz w:val="28"/>
+          <w:szCs w:val="28"/>
+        </w:rPr>
+        <w:t xml:space="preserve"> </w:t>
+      </w:r>
+      <w:r>
+        <w:rPr>
+          <w:rFonts w:asciiTheme="majorBidi" w:hAnsiTheme="majorBidi" w:cstheme="majorBidi"/>
+          <w:b/>
+          <w:bCs/>
+          <w:i/>
+          <w:iCs/>
+          <w:sz w:val="28"/>
+          <w:szCs w:val="28"/>
+        </w:rPr>
+        <w:t xml:space="preserve">→ </w:t>
+      </w:r>
+      <w:r>
+        <w:rPr>
+          <w:rFonts w:asciiTheme="majorBidi" w:hAnsiTheme="majorBidi" w:cstheme="majorBidi"/>
+          <w:sz w:val="28"/>
+          <w:szCs w:val="28"/>
+        </w:rPr>
+        <w:t xml:space="preserve">Means "the ubuntu user can run any </w:t>
+      </w:r>
+      <w:proofErr w:type="spellStart"/>
+      <w:r>
+        <w:rPr>
+          <w:rFonts w:asciiTheme="majorBidi" w:hAnsiTheme="majorBidi" w:cstheme="majorBidi"/>
+          <w:sz w:val="28"/>
+          <w:szCs w:val="28"/>
+        </w:rPr>
+        <w:t>sudo</w:t>
+      </w:r>
+      <w:proofErr w:type="spellEnd"/>
+      <w:r>
+        <w:rPr>
+          <w:rFonts w:asciiTheme="majorBidi" w:hAnsiTheme="majorBidi" w:cstheme="majorBidi"/>
+          <w:sz w:val="28"/>
+          <w:szCs w:val="28"/>
+        </w:rPr>
+        <w:t xml:space="preserve"> command on this machine without being asked for a password."</w:t>
+      </w:r>
+    </w:p>
+    <w:p>
+      <w:pPr>
+        <w:rPr>
+          <w:rFonts w:asciiTheme="majorBidi" w:hAnsiTheme="majorBidi" w:cstheme="majorBidi"/>
+          <w:sz w:val="28"/>
+          <w:szCs w:val="28"/>
+        </w:rPr>
+      </w:pPr>
+      <w:proofErr w:type="gramStart"/>
+      <w:r>
+        <w:rPr>
+          <w:rFonts w:asciiTheme="majorBidi" w:hAnsiTheme="majorBidi" w:cstheme="majorBidi"/>
+          <w:sz w:val="28"/>
+          <w:szCs w:val="28"/>
+        </w:rPr>
+        <w:t>So</w:t>
+      </w:r>
+      <w:proofErr w:type="gramEnd"/>
+      <w:r>
+        <w:rPr>
+          <w:rFonts w:asciiTheme="majorBidi" w:hAnsiTheme="majorBidi" w:cstheme="majorBidi"/>
+          <w:sz w:val="28"/>
+          <w:szCs w:val="28"/>
+        </w:rPr>
+        <w:t xml:space="preserve"> when Ansible does</w:t>
+      </w:r>
+      <w:r>
+        <w:rPr>
+          <w:rFonts w:asciiTheme="majorBidi" w:hAnsiTheme="majorBidi" w:cstheme="majorBidi"/>
+          <w:sz w:val="28"/>
+          <w:szCs w:val="28"/>
+        </w:rPr>
+        <w:t xml:space="preserve"> </w:t>
+      </w:r>
+      <w:r>
+        <w:rPr>
+          <w:rFonts w:asciiTheme="majorBidi" w:hAnsiTheme="majorBidi" w:cstheme="majorBidi"/>
+          <w:b/>
+          <w:bCs/>
+          <w:i/>
+          <w:iCs/>
+          <w:sz w:val="28"/>
+          <w:szCs w:val="28"/>
+        </w:rPr>
         <w:t>become: true</w:t>
       </w:r>
       <w:r>
@@ -11070,6 +12243,7 @@
           <w:sz w:val="32"/>
           <w:szCs w:val="32"/>
         </w:rPr>
+        <w:lastRenderedPageBreak/>
         <w:t>Edge Case: Privilege Escalation and Python</w:t>
       </w:r>
     </w:p>
@@ -11165,7 +12339,6 @@
           <w:sz w:val="28"/>
           <w:szCs w:val="28"/>
         </w:rPr>
-        <w:lastRenderedPageBreak/>
         <w:t>In minimal systems, sometimes automation requires</w:t>
       </w:r>
       <w:r>
@@ -12274,7 +13447,7 @@
           </mc:Choice>
           <mc:Fallback>
             <w:pict>
-              <v:rect w14:anchorId="6B555C70" id="Rectangle 7" o:spid="_x0000_s1035" style="position:absolute;left:0;text-align:left;margin-left:0;margin-top:3.65pt;width:158.4pt;height:112.2pt;z-index:251669504;visibility:visible;mso-wrap-style:square;mso-width-percent:0;mso-height-percent:0;mso-wrap-distance-left:9pt;mso-wrap-distance-top:0;mso-wrap-distance-right:9pt;mso-wrap-distance-bottom:0;mso-position-horizontal:left;mso-position-horizontal-relative:margin;mso-position-vertical:absolute;mso-position-vertical-relative:text;mso-width-percent:0;mso-height-percent:0;mso-width-relative:margin;mso-height-relative:margin;v-text-anchor:middle" o:gfxdata="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" fillcolor="black [3200]" strokecolor="black [480]" strokeweight="1pt">
+              <v:rect w14:anchorId="6B555C70" id="Rectangle 7" o:spid="_x0000_s1037" style="position:absolute;left:0;text-align:left;margin-left:0;margin-top:3.65pt;width:158.4pt;height:112.2pt;z-index:251669504;visibility:visible;mso-wrap-style:square;mso-width-percent:0;mso-height-percent:0;mso-wrap-distance-left:9pt;mso-wrap-distance-top:0;mso-wrap-distance-right:9pt;mso-wrap-distance-bottom:0;mso-position-horizontal:left;mso-position-horizontal-relative:margin;mso-position-vertical:absolute;mso-position-vertical-relative:text;mso-width-percent:0;mso-height-percent:0;mso-width-relative:margin;mso-height-relative:margin;v-text-anchor:middle" o:gfxdata="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" fillcolor="black [3200]" strokecolor="black [480]" strokeweight="1pt">
                 <v:textbox>
                   <w:txbxContent>
                     <w:p>
@@ -12555,6 +13728,7 @@
           <w:sz w:val="28"/>
           <w:szCs w:val="28"/>
         </w:rPr>
+        <w:lastRenderedPageBreak/>
         <w:t>This runs on each web server.</w:t>
       </w:r>
     </w:p>
@@ -12604,7 +13778,6 @@
           <w:sz w:val="28"/>
           <w:szCs w:val="28"/>
         </w:rPr>
-        <w:lastRenderedPageBreak/>
         <w:t>Sometimes a task logically belongs to a host but must run somewhere else.</w:t>
       </w:r>
     </w:p>
@@ -12978,7 +14151,7 @@
           </mc:Choice>
           <mc:Fallback>
             <w:pict>
-              <v:rect w14:anchorId="2479E6B3" id="Rectangle 8" o:spid="_x0000_s1036" style="position:absolute;left:0;text-align:left;margin-left:0;margin-top:0;width:349.2pt;height:96pt;z-index:251670528;visibility:visible;mso-wrap-style:square;mso-width-percent:0;mso-height-percent:0;mso-wrap-distance-left:9pt;mso-wrap-distance-top:0;mso-wrap-distance-right:9pt;mso-wrap-distance-bottom:0;mso-position-horizontal:left;mso-position-horizontal-relative:margin;mso-position-vertical:absolute;mso-position-vertical-relative:text;mso-width-percent:0;mso-height-percent:0;mso-width-relative:margin;mso-height-relative:margin;v-text-anchor:middle" o:gfxdata="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" fillcolor="black [3200]" strokecolor="black [480]" strokeweight="1pt">
+              <v:rect w14:anchorId="2479E6B3" id="Rectangle 8" o:spid="_x0000_s1038" style="position:absolute;left:0;text-align:left;margin-left:0;margin-top:0;width:349.2pt;height:96pt;z-index:251670528;visibility:visible;mso-wrap-style:square;mso-width-percent:0;mso-height-percent:0;mso-wrap-distance-left:9pt;mso-wrap-distance-top:0;mso-wrap-distance-right:9pt;mso-wrap-distance-bottom:0;mso-position-horizontal:left;mso-position-horizontal-relative:margin;mso-position-vertical:absolute;mso-position-vertical-relative:text;mso-width-percent:0;mso-height-percent:0;mso-width-relative:margin;mso-height-relative:margin;v-text-anchor:middle" o:gfxdata="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" fillcolor="black [3200]" strokecolor="black [480]" strokeweight="1pt">
                 <v:textbox>
                   <w:txbxContent>
                     <w:p>
@@ -13863,7 +15036,7 @@
           </mc:Choice>
           <mc:Fallback>
             <w:pict>
-              <v:rect w14:anchorId="520097CE" id="Rectangle 9" o:spid="_x0000_s1037" style="position:absolute;left:0;text-align:left;margin-left:0;margin-top:23.5pt;width:102pt;height:117pt;z-index:251671552;visibility:visible;mso-wrap-style:square;mso-width-percent:0;mso-height-percent:0;mso-wrap-distance-left:9pt;mso-wrap-distance-top:0;mso-wrap-distance-right:9pt;mso-wrap-distance-bottom:0;mso-position-horizontal:left;mso-position-horizontal-relative:margin;mso-position-vertical:absolute;mso-position-vertical-relative:text;mso-width-percent:0;mso-height-percent:0;mso-width-relative:margin;mso-height-relative:margin;v-text-anchor:middle" o:gfxdata="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" fillcolor="black [3200]" strokecolor="black [480]" strokeweight="1pt">
+              <v:rect w14:anchorId="520097CE" id="Rectangle 9" o:spid="_x0000_s1039" style="position:absolute;left:0;text-align:left;margin-left:0;margin-top:23.5pt;width:102pt;height:117pt;z-index:251671552;visibility:visible;mso-wrap-style:square;mso-width-percent:0;mso-height-percent:0;mso-wrap-distance-left:9pt;mso-wrap-distance-top:0;mso-wrap-distance-right:9pt;mso-wrap-distance-bottom:0;mso-position-horizontal:left;mso-position-horizontal-relative:margin;mso-position-vertical:absolute;mso-position-vertical-relative:text;mso-width-percent:0;mso-height-percent:0;mso-width-relative:margin;mso-height-relative:margin;v-text-anchor:middle" o:gfxdata="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" fillcolor="black [3200]" strokecolor="black [480]" strokeweight="1pt">
                 <v:textbox>
                   <w:txbxContent>
                     <w:p>
@@ -14336,7 +15509,7 @@
           </mc:Choice>
           <mc:Fallback>
             <w:pict>
-              <v:rect w14:anchorId="4CF1FE81" id="Rectangle 10" o:spid="_x0000_s1038" style="position:absolute;left:0;text-align:left;margin-left:0;margin-top:21.8pt;width:173.4pt;height:96.6pt;z-index:251672576;visibility:visible;mso-wrap-style:square;mso-width-percent:0;mso-height-percent:0;mso-wrap-distance-left:9pt;mso-wrap-distance-top:0;mso-wrap-distance-right:9pt;mso-wrap-distance-bottom:0;mso-position-horizontal:left;mso-position-horizontal-relative:margin;mso-position-vertical:absolute;mso-position-vertical-relative:text;mso-width-percent:0;mso-height-percent:0;mso-width-relative:margin;mso-height-relative:margin;v-text-anchor:middle" o:gfxdata="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" fillcolor="black [3200]" strokecolor="black [480]" strokeweight="1pt">
+              <v:rect w14:anchorId="4CF1FE81" id="Rectangle 10" o:spid="_x0000_s1040" style="position:absolute;left:0;text-align:left;margin-left:0;margin-top:21.8pt;width:173.4pt;height:96.6pt;z-index:251672576;visibility:visible;mso-wrap-style:square;mso-width-percent:0;mso-height-percent:0;mso-wrap-distance-left:9pt;mso-wrap-distance-top:0;mso-wrap-distance-right:9pt;mso-wrap-distance-bottom:0;mso-position-horizontal:left;mso-position-horizontal-relative:margin;mso-position-vertical:absolute;mso-position-vertical-relative:text;mso-width-percent:0;mso-height-percent:0;mso-width-relative:margin;mso-height-relative:margin;v-text-anchor:middle" o:gfxdata="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" fillcolor="black [3200]" strokecolor="black [480]" strokeweight="1pt">
                 <v:textbox>
                   <w:txbxContent>
                     <w:p>
@@ -14662,7 +15835,6 @@
           <w:szCs w:val="28"/>
           <w:u w:val="single"/>
         </w:rPr>
-        <w:lastRenderedPageBreak/>
         <mc:AlternateContent>
           <mc:Choice Requires="wps">
             <w:drawing>
@@ -14912,7 +16084,7 @@
           </mc:Choice>
           <mc:Fallback>
             <w:pict>
-              <v:rect w14:anchorId="3A16B89A" id="Rectangle 11" o:spid="_x0000_s1039" style="position:absolute;left:0;text-align:left;margin-left:0;margin-top:-.25pt;width:248.4pt;height:79.2pt;z-index:251673600;visibility:visible;mso-wrap-style:square;mso-width-percent:0;mso-height-percent:0;mso-wrap-distance-left:9pt;mso-wrap-distance-top:0;mso-wrap-distance-right:9pt;mso-wrap-distance-bottom:0;mso-position-horizontal:left;mso-position-horizontal-relative:margin;mso-position-vertical:absolute;mso-position-vertical-relative:text;mso-width-percent:0;mso-height-percent:0;mso-width-relative:margin;mso-height-relative:margin;v-text-anchor:middle" o:gfxdata="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" fillcolor="black [3200]" strokecolor="black [480]" strokeweight="1pt">
+              <v:rect w14:anchorId="3A16B89A" id="Rectangle 11" o:spid="_x0000_s1041" style="position:absolute;left:0;text-align:left;margin-left:0;margin-top:-.25pt;width:248.4pt;height:79.2pt;z-index:251673600;visibility:visible;mso-wrap-style:square;mso-width-percent:0;mso-height-percent:0;mso-wrap-distance-left:9pt;mso-wrap-distance-top:0;mso-wrap-distance-right:9pt;mso-wrap-distance-bottom:0;mso-position-horizontal:left;mso-position-horizontal-relative:margin;mso-position-vertical:absolute;mso-position-vertical-relative:text;mso-width-percent:0;mso-height-percent:0;mso-width-relative:margin;mso-height-relative:margin;v-text-anchor:middle" o:gfxdata="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" fillcolor="black [3200]" strokecolor="black [480]" strokeweight="1pt">
                 <v:textbox>
                   <w:txbxContent>
                     <w:p>
@@ -15992,26 +17164,6 @@
         <w:jc w:val="both"/>
         <w:rPr>
           <w:rFonts w:asciiTheme="majorBidi" w:hAnsiTheme="majorBidi" w:cstheme="majorBidi"/>
-          <w:sz w:val="28"/>
-          <w:szCs w:val="28"/>
-        </w:rPr>
-      </w:pPr>
-    </w:p>
-    <w:p>
-      <w:pPr>
-        <w:jc w:val="both"/>
-        <w:rPr>
-          <w:rFonts w:asciiTheme="majorBidi" w:hAnsiTheme="majorBidi" w:cstheme="majorBidi"/>
-          <w:sz w:val="28"/>
-          <w:szCs w:val="28"/>
-        </w:rPr>
-      </w:pPr>
-    </w:p>
-    <w:p>
-      <w:pPr>
-        <w:jc w:val="both"/>
-        <w:rPr>
-          <w:rFonts w:asciiTheme="majorBidi" w:hAnsiTheme="majorBidi" w:cstheme="majorBidi"/>
           <w:b/>
           <w:bCs/>
           <w:sz w:val="40"/>
@@ -16816,7 +17968,7 @@
           </mc:Choice>
           <mc:Fallback>
             <w:pict>
-              <v:rect w14:anchorId="19C31D2D" id="_x0000_s1040" style="position:absolute;left:0;text-align:left;margin-left:18pt;margin-top:22.4pt;width:110.25pt;height:60pt;z-index:251674624;visibility:visible;mso-wrap-style:square;mso-width-percent:0;mso-height-percent:0;mso-wrap-distance-left:9pt;mso-wrap-distance-top:0;mso-wrap-distance-right:9pt;mso-wrap-distance-bottom:0;mso-position-horizontal:absolute;mso-position-horizontal-relative:text;mso-position-vertical:absolute;mso-position-vertical-relative:text;mso-width-percent:0;mso-height-percent:0;mso-width-relative:margin;mso-height-relative:margin;v-text-anchor:middle" o:gfxdata="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" fillcolor="black [3200]" strokecolor="black [480]" strokeweight="1pt">
+              <v:rect w14:anchorId="19C31D2D" id="_x0000_s1042" style="position:absolute;left:0;text-align:left;margin-left:18pt;margin-top:22.4pt;width:110.25pt;height:60pt;z-index:251674624;visibility:visible;mso-wrap-style:square;mso-width-percent:0;mso-height-percent:0;mso-wrap-distance-left:9pt;mso-wrap-distance-top:0;mso-wrap-distance-right:9pt;mso-wrap-distance-bottom:0;mso-position-horizontal:absolute;mso-position-horizontal-relative:text;mso-position-vertical:absolute;mso-position-vertical-relative:text;mso-width-percent:0;mso-height-percent:0;mso-width-relative:margin;mso-height-relative:margin;v-text-anchor:middle" o:gfxdata="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" fillcolor="black [3200]" strokecolor="black [480]" strokeweight="1pt">
                 <v:textbox>
                   <w:txbxContent>
                     <w:p>
@@ -17277,7 +18429,7 @@
           </mc:Choice>
           <mc:Fallback>
             <w:pict>
-              <v:rect w14:anchorId="613E7E50" id="_x0000_s1041" style="position:absolute;left:0;text-align:left;margin-left:17.25pt;margin-top:24.9pt;width:189.75pt;height:42pt;z-index:251675648;visibility:visible;mso-wrap-style:square;mso-width-percent:0;mso-height-percent:0;mso-wrap-distance-left:9pt;mso-wrap-distance-top:0;mso-wrap-distance-right:9pt;mso-wrap-distance-bottom:0;mso-position-horizontal:absolute;mso-position-horizontal-relative:text;mso-position-vertical:absolute;mso-position-vertical-relative:text;mso-width-percent:0;mso-height-percent:0;mso-width-relative:margin;mso-height-relative:margin;v-text-anchor:middle" o:gfxdata="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" fillcolor="black [3200]" strokecolor="black [480]" strokeweight="1pt">
+              <v:rect w14:anchorId="613E7E50" id="_x0000_s1043" style="position:absolute;left:0;text-align:left;margin-left:17.25pt;margin-top:24.9pt;width:189.75pt;height:42pt;z-index:251675648;visibility:visible;mso-wrap-style:square;mso-width-percent:0;mso-height-percent:0;mso-wrap-distance-left:9pt;mso-wrap-distance-top:0;mso-wrap-distance-right:9pt;mso-wrap-distance-bottom:0;mso-position-horizontal:absolute;mso-position-horizontal-relative:text;mso-position-vertical:absolute;mso-position-vertical-relative:text;mso-width-percent:0;mso-height-percent:0;mso-width-relative:margin;mso-height-relative:margin;v-text-anchor:middle" o:gfxdata="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" fillcolor="black [3200]" strokecolor="black [480]" strokeweight="1pt">
                 <v:textbox>
                   <w:txbxContent>
                     <w:p>
@@ -20831,7 +21983,7 @@
           </mc:Choice>
           <mc:Fallback>
             <w:pict>
-              <v:rect w14:anchorId="43A8EBEE" id="_x0000_s1042" style="position:absolute;left:0;text-align:left;margin-left:0;margin-top:23.15pt;width:415.5pt;height:75.75pt;z-index:251676672;visibility:visible;mso-wrap-style:square;mso-width-percent:0;mso-height-percent:0;mso-wrap-distance-left:9pt;mso-wrap-distance-top:0;mso-wrap-distance-right:9pt;mso-wrap-distance-bottom:0;mso-position-horizontal:left;mso-position-horizontal-relative:margin;mso-position-vertical:absolute;mso-position-vertical-relative:text;mso-width-percent:0;mso-height-percent:0;mso-width-relative:margin;mso-height-relative:margin;v-text-anchor:middle" o:gfxdata="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" fillcolor="black [3200]" strokecolor="black [480]" strokeweight="1pt">
+              <v:rect w14:anchorId="43A8EBEE" id="_x0000_s1044" style="position:absolute;left:0;text-align:left;margin-left:0;margin-top:23.15pt;width:415.5pt;height:75.75pt;z-index:251676672;visibility:visible;mso-wrap-style:square;mso-width-percent:0;mso-height-percent:0;mso-wrap-distance-left:9pt;mso-wrap-distance-top:0;mso-wrap-distance-right:9pt;mso-wrap-distance-bottom:0;mso-position-horizontal:left;mso-position-horizontal-relative:margin;mso-position-vertical:absolute;mso-position-vertical-relative:text;mso-width-percent:0;mso-height-percent:0;mso-width-relative:margin;mso-height-relative:margin;v-text-anchor:middle" o:gfxdata="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" fillcolor="black [3200]" strokecolor="black [480]" strokeweight="1pt">
                 <v:textbox>
                   <w:txbxContent>
                     <w:p>
@@ -21620,7 +22772,7 @@
           </mc:Choice>
           <mc:Fallback>
             <w:pict>
-              <v:rect w14:anchorId="77A183AE" id="_x0000_s1043" style="position:absolute;left:0;text-align:left;margin-left:0;margin-top:23.25pt;width:231pt;height:96.75pt;z-index:251677696;visibility:visible;mso-wrap-style:square;mso-width-percent:0;mso-height-percent:0;mso-wrap-distance-left:9pt;mso-wrap-distance-top:0;mso-wrap-distance-right:9pt;mso-wrap-distance-bottom:0;mso-position-horizontal:left;mso-position-horizontal-relative:margin;mso-position-vertical:absolute;mso-position-vertical-relative:text;mso-width-percent:0;mso-height-percent:0;mso-width-relative:margin;mso-height-relative:margin;v-text-anchor:middle" o:gfxdata="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" fillcolor="black [3200]" strokecolor="black [480]" strokeweight="1pt">
+              <v:rect w14:anchorId="77A183AE" id="_x0000_s1045" style="position:absolute;left:0;text-align:left;margin-left:0;margin-top:23.25pt;width:231pt;height:96.75pt;z-index:251677696;visibility:visible;mso-wrap-style:square;mso-width-percent:0;mso-height-percent:0;mso-wrap-distance-left:9pt;mso-wrap-distance-top:0;mso-wrap-distance-right:9pt;mso-wrap-distance-bottom:0;mso-position-horizontal:left;mso-position-horizontal-relative:margin;mso-position-vertical:absolute;mso-position-vertical-relative:text;mso-width-percent:0;mso-height-percent:0;mso-width-relative:margin;mso-height-relative:margin;v-text-anchor:middle" o:gfxdata="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" fillcolor="black [3200]" strokecolor="black [480]" strokeweight="1pt">
                 <v:textbox>
                   <w:txbxContent>
                     <w:p>
@@ -22365,7 +23517,7 @@
           </mc:Choice>
           <mc:Fallback>
             <w:pict>
-              <v:rect w14:anchorId="7C65944F" id="_x0000_s1044" style="position:absolute;left:0;text-align:left;margin-left:0;margin-top:22.65pt;width:201pt;height:129.75pt;z-index:251678720;visibility:visible;mso-wrap-style:square;mso-width-percent:0;mso-height-percent:0;mso-wrap-distance-left:9pt;mso-wrap-distance-top:0;mso-wrap-distance-right:9pt;mso-wrap-distance-bottom:0;mso-position-horizontal:left;mso-position-horizontal-relative:margin;mso-position-vertical:absolute;mso-position-vertical-relative:text;mso-width-percent:0;mso-height-percent:0;mso-width-relative:margin;mso-height-relative:margin;v-text-anchor:middle" o:gfxdata="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" fillcolor="black [3200]" strokecolor="black [480]" strokeweight="1pt">
+              <v:rect w14:anchorId="7C65944F" id="_x0000_s1046" style="position:absolute;left:0;text-align:left;margin-left:0;margin-top:22.65pt;width:201pt;height:129.75pt;z-index:251678720;visibility:visible;mso-wrap-style:square;mso-width-percent:0;mso-height-percent:0;mso-wrap-distance-left:9pt;mso-wrap-distance-top:0;mso-wrap-distance-right:9pt;mso-wrap-distance-bottom:0;mso-position-horizontal:left;mso-position-horizontal-relative:margin;mso-position-vertical:absolute;mso-position-vertical-relative:text;mso-width-percent:0;mso-height-percent:0;mso-width-relative:margin;mso-height-relative:margin;v-text-anchor:middle" o:gfxdata="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" fillcolor="black [3200]" strokecolor="black [480]" strokeweight="1pt">
                 <v:textbox>
                   <w:txbxContent>
                     <w:p>
@@ -23468,7 +24620,7 @@
           </mc:Choice>
           <mc:Fallback>
             <w:pict>
-              <v:rect w14:anchorId="572CA817" id="_x0000_s1045" style="position:absolute;left:0;text-align:left;margin-left:18.75pt;margin-top:20.25pt;width:3in;height:77.25pt;z-index:251679744;visibility:visible;mso-wrap-style:square;mso-width-percent:0;mso-height-percent:0;mso-wrap-distance-left:9pt;mso-wrap-distance-top:0;mso-wrap-distance-right:9pt;mso-wrap-distance-bottom:0;mso-position-horizontal:absolute;mso-position-horizontal-relative:text;mso-position-vertical:absolute;mso-position-vertical-relative:text;mso-width-percent:0;mso-height-percent:0;mso-width-relative:margin;mso-height-relative:margin;v-text-anchor:middle" o:gfxdata="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" fillcolor="black [3200]" strokecolor="black [480]" strokeweight="1pt">
+              <v:rect w14:anchorId="572CA817" id="_x0000_s1047" style="position:absolute;left:0;text-align:left;margin-left:18.75pt;margin-top:20.25pt;width:3in;height:77.25pt;z-index:251679744;visibility:visible;mso-wrap-style:square;mso-width-percent:0;mso-height-percent:0;mso-wrap-distance-left:9pt;mso-wrap-distance-top:0;mso-wrap-distance-right:9pt;mso-wrap-distance-bottom:0;mso-position-horizontal:absolute;mso-position-horizontal-relative:text;mso-position-vertical:absolute;mso-position-vertical-relative:text;mso-width-percent:0;mso-height-percent:0;mso-width-relative:margin;mso-height-relative:margin;v-text-anchor:middle" o:gfxdata="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" fillcolor="black [3200]" strokecolor="black [480]" strokeweight="1pt">
                 <v:textbox>
                   <w:txbxContent>
                     <w:p>
@@ -23820,7 +24972,7 @@
           </mc:Choice>
           <mc:Fallback>
             <w:pict>
-              <v:rect w14:anchorId="0290C891" id="_x0000_s1046" style="position:absolute;left:0;text-align:left;margin-left:18.75pt;margin-top:23.5pt;width:215.25pt;height:59.25pt;z-index:251680768;visibility:visible;mso-wrap-style:square;mso-width-percent:0;mso-height-percent:0;mso-wrap-distance-left:9pt;mso-wrap-distance-top:0;mso-wrap-distance-right:9pt;mso-wrap-distance-bottom:0;mso-position-horizontal:absolute;mso-position-horizontal-relative:text;mso-position-vertical:absolute;mso-position-vertical-relative:text;mso-width-percent:0;mso-height-percent:0;mso-width-relative:margin;mso-height-relative:margin;v-text-anchor:middle" o:gfxdata="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" fillcolor="black [3200]" strokecolor="black [480]" strokeweight="1pt">
+              <v:rect w14:anchorId="0290C891" id="_x0000_s1048" style="position:absolute;left:0;text-align:left;margin-left:18.75pt;margin-top:23.5pt;width:215.25pt;height:59.25pt;z-index:251680768;visibility:visible;mso-wrap-style:square;mso-width-percent:0;mso-height-percent:0;mso-wrap-distance-left:9pt;mso-wrap-distance-top:0;mso-wrap-distance-right:9pt;mso-wrap-distance-bottom:0;mso-position-horizontal:absolute;mso-position-horizontal-relative:text;mso-position-vertical:absolute;mso-position-vertical-relative:text;mso-width-percent:0;mso-height-percent:0;mso-width-relative:margin;mso-height-relative:margin;v-text-anchor:middle" o:gfxdata="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" fillcolor="black [3200]" strokecolor="black [480]" strokeweight="1pt">
                 <v:textbox>
                   <w:txbxContent>
                     <w:p>
@@ -30332,6 +31484,95 @@
     </w:lvl>
   </w:abstractNum>
   <w:abstractNum w:abstractNumId="38" w15:restartNumberingAfterBreak="0">
+    <w:nsid w:val="4DCC618C"/>
+    <w:multiLevelType w:val="hybridMultilevel"/>
+    <w:tmpl w:val="A568096A"/>
+    <w:lvl w:ilvl="0" w:tplc="0409000F">
+      <w:start w:val="1"/>
+      <w:numFmt w:val="decimal"/>
+      <w:lvlText w:val="%1."/>
+      <w:lvlJc w:val="left"/>
+      <w:pPr>
+        <w:ind w:left="720" w:hanging="360"/>
+      </w:pPr>
+      <w:rPr>
+        <w:rFonts w:hint="default"/>
+      </w:rPr>
+    </w:lvl>
+    <w:lvl w:ilvl="1" w:tplc="04090019" w:tentative="1">
+      <w:start w:val="1"/>
+      <w:numFmt w:val="lowerLetter"/>
+      <w:lvlText w:val="%2."/>
+      <w:lvlJc w:val="left"/>
+      <w:pPr>
+        <w:ind w:left="1440" w:hanging="360"/>
+      </w:pPr>
+    </w:lvl>
+    <w:lvl w:ilvl="2" w:tplc="0409001B" w:tentative="1">
+      <w:start w:val="1"/>
+      <w:numFmt w:val="lowerRoman"/>
+      <w:lvlText w:val="%3."/>
+      <w:lvlJc w:val="right"/>
+      <w:pPr>
+        <w:ind w:left="2160" w:hanging="180"/>
+      </w:pPr>
+    </w:lvl>
+    <w:lvl w:ilvl="3" w:tplc="0409000F" w:tentative="1">
+      <w:start w:val="1"/>
+      <w:numFmt w:val="decimal"/>
+      <w:lvlText w:val="%4."/>
+      <w:lvlJc w:val="left"/>
+      <w:pPr>
+        <w:ind w:left="2880" w:hanging="360"/>
+      </w:pPr>
+    </w:lvl>
+    <w:lvl w:ilvl="4" w:tplc="04090019" w:tentative="1">
+      <w:start w:val="1"/>
+      <w:numFmt w:val="lowerLetter"/>
+      <w:lvlText w:val="%5."/>
+      <w:lvlJc w:val="left"/>
+      <w:pPr>
+        <w:ind w:left="3600" w:hanging="360"/>
+      </w:pPr>
+    </w:lvl>
+    <w:lvl w:ilvl="5" w:tplc="0409001B" w:tentative="1">
+      <w:start w:val="1"/>
+      <w:numFmt w:val="lowerRoman"/>
+      <w:lvlText w:val="%6."/>
+      <w:lvlJc w:val="right"/>
+      <w:pPr>
+        <w:ind w:left="4320" w:hanging="180"/>
+      </w:pPr>
+    </w:lvl>
+    <w:lvl w:ilvl="6" w:tplc="0409000F" w:tentative="1">
+      <w:start w:val="1"/>
+      <w:numFmt w:val="decimal"/>
+      <w:lvlText w:val="%7."/>
+      <w:lvlJc w:val="left"/>
+      <w:pPr>
+        <w:ind w:left="5040" w:hanging="360"/>
+      </w:pPr>
+    </w:lvl>
+    <w:lvl w:ilvl="7" w:tplc="04090019" w:tentative="1">
+      <w:start w:val="1"/>
+      <w:numFmt w:val="lowerLetter"/>
+      <w:lvlText w:val="%8."/>
+      <w:lvlJc w:val="left"/>
+      <w:pPr>
+        <w:ind w:left="5760" w:hanging="360"/>
+      </w:pPr>
+    </w:lvl>
+    <w:lvl w:ilvl="8" w:tplc="0409001B" w:tentative="1">
+      <w:start w:val="1"/>
+      <w:numFmt w:val="lowerRoman"/>
+      <w:lvlText w:val="%9."/>
+      <w:lvlJc w:val="right"/>
+      <w:pPr>
+        <w:ind w:left="6480" w:hanging="180"/>
+      </w:pPr>
+    </w:lvl>
+  </w:abstractNum>
+  <w:abstractNum w:abstractNumId="39" w15:restartNumberingAfterBreak="0">
     <w:nsid w:val="4F9A0E40"/>
     <w:multiLevelType w:val="hybridMultilevel"/>
     <w:tmpl w:val="6C4065CE"/>
@@ -30420,7 +31661,7 @@
       </w:pPr>
     </w:lvl>
   </w:abstractNum>
-  <w:abstractNum w:abstractNumId="39" w15:restartNumberingAfterBreak="0">
+  <w:abstractNum w:abstractNumId="40" w15:restartNumberingAfterBreak="0">
     <w:nsid w:val="52E139E7"/>
     <w:multiLevelType w:val="hybridMultilevel"/>
     <w:tmpl w:val="1C6A66B2"/>
@@ -30533,7 +31774,7 @@
       </w:rPr>
     </w:lvl>
   </w:abstractNum>
-  <w:abstractNum w:abstractNumId="40" w15:restartNumberingAfterBreak="0">
+  <w:abstractNum w:abstractNumId="41" w15:restartNumberingAfterBreak="0">
     <w:nsid w:val="531A42D5"/>
     <w:multiLevelType w:val="hybridMultilevel"/>
     <w:tmpl w:val="3AA63F3C"/>
@@ -30646,7 +31887,7 @@
       </w:rPr>
     </w:lvl>
   </w:abstractNum>
-  <w:abstractNum w:abstractNumId="41" w15:restartNumberingAfterBreak="0">
+  <w:abstractNum w:abstractNumId="42" w15:restartNumberingAfterBreak="0">
     <w:nsid w:val="582F4861"/>
     <w:multiLevelType w:val="hybridMultilevel"/>
     <w:tmpl w:val="2BC483EA"/>
@@ -30759,7 +32000,7 @@
       </w:rPr>
     </w:lvl>
   </w:abstractNum>
-  <w:abstractNum w:abstractNumId="42" w15:restartNumberingAfterBreak="0">
+  <w:abstractNum w:abstractNumId="43" w15:restartNumberingAfterBreak="0">
     <w:nsid w:val="59BE2178"/>
     <w:multiLevelType w:val="hybridMultilevel"/>
     <w:tmpl w:val="80C80762"/>
@@ -30872,7 +32113,7 @@
       </w:rPr>
     </w:lvl>
   </w:abstractNum>
-  <w:abstractNum w:abstractNumId="43" w15:restartNumberingAfterBreak="0">
+  <w:abstractNum w:abstractNumId="44" w15:restartNumberingAfterBreak="0">
     <w:nsid w:val="5A0D7A9A"/>
     <w:multiLevelType w:val="hybridMultilevel"/>
     <w:tmpl w:val="51FCC29E"/>
@@ -30985,7 +32226,7 @@
       </w:rPr>
     </w:lvl>
   </w:abstractNum>
-  <w:abstractNum w:abstractNumId="44" w15:restartNumberingAfterBreak="0">
+  <w:abstractNum w:abstractNumId="45" w15:restartNumberingAfterBreak="0">
     <w:nsid w:val="5B3D6A12"/>
     <w:multiLevelType w:val="hybridMultilevel"/>
     <w:tmpl w:val="F8FA1508"/>
@@ -31098,7 +32339,7 @@
       </w:rPr>
     </w:lvl>
   </w:abstractNum>
-  <w:abstractNum w:abstractNumId="45" w15:restartNumberingAfterBreak="0">
+  <w:abstractNum w:abstractNumId="46" w15:restartNumberingAfterBreak="0">
     <w:nsid w:val="5D455CC8"/>
     <w:multiLevelType w:val="hybridMultilevel"/>
     <w:tmpl w:val="1FEE39E8"/>
@@ -31211,7 +32452,7 @@
       </w:rPr>
     </w:lvl>
   </w:abstractNum>
-  <w:abstractNum w:abstractNumId="46" w15:restartNumberingAfterBreak="0">
+  <w:abstractNum w:abstractNumId="47" w15:restartNumberingAfterBreak="0">
     <w:nsid w:val="5EB216F7"/>
     <w:multiLevelType w:val="hybridMultilevel"/>
     <w:tmpl w:val="68C8468C"/>
@@ -31324,7 +32565,7 @@
       </w:rPr>
     </w:lvl>
   </w:abstractNum>
-  <w:abstractNum w:abstractNumId="47" w15:restartNumberingAfterBreak="0">
+  <w:abstractNum w:abstractNumId="48" w15:restartNumberingAfterBreak="0">
     <w:nsid w:val="5F0D47E6"/>
     <w:multiLevelType w:val="hybridMultilevel"/>
     <w:tmpl w:val="4FF83556"/>
@@ -31437,7 +32678,7 @@
       </w:rPr>
     </w:lvl>
   </w:abstractNum>
-  <w:abstractNum w:abstractNumId="48" w15:restartNumberingAfterBreak="0">
+  <w:abstractNum w:abstractNumId="49" w15:restartNumberingAfterBreak="0">
     <w:nsid w:val="60F72CBD"/>
     <w:multiLevelType w:val="hybridMultilevel"/>
     <w:tmpl w:val="FDB0EE6E"/>
@@ -31550,10 +32791,10 @@
       </w:rPr>
     </w:lvl>
   </w:abstractNum>
-  <w:abstractNum w:abstractNumId="49" w15:restartNumberingAfterBreak="0">
+  <w:abstractNum w:abstractNumId="50" w15:restartNumberingAfterBreak="0">
     <w:nsid w:val="616404AD"/>
     <w:multiLevelType w:val="hybridMultilevel"/>
-    <w:tmpl w:val="C85ACF2A"/>
+    <w:tmpl w:val="27A66576"/>
     <w:lvl w:ilvl="0" w:tplc="0409000F">
       <w:start w:val="1"/>
       <w:numFmt w:val="decimal"/>
@@ -31639,7 +32880,7 @@
       </w:pPr>
     </w:lvl>
   </w:abstractNum>
-  <w:abstractNum w:abstractNumId="50" w15:restartNumberingAfterBreak="0">
+  <w:abstractNum w:abstractNumId="51" w15:restartNumberingAfterBreak="0">
     <w:nsid w:val="66052B1C"/>
     <w:multiLevelType w:val="hybridMultilevel"/>
     <w:tmpl w:val="ACAA9A16"/>
@@ -31752,7 +32993,7 @@
       </w:rPr>
     </w:lvl>
   </w:abstractNum>
-  <w:abstractNum w:abstractNumId="51" w15:restartNumberingAfterBreak="0">
+  <w:abstractNum w:abstractNumId="52" w15:restartNumberingAfterBreak="0">
     <w:nsid w:val="67D10D1E"/>
     <w:multiLevelType w:val="hybridMultilevel"/>
     <w:tmpl w:val="C554AA3A"/>
@@ -31865,7 +33106,7 @@
       </w:rPr>
     </w:lvl>
   </w:abstractNum>
-  <w:abstractNum w:abstractNumId="52" w15:restartNumberingAfterBreak="0">
+  <w:abstractNum w:abstractNumId="53" w15:restartNumberingAfterBreak="0">
     <w:nsid w:val="68234217"/>
     <w:multiLevelType w:val="hybridMultilevel"/>
     <w:tmpl w:val="3A3C77BE"/>
@@ -31978,7 +33219,7 @@
       </w:rPr>
     </w:lvl>
   </w:abstractNum>
-  <w:abstractNum w:abstractNumId="53" w15:restartNumberingAfterBreak="0">
+  <w:abstractNum w:abstractNumId="54" w15:restartNumberingAfterBreak="0">
     <w:nsid w:val="69B33DA1"/>
     <w:multiLevelType w:val="hybridMultilevel"/>
     <w:tmpl w:val="309AEB4C"/>
@@ -32091,7 +33332,7 @@
       </w:rPr>
     </w:lvl>
   </w:abstractNum>
-  <w:abstractNum w:abstractNumId="54" w15:restartNumberingAfterBreak="0">
+  <w:abstractNum w:abstractNumId="55" w15:restartNumberingAfterBreak="0">
     <w:nsid w:val="6B6A018A"/>
     <w:multiLevelType w:val="hybridMultilevel"/>
     <w:tmpl w:val="59EE6A1E"/>
@@ -32204,7 +33445,7 @@
       </w:rPr>
     </w:lvl>
   </w:abstractNum>
-  <w:abstractNum w:abstractNumId="55" w15:restartNumberingAfterBreak="0">
+  <w:abstractNum w:abstractNumId="56" w15:restartNumberingAfterBreak="0">
     <w:nsid w:val="6EC14096"/>
     <w:multiLevelType w:val="hybridMultilevel"/>
     <w:tmpl w:val="F95A9E8C"/>
@@ -32317,7 +33558,7 @@
       </w:rPr>
     </w:lvl>
   </w:abstractNum>
-  <w:abstractNum w:abstractNumId="56" w15:restartNumberingAfterBreak="0">
+  <w:abstractNum w:abstractNumId="57" w15:restartNumberingAfterBreak="0">
     <w:nsid w:val="6FFF6011"/>
     <w:multiLevelType w:val="hybridMultilevel"/>
     <w:tmpl w:val="6F929624"/>
@@ -32430,7 +33671,7 @@
       </w:rPr>
     </w:lvl>
   </w:abstractNum>
-  <w:abstractNum w:abstractNumId="57" w15:restartNumberingAfterBreak="0">
+  <w:abstractNum w:abstractNumId="58" w15:restartNumberingAfterBreak="0">
     <w:nsid w:val="70C57E1A"/>
     <w:multiLevelType w:val="hybridMultilevel"/>
     <w:tmpl w:val="1F2AFAD6"/>
@@ -32543,7 +33784,7 @@
       </w:rPr>
     </w:lvl>
   </w:abstractNum>
-  <w:abstractNum w:abstractNumId="58" w15:restartNumberingAfterBreak="0">
+  <w:abstractNum w:abstractNumId="59" w15:restartNumberingAfterBreak="0">
     <w:nsid w:val="72A859E8"/>
     <w:multiLevelType w:val="hybridMultilevel"/>
     <w:tmpl w:val="D7820D56"/>
@@ -32656,7 +33897,7 @@
       </w:rPr>
     </w:lvl>
   </w:abstractNum>
-  <w:abstractNum w:abstractNumId="59" w15:restartNumberingAfterBreak="0">
+  <w:abstractNum w:abstractNumId="60" w15:restartNumberingAfterBreak="0">
     <w:nsid w:val="72AE4BA8"/>
     <w:multiLevelType w:val="hybridMultilevel"/>
     <w:tmpl w:val="4B321EFA"/>
@@ -32769,7 +34010,7 @@
       </w:rPr>
     </w:lvl>
   </w:abstractNum>
-  <w:abstractNum w:abstractNumId="60" w15:restartNumberingAfterBreak="0">
+  <w:abstractNum w:abstractNumId="61" w15:restartNumberingAfterBreak="0">
     <w:nsid w:val="72D52529"/>
     <w:multiLevelType w:val="hybridMultilevel"/>
     <w:tmpl w:val="87729476"/>
@@ -32882,7 +34123,7 @@
       </w:rPr>
     </w:lvl>
   </w:abstractNum>
-  <w:abstractNum w:abstractNumId="61" w15:restartNumberingAfterBreak="0">
+  <w:abstractNum w:abstractNumId="62" w15:restartNumberingAfterBreak="0">
     <w:nsid w:val="7304338D"/>
     <w:multiLevelType w:val="hybridMultilevel"/>
     <w:tmpl w:val="E95E55B0"/>
@@ -32995,7 +34236,7 @@
       </w:rPr>
     </w:lvl>
   </w:abstractNum>
-  <w:abstractNum w:abstractNumId="62" w15:restartNumberingAfterBreak="0">
+  <w:abstractNum w:abstractNumId="63" w15:restartNumberingAfterBreak="0">
     <w:nsid w:val="74A07DD0"/>
     <w:multiLevelType w:val="hybridMultilevel"/>
     <w:tmpl w:val="E5DE3130"/>
@@ -33108,7 +34349,7 @@
       </w:rPr>
     </w:lvl>
   </w:abstractNum>
-  <w:abstractNum w:abstractNumId="63" w15:restartNumberingAfterBreak="0">
+  <w:abstractNum w:abstractNumId="64" w15:restartNumberingAfterBreak="0">
     <w:nsid w:val="760C0504"/>
     <w:multiLevelType w:val="hybridMultilevel"/>
     <w:tmpl w:val="89E47ADC"/>
@@ -33221,7 +34462,7 @@
       </w:rPr>
     </w:lvl>
   </w:abstractNum>
-  <w:abstractNum w:abstractNumId="64" w15:restartNumberingAfterBreak="0">
+  <w:abstractNum w:abstractNumId="65" w15:restartNumberingAfterBreak="0">
     <w:nsid w:val="78AA651A"/>
     <w:multiLevelType w:val="hybridMultilevel"/>
     <w:tmpl w:val="A5E26828"/>
@@ -33334,7 +34575,120 @@
       </w:rPr>
     </w:lvl>
   </w:abstractNum>
-  <w:abstractNum w:abstractNumId="65" w15:restartNumberingAfterBreak="0">
+  <w:abstractNum w:abstractNumId="66" w15:restartNumberingAfterBreak="0">
+    <w:nsid w:val="795C1299"/>
+    <w:multiLevelType w:val="hybridMultilevel"/>
+    <w:tmpl w:val="A8D8E346"/>
+    <w:lvl w:ilvl="0" w:tplc="0409000D">
+      <w:start w:val="1"/>
+      <w:numFmt w:val="bullet"/>
+      <w:lvlText w:val=""/>
+      <w:lvlJc w:val="left"/>
+      <w:pPr>
+        <w:ind w:left="1080" w:hanging="360"/>
+      </w:pPr>
+      <w:rPr>
+        <w:rFonts w:ascii="Wingdings" w:hAnsi="Wingdings" w:hint="default"/>
+      </w:rPr>
+    </w:lvl>
+    <w:lvl w:ilvl="1" w:tplc="04090003" w:tentative="1">
+      <w:start w:val="1"/>
+      <w:numFmt w:val="bullet"/>
+      <w:lvlText w:val="o"/>
+      <w:lvlJc w:val="left"/>
+      <w:pPr>
+        <w:ind w:left="1800" w:hanging="360"/>
+      </w:pPr>
+      <w:rPr>
+        <w:rFonts w:ascii="Courier New" w:hAnsi="Courier New" w:cs="Courier New" w:hint="default"/>
+      </w:rPr>
+    </w:lvl>
+    <w:lvl w:ilvl="2" w:tplc="04090005" w:tentative="1">
+      <w:start w:val="1"/>
+      <w:numFmt w:val="bullet"/>
+      <w:lvlText w:val=""/>
+      <w:lvlJc w:val="left"/>
+      <w:pPr>
+        <w:ind w:left="2520" w:hanging="360"/>
+      </w:pPr>
+      <w:rPr>
+        <w:rFonts w:ascii="Wingdings" w:hAnsi="Wingdings" w:hint="default"/>
+      </w:rPr>
+    </w:lvl>
+    <w:lvl w:ilvl="3" w:tplc="04090001" w:tentative="1">
+      <w:start w:val="1"/>
+      <w:numFmt w:val="bullet"/>
+      <w:lvlText w:val=""/>
+      <w:lvlJc w:val="left"/>
+      <w:pPr>
+        <w:ind w:left="3240" w:hanging="360"/>
+      </w:pPr>
+      <w:rPr>
+        <w:rFonts w:ascii="Symbol" w:hAnsi="Symbol" w:hint="default"/>
+      </w:rPr>
+    </w:lvl>
+    <w:lvl w:ilvl="4" w:tplc="04090003" w:tentative="1">
+      <w:start w:val="1"/>
+      <w:numFmt w:val="bullet"/>
+      <w:lvlText w:val="o"/>
+      <w:lvlJc w:val="left"/>
+      <w:pPr>
+        <w:ind w:left="3960" w:hanging="360"/>
+      </w:pPr>
+      <w:rPr>
+        <w:rFonts w:ascii="Courier New" w:hAnsi="Courier New" w:cs="Courier New" w:hint="default"/>
+      </w:rPr>
+    </w:lvl>
+    <w:lvl w:ilvl="5" w:tplc="04090005" w:tentative="1">
+      <w:start w:val="1"/>
+      <w:numFmt w:val="bullet"/>
+      <w:lvlText w:val=""/>
+      <w:lvlJc w:val="left"/>
+      <w:pPr>
+        <w:ind w:left="4680" w:hanging="360"/>
+      </w:pPr>
+      <w:rPr>
+        <w:rFonts w:ascii="Wingdings" w:hAnsi="Wingdings" w:hint="default"/>
+      </w:rPr>
+    </w:lvl>
+    <w:lvl w:ilvl="6" w:tplc="04090001" w:tentative="1">
+      <w:start w:val="1"/>
+      <w:numFmt w:val="bullet"/>
+      <w:lvlText w:val=""/>
+      <w:lvlJc w:val="left"/>
+      <w:pPr>
+        <w:ind w:left="5400" w:hanging="360"/>
+      </w:pPr>
+      <w:rPr>
+        <w:rFonts w:ascii="Symbol" w:hAnsi="Symbol" w:hint="default"/>
+      </w:rPr>
+    </w:lvl>
+    <w:lvl w:ilvl="7" w:tplc="04090003" w:tentative="1">
+      <w:start w:val="1"/>
+      <w:numFmt w:val="bullet"/>
+      <w:lvlText w:val="o"/>
+      <w:lvlJc w:val="left"/>
+      <w:pPr>
+        <w:ind w:left="6120" w:hanging="360"/>
+      </w:pPr>
+      <w:rPr>
+        <w:rFonts w:ascii="Courier New" w:hAnsi="Courier New" w:cs="Courier New" w:hint="default"/>
+      </w:rPr>
+    </w:lvl>
+    <w:lvl w:ilvl="8" w:tplc="04090005" w:tentative="1">
+      <w:start w:val="1"/>
+      <w:numFmt w:val="bullet"/>
+      <w:lvlText w:val=""/>
+      <w:lvlJc w:val="left"/>
+      <w:pPr>
+        <w:ind w:left="6840" w:hanging="360"/>
+      </w:pPr>
+      <w:rPr>
+        <w:rFonts w:ascii="Wingdings" w:hAnsi="Wingdings" w:hint="default"/>
+      </w:rPr>
+    </w:lvl>
+  </w:abstractNum>
+  <w:abstractNum w:abstractNumId="67" w15:restartNumberingAfterBreak="0">
     <w:nsid w:val="79EF228F"/>
     <w:multiLevelType w:val="hybridMultilevel"/>
     <w:tmpl w:val="5CB2B418"/>
@@ -33447,7 +34801,120 @@
       </w:rPr>
     </w:lvl>
   </w:abstractNum>
-  <w:abstractNum w:abstractNumId="66" w15:restartNumberingAfterBreak="0">
+  <w:abstractNum w:abstractNumId="68" w15:restartNumberingAfterBreak="0">
+    <w:nsid w:val="7A40364C"/>
+    <w:multiLevelType w:val="hybridMultilevel"/>
+    <w:tmpl w:val="165C486A"/>
+    <w:lvl w:ilvl="0" w:tplc="04090001">
+      <w:start w:val="1"/>
+      <w:numFmt w:val="bullet"/>
+      <w:lvlText w:val=""/>
+      <w:lvlJc w:val="left"/>
+      <w:pPr>
+        <w:ind w:left="1080" w:hanging="360"/>
+      </w:pPr>
+      <w:rPr>
+        <w:rFonts w:ascii="Symbol" w:hAnsi="Symbol" w:hint="default"/>
+      </w:rPr>
+    </w:lvl>
+    <w:lvl w:ilvl="1" w:tplc="FFFFFFFF" w:tentative="1">
+      <w:start w:val="1"/>
+      <w:numFmt w:val="bullet"/>
+      <w:lvlText w:val="o"/>
+      <w:lvlJc w:val="left"/>
+      <w:pPr>
+        <w:ind w:left="1800" w:hanging="360"/>
+      </w:pPr>
+      <w:rPr>
+        <w:rFonts w:ascii="Courier New" w:hAnsi="Courier New" w:cs="Courier New" w:hint="default"/>
+      </w:rPr>
+    </w:lvl>
+    <w:lvl w:ilvl="2" w:tplc="FFFFFFFF" w:tentative="1">
+      <w:start w:val="1"/>
+      <w:numFmt w:val="bullet"/>
+      <w:lvlText w:val=""/>
+      <w:lvlJc w:val="left"/>
+      <w:pPr>
+        <w:ind w:left="2520" w:hanging="360"/>
+      </w:pPr>
+      <w:rPr>
+        <w:rFonts w:ascii="Wingdings" w:hAnsi="Wingdings" w:hint="default"/>
+      </w:rPr>
+    </w:lvl>
+    <w:lvl w:ilvl="3" w:tplc="FFFFFFFF" w:tentative="1">
+      <w:start w:val="1"/>
+      <w:numFmt w:val="bullet"/>
+      <w:lvlText w:val=""/>
+      <w:lvlJc w:val="left"/>
+      <w:pPr>
+        <w:ind w:left="3240" w:hanging="360"/>
+      </w:pPr>
+      <w:rPr>
+        <w:rFonts w:ascii="Symbol" w:hAnsi="Symbol" w:hint="default"/>
+      </w:rPr>
+    </w:lvl>
+    <w:lvl w:ilvl="4" w:tplc="FFFFFFFF" w:tentative="1">
+      <w:start w:val="1"/>
+      <w:numFmt w:val="bullet"/>
+      <w:lvlText w:val="o"/>
+      <w:lvlJc w:val="left"/>
+      <w:pPr>
+        <w:ind w:left="3960" w:hanging="360"/>
+      </w:pPr>
+      <w:rPr>
+        <w:rFonts w:ascii="Courier New" w:hAnsi="Courier New" w:cs="Courier New" w:hint="default"/>
+      </w:rPr>
+    </w:lvl>
+    <w:lvl w:ilvl="5" w:tplc="FFFFFFFF" w:tentative="1">
+      <w:start w:val="1"/>
+      <w:numFmt w:val="bullet"/>
+      <w:lvlText w:val=""/>
+      <w:lvlJc w:val="left"/>
+      <w:pPr>
+        <w:ind w:left="4680" w:hanging="360"/>
+      </w:pPr>
+      <w:rPr>
+        <w:rFonts w:ascii="Wingdings" w:hAnsi="Wingdings" w:hint="default"/>
+      </w:rPr>
+    </w:lvl>
+    <w:lvl w:ilvl="6" w:tplc="FFFFFFFF" w:tentative="1">
+      <w:start w:val="1"/>
+      <w:numFmt w:val="bullet"/>
+      <w:lvlText w:val=""/>
+      <w:lvlJc w:val="left"/>
+      <w:pPr>
+        <w:ind w:left="5400" w:hanging="360"/>
+      </w:pPr>
+      <w:rPr>
+        <w:rFonts w:ascii="Symbol" w:hAnsi="Symbol" w:hint="default"/>
+      </w:rPr>
+    </w:lvl>
+    <w:lvl w:ilvl="7" w:tplc="FFFFFFFF" w:tentative="1">
+      <w:start w:val="1"/>
+      <w:numFmt w:val="bullet"/>
+      <w:lvlText w:val="o"/>
+      <w:lvlJc w:val="left"/>
+      <w:pPr>
+        <w:ind w:left="6120" w:hanging="360"/>
+      </w:pPr>
+      <w:rPr>
+        <w:rFonts w:ascii="Courier New" w:hAnsi="Courier New" w:cs="Courier New" w:hint="default"/>
+      </w:rPr>
+    </w:lvl>
+    <w:lvl w:ilvl="8" w:tplc="FFFFFFFF" w:tentative="1">
+      <w:start w:val="1"/>
+      <w:numFmt w:val="bullet"/>
+      <w:lvlText w:val=""/>
+      <w:lvlJc w:val="left"/>
+      <w:pPr>
+        <w:ind w:left="6840" w:hanging="360"/>
+      </w:pPr>
+      <w:rPr>
+        <w:rFonts w:ascii="Wingdings" w:hAnsi="Wingdings" w:hint="default"/>
+      </w:rPr>
+    </w:lvl>
+  </w:abstractNum>
+  <w:abstractNum w:abstractNumId="69" w15:restartNumberingAfterBreak="0">
     <w:nsid w:val="7B8747A7"/>
     <w:multiLevelType w:val="hybridMultilevel"/>
     <w:tmpl w:val="34CCCEA8"/>
@@ -33560,7 +35027,7 @@
       </w:rPr>
     </w:lvl>
   </w:abstractNum>
-  <w:abstractNum w:abstractNumId="67" w15:restartNumberingAfterBreak="0">
+  <w:abstractNum w:abstractNumId="70" w15:restartNumberingAfterBreak="0">
     <w:nsid w:val="7C6A320D"/>
     <w:multiLevelType w:val="hybridMultilevel"/>
     <w:tmpl w:val="C12E93C8"/>
@@ -33673,7 +35140,7 @@
       </w:rPr>
     </w:lvl>
   </w:abstractNum>
-  <w:abstractNum w:abstractNumId="68" w15:restartNumberingAfterBreak="0">
+  <w:abstractNum w:abstractNumId="71" w15:restartNumberingAfterBreak="0">
     <w:nsid w:val="7CA75990"/>
     <w:multiLevelType w:val="hybridMultilevel"/>
     <w:tmpl w:val="4B78C07E"/>
@@ -33786,7 +35253,7 @@
       </w:rPr>
     </w:lvl>
   </w:abstractNum>
-  <w:abstractNum w:abstractNumId="69" w15:restartNumberingAfterBreak="0">
+  <w:abstractNum w:abstractNumId="72" w15:restartNumberingAfterBreak="0">
     <w:nsid w:val="7CB204A1"/>
     <w:multiLevelType w:val="hybridMultilevel"/>
     <w:tmpl w:val="95F661C4"/>
@@ -33899,7 +35366,7 @@
       </w:rPr>
     </w:lvl>
   </w:abstractNum>
-  <w:abstractNum w:abstractNumId="70" w15:restartNumberingAfterBreak="0">
+  <w:abstractNum w:abstractNumId="73" w15:restartNumberingAfterBreak="0">
     <w:nsid w:val="7E4E4B2D"/>
     <w:multiLevelType w:val="hybridMultilevel"/>
     <w:tmpl w:val="66DEE0C4"/>
@@ -34012,7 +35479,7 @@
       </w:rPr>
     </w:lvl>
   </w:abstractNum>
-  <w:abstractNum w:abstractNumId="71" w15:restartNumberingAfterBreak="0">
+  <w:abstractNum w:abstractNumId="74" w15:restartNumberingAfterBreak="0">
     <w:nsid w:val="7E6F2F1E"/>
     <w:multiLevelType w:val="hybridMultilevel"/>
     <w:tmpl w:val="48F09C90"/>
@@ -34138,7 +35605,7 @@
     <w:abstractNumId w:val="36"/>
   </w:num>
   <w:num w:numId="5" w16cid:durableId="2145341825">
-    <w:abstractNumId w:val="70"/>
+    <w:abstractNumId w:val="73"/>
   </w:num>
   <w:num w:numId="6" w16cid:durableId="1019350556">
     <w:abstractNumId w:val="3"/>
@@ -34147,19 +35614,19 @@
     <w:abstractNumId w:val="37"/>
   </w:num>
   <w:num w:numId="8" w16cid:durableId="224921923">
-    <w:abstractNumId w:val="60"/>
+    <w:abstractNumId w:val="61"/>
   </w:num>
   <w:num w:numId="9" w16cid:durableId="850727383">
     <w:abstractNumId w:val="2"/>
   </w:num>
   <w:num w:numId="10" w16cid:durableId="1640575075">
-    <w:abstractNumId w:val="65"/>
+    <w:abstractNumId w:val="67"/>
   </w:num>
   <w:num w:numId="11" w16cid:durableId="919215980">
     <w:abstractNumId w:val="10"/>
   </w:num>
   <w:num w:numId="12" w16cid:durableId="1934820377">
-    <w:abstractNumId w:val="53"/>
+    <w:abstractNumId w:val="54"/>
   </w:num>
   <w:num w:numId="13" w16cid:durableId="1781608435">
     <w:abstractNumId w:val="16"/>
@@ -34171,10 +35638,10 @@
     <w:abstractNumId w:val="34"/>
   </w:num>
   <w:num w:numId="16" w16cid:durableId="445348997">
-    <w:abstractNumId w:val="40"/>
+    <w:abstractNumId w:val="41"/>
   </w:num>
   <w:num w:numId="17" w16cid:durableId="1944456301">
-    <w:abstractNumId w:val="39"/>
+    <w:abstractNumId w:val="40"/>
   </w:num>
   <w:num w:numId="18" w16cid:durableId="729616162">
     <w:abstractNumId w:val="30"/>
@@ -34192,10 +35659,10 @@
     <w:abstractNumId w:val="24"/>
   </w:num>
   <w:num w:numId="23" w16cid:durableId="1353651711">
-    <w:abstractNumId w:val="66"/>
+    <w:abstractNumId w:val="69"/>
   </w:num>
   <w:num w:numId="24" w16cid:durableId="1664041347">
-    <w:abstractNumId w:val="59"/>
+    <w:abstractNumId w:val="60"/>
   </w:num>
   <w:num w:numId="25" w16cid:durableId="476990610">
     <w:abstractNumId w:val="26"/>
@@ -34207,19 +35674,19 @@
     <w:abstractNumId w:val="8"/>
   </w:num>
   <w:num w:numId="28" w16cid:durableId="1027566498">
-    <w:abstractNumId w:val="64"/>
+    <w:abstractNumId w:val="65"/>
   </w:num>
   <w:num w:numId="29" w16cid:durableId="979840888">
     <w:abstractNumId w:val="28"/>
   </w:num>
   <w:num w:numId="30" w16cid:durableId="1025323814">
+    <w:abstractNumId w:val="63"/>
+  </w:num>
+  <w:num w:numId="31" w16cid:durableId="572160834">
     <w:abstractNumId w:val="62"/>
   </w:num>
-  <w:num w:numId="31" w16cid:durableId="572160834">
-    <w:abstractNumId w:val="61"/>
-  </w:num>
   <w:num w:numId="32" w16cid:durableId="635599666">
-    <w:abstractNumId w:val="63"/>
+    <w:abstractNumId w:val="64"/>
   </w:num>
   <w:num w:numId="33" w16cid:durableId="1716536781">
     <w:abstractNumId w:val="6"/>
@@ -34228,43 +35695,43 @@
     <w:abstractNumId w:val="4"/>
   </w:num>
   <w:num w:numId="35" w16cid:durableId="584535214">
-    <w:abstractNumId w:val="54"/>
+    <w:abstractNumId w:val="55"/>
   </w:num>
   <w:num w:numId="36" w16cid:durableId="2040280222">
+    <w:abstractNumId w:val="48"/>
+  </w:num>
+  <w:num w:numId="37" w16cid:durableId="322205196">
+    <w:abstractNumId w:val="57"/>
+  </w:num>
+  <w:num w:numId="38" w16cid:durableId="945579640">
     <w:abstractNumId w:val="47"/>
   </w:num>
-  <w:num w:numId="37" w16cid:durableId="322205196">
-    <w:abstractNumId w:val="56"/>
-  </w:num>
-  <w:num w:numId="38" w16cid:durableId="945579640">
-    <w:abstractNumId w:val="46"/>
-  </w:num>
   <w:num w:numId="39" w16cid:durableId="1061518593">
-    <w:abstractNumId w:val="42"/>
+    <w:abstractNumId w:val="43"/>
   </w:num>
   <w:num w:numId="40" w16cid:durableId="1599406133">
     <w:abstractNumId w:val="21"/>
   </w:num>
   <w:num w:numId="41" w16cid:durableId="436756851">
-    <w:abstractNumId w:val="50"/>
+    <w:abstractNumId w:val="51"/>
   </w:num>
   <w:num w:numId="42" w16cid:durableId="1784688585">
-    <w:abstractNumId w:val="48"/>
+    <w:abstractNumId w:val="49"/>
   </w:num>
   <w:num w:numId="43" w16cid:durableId="1812088806">
-    <w:abstractNumId w:val="69"/>
+    <w:abstractNumId w:val="72"/>
   </w:num>
   <w:num w:numId="44" w16cid:durableId="195657557">
     <w:abstractNumId w:val="17"/>
   </w:num>
   <w:num w:numId="45" w16cid:durableId="841241357">
-    <w:abstractNumId w:val="43"/>
+    <w:abstractNumId w:val="44"/>
   </w:num>
   <w:num w:numId="46" w16cid:durableId="1696038040">
     <w:abstractNumId w:val="14"/>
   </w:num>
   <w:num w:numId="47" w16cid:durableId="79061021">
-    <w:abstractNumId w:val="57"/>
+    <w:abstractNumId w:val="58"/>
   </w:num>
   <w:num w:numId="48" w16cid:durableId="600991287">
     <w:abstractNumId w:val="15"/>
@@ -34273,13 +35740,13 @@
     <w:abstractNumId w:val="33"/>
   </w:num>
   <w:num w:numId="50" w16cid:durableId="1052384627">
-    <w:abstractNumId w:val="71"/>
+    <w:abstractNumId w:val="74"/>
   </w:num>
   <w:num w:numId="51" w16cid:durableId="787310942">
     <w:abstractNumId w:val="1"/>
   </w:num>
   <w:num w:numId="52" w16cid:durableId="496043113">
-    <w:abstractNumId w:val="41"/>
+    <w:abstractNumId w:val="42"/>
   </w:num>
   <w:num w:numId="53" w16cid:durableId="902181582">
     <w:abstractNumId w:val="32"/>
@@ -34288,19 +35755,19 @@
     <w:abstractNumId w:val="5"/>
   </w:num>
   <w:num w:numId="55" w16cid:durableId="2125034640">
-    <w:abstractNumId w:val="68"/>
+    <w:abstractNumId w:val="71"/>
   </w:num>
   <w:num w:numId="56" w16cid:durableId="117144356">
-    <w:abstractNumId w:val="44"/>
+    <w:abstractNumId w:val="45"/>
   </w:num>
   <w:num w:numId="57" w16cid:durableId="1421025386">
     <w:abstractNumId w:val="27"/>
   </w:num>
   <w:num w:numId="58" w16cid:durableId="540433697">
-    <w:abstractNumId w:val="45"/>
+    <w:abstractNumId w:val="46"/>
   </w:num>
   <w:num w:numId="59" w16cid:durableId="1048843247">
-    <w:abstractNumId w:val="52"/>
+    <w:abstractNumId w:val="53"/>
   </w:num>
   <w:num w:numId="60" w16cid:durableId="1407189402">
     <w:abstractNumId w:val="23"/>
@@ -34309,7 +35776,7 @@
     <w:abstractNumId w:val="7"/>
   </w:num>
   <w:num w:numId="62" w16cid:durableId="879170590">
-    <w:abstractNumId w:val="58"/>
+    <w:abstractNumId w:val="59"/>
   </w:num>
   <w:num w:numId="63" w16cid:durableId="474641774">
     <w:abstractNumId w:val="29"/>
@@ -34318,10 +35785,10 @@
     <w:abstractNumId w:val="31"/>
   </w:num>
   <w:num w:numId="65" w16cid:durableId="477233928">
-    <w:abstractNumId w:val="67"/>
+    <w:abstractNumId w:val="70"/>
   </w:num>
   <w:num w:numId="66" w16cid:durableId="1771121128">
-    <w:abstractNumId w:val="55"/>
+    <w:abstractNumId w:val="56"/>
   </w:num>
   <w:num w:numId="67" w16cid:durableId="514002414">
     <w:abstractNumId w:val="13"/>
@@ -34330,16 +35797,25 @@
     <w:abstractNumId w:val="22"/>
   </w:num>
   <w:num w:numId="69" w16cid:durableId="380371239">
-    <w:abstractNumId w:val="51"/>
+    <w:abstractNumId w:val="52"/>
   </w:num>
   <w:num w:numId="70" w16cid:durableId="698700689">
-    <w:abstractNumId w:val="49"/>
+    <w:abstractNumId w:val="50"/>
   </w:num>
   <w:num w:numId="71" w16cid:durableId="150949584">
     <w:abstractNumId w:val="9"/>
   </w:num>
   <w:num w:numId="72" w16cid:durableId="1467892507">
+    <w:abstractNumId w:val="39"/>
+  </w:num>
+  <w:num w:numId="73" w16cid:durableId="1134641105">
+    <w:abstractNumId w:val="66"/>
+  </w:num>
+  <w:num w:numId="74" w16cid:durableId="1053694936">
     <w:abstractNumId w:val="38"/>
+  </w:num>
+  <w:num w:numId="75" w16cid:durableId="1032150362">
+    <w:abstractNumId w:val="68"/>
   </w:num>
   <w:numIdMacAtCleanup w:val="72"/>
 </w:numbering>

</xml_diff>

<commit_message>
ansible - ad-hoc-commands & facts updated
</commit_message>
<xml_diff>
--- a/Ansible/4-ad‑hoc-commands.docx
+++ b/Ansible/4-ad‑hoc-commands.docx
@@ -5423,17 +5423,7 @@
           <w:sz w:val="28"/>
           <w:szCs w:val="28"/>
         </w:rPr>
-        <w:t>Why Ansible Fails Without a Public Key on the Target</w:t>
-      </w:r>
-      <w:r>
-        <w:rPr>
-          <w:rFonts w:asciiTheme="majorBidi" w:hAnsiTheme="majorBidi" w:cstheme="majorBidi"/>
-          <w:b/>
-          <w:bCs/>
-          <w:sz w:val="28"/>
-          <w:szCs w:val="28"/>
-        </w:rPr>
-        <w:t>?</w:t>
+        <w:t>Why Ansible Fails Without a Public Key on the Target?</w:t>
       </w:r>
     </w:p>
     <w:p>
@@ -5741,6 +5731,214 @@
     </w:p>
     <w:p>
       <w:pPr>
+        <w:pStyle w:val="ListParagraph"/>
+        <w:numPr>
+          <w:ilvl w:val="0"/>
+          <w:numId w:val="76"/>
+        </w:numPr>
+        <w:spacing w:after="80"/>
+        <w:ind w:left="360"/>
+        <w:jc w:val="both"/>
+        <w:rPr>
+          <w:rFonts w:asciiTheme="majorBidi" w:hAnsiTheme="majorBidi" w:cstheme="majorBidi"/>
+          <w:sz w:val="28"/>
+          <w:szCs w:val="28"/>
+        </w:rPr>
+      </w:pPr>
+      <w:r>
+        <w:rPr>
+          <w:rFonts w:asciiTheme="majorBidi" w:hAnsiTheme="majorBidi" w:cstheme="majorBidi"/>
+          <w:sz w:val="28"/>
+          <w:szCs w:val="28"/>
+        </w:rPr>
+        <w:t xml:space="preserve">A common security concern raised in Ansible environments is the risk associated with SSH </w:t>
+      </w:r>
+      <w:proofErr w:type="spellStart"/>
+      <w:r>
+        <w:rPr>
+          <w:rFonts w:asciiTheme="majorBidi" w:hAnsiTheme="majorBidi" w:cstheme="majorBidi"/>
+          <w:sz w:val="28"/>
+          <w:szCs w:val="28"/>
+        </w:rPr>
+        <w:t>passwordless</w:t>
+      </w:r>
+      <w:proofErr w:type="spellEnd"/>
+      <w:r>
+        <w:rPr>
+          <w:rFonts w:asciiTheme="majorBidi" w:hAnsiTheme="majorBidi" w:cstheme="majorBidi"/>
+          <w:sz w:val="28"/>
+          <w:szCs w:val="28"/>
+        </w:rPr>
+        <w:t xml:space="preserve"> authentication. While placing your public key on target hosts enables seamless automation, it introduces a significant vulnerability </w:t>
+      </w:r>
+      <w:r>
+        <w:rPr>
+          <w:rFonts w:asciiTheme="majorBidi" w:hAnsiTheme="majorBidi" w:cstheme="majorBidi"/>
+          <w:sz w:val="28"/>
+          <w:szCs w:val="28"/>
+        </w:rPr>
+        <w:t>-</w:t>
+      </w:r>
+      <w:r>
+        <w:rPr>
+          <w:rFonts w:asciiTheme="majorBidi" w:hAnsiTheme="majorBidi" w:cstheme="majorBidi"/>
+          <w:sz w:val="28"/>
+          <w:szCs w:val="28"/>
+        </w:rPr>
+        <w:t xml:space="preserve"> if the Ansible control node is compromised, an attacker gains SSH access to your entire infrastructure. A recommended mitigation for this is AWX.</w:t>
+      </w:r>
+    </w:p>
+    <w:p>
+      <w:pPr>
+        <w:spacing w:after="80"/>
+        <w:ind w:left="360"/>
+        <w:jc w:val="both"/>
+        <w:rPr>
+          <w:rFonts w:asciiTheme="majorBidi" w:hAnsiTheme="majorBidi" w:cstheme="majorBidi"/>
+          <w:sz w:val="28"/>
+          <w:szCs w:val="28"/>
+        </w:rPr>
+      </w:pPr>
+      <w:r>
+        <w:rPr>
+          <w:rFonts w:asciiTheme="majorBidi" w:hAnsiTheme="majorBidi" w:cstheme="majorBidi"/>
+          <w:sz w:val="28"/>
+          <w:szCs w:val="28"/>
+        </w:rPr>
+        <w:t xml:space="preserve">AWX helps by abstracting the private key away from humans entirely. In a traditional setup the private key sits on the filesystem and anyone with shell access to the control node can use it. AWX stores credentials encrypted and injects them at runtime — no human ever sees the key directly. It also adds role-based access control (who can run which playbooks </w:t>
+      </w:r>
+      <w:r>
+        <w:rPr>
+          <w:rFonts w:asciiTheme="majorBidi" w:hAnsiTheme="majorBidi" w:cstheme="majorBidi"/>
+          <w:sz w:val="28"/>
+          <w:szCs w:val="28"/>
+        </w:rPr>
+        <w:lastRenderedPageBreak/>
+        <w:t>against which hosts) and a full audit trail of every job executed. These are significant operational security improvements.</w:t>
+      </w:r>
+    </w:p>
+    <w:p>
+      <w:pPr>
+        <w:spacing w:after="80"/>
+        <w:ind w:left="360"/>
+        <w:jc w:val="both"/>
+        <w:rPr>
+          <w:rFonts w:asciiTheme="majorBidi" w:hAnsiTheme="majorBidi" w:cstheme="majorBidi"/>
+          <w:sz w:val="28"/>
+          <w:szCs w:val="28"/>
+        </w:rPr>
+      </w:pPr>
+      <w:proofErr w:type="gramStart"/>
+      <w:r>
+        <w:rPr>
+          <w:rFonts w:asciiTheme="majorBidi" w:hAnsiTheme="majorBidi" w:cstheme="majorBidi"/>
+          <w:sz w:val="28"/>
+          <w:szCs w:val="28"/>
+        </w:rPr>
+        <w:t>However</w:t>
+      </w:r>
+      <w:proofErr w:type="gramEnd"/>
+      <w:r>
+        <w:rPr>
+          <w:rFonts w:asciiTheme="majorBidi" w:hAnsiTheme="majorBidi" w:cstheme="majorBidi"/>
+          <w:sz w:val="28"/>
+          <w:szCs w:val="28"/>
+        </w:rPr>
+        <w:t xml:space="preserve"> AWX alone is not a complete answer. It shifts the attack surface from individual control nodes to a single centralized AWX server </w:t>
+      </w:r>
+      <w:r>
+        <w:rPr>
+          <w:rFonts w:asciiTheme="majorBidi" w:hAnsiTheme="majorBidi" w:cstheme="majorBidi"/>
+          <w:sz w:val="28"/>
+          <w:szCs w:val="28"/>
+        </w:rPr>
+        <w:t>-</w:t>
+      </w:r>
+      <w:r>
+        <w:rPr>
+          <w:rFonts w:asciiTheme="majorBidi" w:hAnsiTheme="majorBidi" w:cstheme="majorBidi"/>
+          <w:sz w:val="28"/>
+          <w:szCs w:val="28"/>
+        </w:rPr>
+        <w:t xml:space="preserve"> which is easier to secure and monitor, but still requires proper hardening. A compromised AWX server is just as dangerous as a compromised control node.</w:t>
+      </w:r>
+    </w:p>
+    <w:p>
+      <w:pPr>
+        <w:spacing w:after="80"/>
+        <w:ind w:left="360"/>
+        <w:jc w:val="both"/>
+        <w:rPr>
+          <w:rFonts w:asciiTheme="majorBidi" w:hAnsiTheme="majorBidi" w:cstheme="majorBidi"/>
+          <w:sz w:val="28"/>
+          <w:szCs w:val="28"/>
+        </w:rPr>
+      </w:pPr>
+      <w:r>
+        <w:rPr>
+          <w:rFonts w:asciiTheme="majorBidi" w:hAnsiTheme="majorBidi" w:cstheme="majorBidi"/>
+          <w:sz w:val="28"/>
+          <w:szCs w:val="28"/>
+        </w:rPr>
+        <w:t xml:space="preserve">A properly hardened setup regardless of AWX should layer multiple controls: a dedicated service account SSH key pair used only for automation (never a human's personal key), a bastion/jump host so the control plane never has direct SSH access to production, periodic key rotation, control node hardening with MFA and audit logging, and for the most sensitive environments </w:t>
+      </w:r>
+      <w:r>
+        <w:rPr>
+          <w:rFonts w:asciiTheme="majorBidi" w:hAnsiTheme="majorBidi" w:cstheme="majorBidi"/>
+          <w:sz w:val="28"/>
+          <w:szCs w:val="28"/>
+        </w:rPr>
+        <w:t>-</w:t>
+      </w:r>
+      <w:r>
+        <w:rPr>
+          <w:rFonts w:asciiTheme="majorBidi" w:hAnsiTheme="majorBidi" w:cstheme="majorBidi"/>
+          <w:sz w:val="28"/>
+          <w:szCs w:val="28"/>
+        </w:rPr>
+        <w:t xml:space="preserve"> </w:t>
+      </w:r>
+      <w:proofErr w:type="spellStart"/>
+      <w:r>
+        <w:rPr>
+          <w:rFonts w:asciiTheme="majorBidi" w:hAnsiTheme="majorBidi" w:cstheme="majorBidi"/>
+          <w:sz w:val="28"/>
+          <w:szCs w:val="28"/>
+        </w:rPr>
+        <w:t>HashiCorp</w:t>
+      </w:r>
+      <w:proofErr w:type="spellEnd"/>
+      <w:r>
+        <w:rPr>
+          <w:rFonts w:asciiTheme="majorBidi" w:hAnsiTheme="majorBidi" w:cstheme="majorBidi"/>
+          <w:sz w:val="28"/>
+          <w:szCs w:val="28"/>
+        </w:rPr>
+        <w:t xml:space="preserve"> Vault integration for dynamically issued short-lived credentials instead of permanent keys stored anywhere.</w:t>
+      </w:r>
+    </w:p>
+    <w:p>
+      <w:pPr>
+        <w:spacing w:after="80"/>
+        <w:ind w:left="360"/>
+        <w:jc w:val="both"/>
+        <w:rPr>
+          <w:rFonts w:asciiTheme="majorBidi" w:hAnsiTheme="majorBidi" w:cstheme="majorBidi"/>
+          <w:sz w:val="28"/>
+          <w:szCs w:val="28"/>
+        </w:rPr>
+      </w:pPr>
+      <w:r>
+        <w:rPr>
+          <w:rFonts w:asciiTheme="majorBidi" w:hAnsiTheme="majorBidi" w:cstheme="majorBidi"/>
+          <w:sz w:val="28"/>
+          <w:szCs w:val="28"/>
+        </w:rPr>
+        <w:t>The bottom line is that AWX is a strong and recommended mitigation, but it is one layer in a defense-in-depth strategy, not a standalone solution. The real answer combines dedicated service keys, centralized orchestration like AWX, network segmentation, and audit logging working together.</w:t>
+      </w:r>
+    </w:p>
+    <w:p>
+      <w:pPr>
         <w:spacing w:after="80"/>
         <w:jc w:val="both"/>
         <w:rPr>
@@ -6117,7 +6315,6 @@
           <w:sz w:val="32"/>
           <w:szCs w:val="32"/>
         </w:rPr>
-        <w:lastRenderedPageBreak/>
         <w:t>CLI Options for Privilege Escalation</w:t>
       </w:r>
       <w:r>
@@ -6588,6 +6785,7 @@
           <w:sz w:val="28"/>
           <w:szCs w:val="28"/>
         </w:rPr>
+        <w:lastRenderedPageBreak/>
         <w:t>Execution:</w:t>
       </w:r>
     </w:p>
@@ -7376,7 +7574,7 @@
         <mc:AlternateContent>
           <mc:Choice Requires="wps">
             <w:drawing>
-              <wp:anchor distT="0" distB="0" distL="114300" distR="114300" simplePos="0" relativeHeight="251660288" behindDoc="0" locked="0" layoutInCell="1" allowOverlap="1" wp14:anchorId="68BF7473" wp14:editId="392BC694">
+              <wp:anchor distT="0" distB="0" distL="114300" distR="114300" simplePos="0" relativeHeight="251660288" behindDoc="0" locked="0" layoutInCell="1" allowOverlap="1" wp14:anchorId="68BF7473" wp14:editId="37D2E667">
                 <wp:simplePos x="0" y="0"/>
                 <wp:positionH relativeFrom="margin">
                   <wp:align>left</wp:align>
@@ -7384,8 +7582,8 @@
                 <wp:positionV relativeFrom="paragraph">
                   <wp:posOffset>8890</wp:posOffset>
                 </wp:positionV>
-                <wp:extent cx="1927860" cy="1167914"/>
-                <wp:effectExtent l="0" t="0" r="15240" b="13335"/>
+                <wp:extent cx="1927860" cy="1721223"/>
+                <wp:effectExtent l="0" t="0" r="15240" b="12700"/>
                 <wp:wrapNone/>
                 <wp:docPr id="1885821999" name="Rectangle 2"/>
                 <wp:cNvGraphicFramePr/>
@@ -7396,7 +7594,7 @@
                       <wps:spPr>
                         <a:xfrm>
                           <a:off x="0" y="0"/>
-                          <a:ext cx="1927860" cy="1167914"/>
+                          <a:ext cx="1927860" cy="1721223"/>
                         </a:xfrm>
                         <a:prstGeom prst="rect">
                           <a:avLst/>
@@ -7527,6 +7725,98 @@
                           <w:p>
                             <w:pPr>
                               <w:spacing w:after="0"/>
+                              <w:rPr>
+                                <w:rFonts w:asciiTheme="majorBidi" w:hAnsiTheme="majorBidi" w:cstheme="majorBidi"/>
+                                <w:b/>
+                                <w:bCs/>
+                                <w:i/>
+                                <w:iCs/>
+                                <w:sz w:val="28"/>
+                                <w:szCs w:val="28"/>
+                              </w:rPr>
+                            </w:pPr>
+                            <w:r>
+                              <w:rPr>
+                                <w:rFonts w:asciiTheme="majorBidi" w:hAnsiTheme="majorBidi" w:cstheme="majorBidi"/>
+                                <w:b/>
+                                <w:bCs/>
+                                <w:i/>
+                                <w:iCs/>
+                                <w:sz w:val="28"/>
+                                <w:szCs w:val="28"/>
+                              </w:rPr>
+                              <w:t xml:space="preserve">      apt:</w:t>
+                            </w:r>
+                          </w:p>
+                          <w:p>
+                            <w:pPr>
+                              <w:spacing w:after="0"/>
+                              <w:rPr>
+                                <w:rFonts w:asciiTheme="majorBidi" w:hAnsiTheme="majorBidi" w:cstheme="majorBidi"/>
+                                <w:b/>
+                                <w:bCs/>
+                                <w:i/>
+                                <w:iCs/>
+                                <w:sz w:val="28"/>
+                                <w:szCs w:val="28"/>
+                              </w:rPr>
+                            </w:pPr>
+                            <w:r>
+                              <w:rPr>
+                                <w:rFonts w:asciiTheme="majorBidi" w:hAnsiTheme="majorBidi" w:cstheme="majorBidi"/>
+                                <w:b/>
+                                <w:bCs/>
+                                <w:i/>
+                                <w:iCs/>
+                                <w:sz w:val="28"/>
+                                <w:szCs w:val="28"/>
+                              </w:rPr>
+                              <w:t xml:space="preserve">        name: nginx</w:t>
+                            </w:r>
+                          </w:p>
+                          <w:p>
+                            <w:pPr>
+                              <w:spacing w:after="0"/>
+                              <w:rPr>
+                                <w:rFonts w:asciiTheme="majorBidi" w:hAnsiTheme="majorBidi" w:cstheme="majorBidi"/>
+                                <w:b/>
+                                <w:bCs/>
+                                <w:i/>
+                                <w:iCs/>
+                                <w:sz w:val="28"/>
+                                <w:szCs w:val="28"/>
+                              </w:rPr>
+                            </w:pPr>
+                            <w:r>
+                              <w:rPr>
+                                <w:rFonts w:asciiTheme="majorBidi" w:hAnsiTheme="majorBidi" w:cstheme="majorBidi"/>
+                                <w:b/>
+                                <w:bCs/>
+                                <w:i/>
+                                <w:iCs/>
+                                <w:sz w:val="28"/>
+                                <w:szCs w:val="28"/>
+                              </w:rPr>
+                              <w:t xml:space="preserve">        state: present</w:t>
+                            </w:r>
+                          </w:p>
+                          <w:p>
+                            <w:pPr>
+                              <w:spacing w:after="0"/>
+                              <w:rPr>
+                                <w:rFonts w:asciiTheme="majorBidi" w:hAnsiTheme="majorBidi" w:cstheme="majorBidi"/>
+                                <w:b/>
+                                <w:bCs/>
+                                <w:i/>
+                                <w:iCs/>
+                                <w:sz w:val="28"/>
+                                <w:szCs w:val="28"/>
+                              </w:rPr>
+                            </w:pPr>
+                          </w:p>
+                          <w:p>
+                            <w:pPr>
+                              <w:spacing w:after="0"/>
                               <w:jc w:val="center"/>
                               <w:rPr>
                                 <w:b/>
@@ -7558,7 +7848,7 @@
           </mc:Choice>
           <mc:Fallback>
             <w:pict>
-              <v:rect w14:anchorId="68BF7473" id="Rectangle 2" o:spid="_x0000_s1029" style="position:absolute;left:0;text-align:left;margin-left:0;margin-top:.7pt;width:151.8pt;height:91.95pt;z-index:251660288;visibility:visible;mso-wrap-style:square;mso-width-percent:0;mso-height-percent:0;mso-wrap-distance-left:9pt;mso-wrap-distance-top:0;mso-wrap-distance-right:9pt;mso-wrap-distance-bottom:0;mso-position-horizontal:left;mso-position-horizontal-relative:margin;mso-position-vertical:absolute;mso-position-vertical-relative:text;mso-width-percent:0;mso-height-percent:0;mso-width-relative:margin;mso-height-relative:margin;v-text-anchor:middle" o:gfxdata="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" fillcolor="black [3200]" strokecolor="black [480]" strokeweight="1pt">
+              <v:rect w14:anchorId="68BF7473" id="Rectangle 2" o:spid="_x0000_s1029" style="position:absolute;left:0;text-align:left;margin-left:0;margin-top:.7pt;width:151.8pt;height:135.55pt;z-index:251660288;visibility:visible;mso-wrap-style:square;mso-width-percent:0;mso-height-percent:0;mso-wrap-distance-left:9pt;mso-wrap-distance-top:0;mso-wrap-distance-right:9pt;mso-wrap-distance-bottom:0;mso-position-horizontal:left;mso-position-horizontal-relative:margin;mso-position-vertical:absolute;mso-position-vertical-relative:text;mso-width-percent:0;mso-height-percent:0;mso-width-relative:margin;mso-height-relative:margin;v-text-anchor:middle" o:gfxdata="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" fillcolor="black [3200]" strokecolor="black [480]" strokeweight="1pt">
                 <v:textbox>
                   <w:txbxContent>
                     <w:p>
@@ -7668,237 +7958,6 @@
                     <w:p>
                       <w:pPr>
                         <w:spacing w:after="0"/>
-                        <w:jc w:val="center"/>
-                        <w:rPr>
-                          <w:b/>
-                          <w:bCs/>
-                          <w:i/>
-                          <w:iCs/>
-                        </w:rPr>
-                      </w:pPr>
-                    </w:p>
-                  </w:txbxContent>
-                </v:textbox>
-                <w10:wrap anchorx="margin"/>
-              </v:rect>
-            </w:pict>
-          </mc:Fallback>
-        </mc:AlternateContent>
-      </w:r>
-    </w:p>
-    <w:p>
-      <w:pPr>
-        <w:jc w:val="both"/>
-        <w:rPr>
-          <w:rFonts w:asciiTheme="majorBidi" w:hAnsiTheme="majorBidi" w:cstheme="majorBidi"/>
-          <w:sz w:val="28"/>
-          <w:szCs w:val="28"/>
-        </w:rPr>
-      </w:pPr>
-    </w:p>
-    <w:p>
-      <w:pPr>
-        <w:jc w:val="both"/>
-        <w:rPr>
-          <w:rFonts w:asciiTheme="majorBidi" w:hAnsiTheme="majorBidi" w:cstheme="majorBidi"/>
-          <w:sz w:val="28"/>
-          <w:szCs w:val="28"/>
-        </w:rPr>
-      </w:pPr>
-    </w:p>
-    <w:p>
-      <w:pPr>
-        <w:jc w:val="both"/>
-        <w:rPr>
-          <w:rFonts w:asciiTheme="majorBidi" w:hAnsiTheme="majorBidi" w:cstheme="majorBidi"/>
-          <w:sz w:val="28"/>
-          <w:szCs w:val="28"/>
-        </w:rPr>
-      </w:pPr>
-    </w:p>
-    <w:p>
-      <w:pPr>
-        <w:jc w:val="both"/>
-        <w:rPr>
-          <w:rFonts w:asciiTheme="majorBidi" w:hAnsiTheme="majorBidi" w:cstheme="majorBidi"/>
-          <w:sz w:val="28"/>
-          <w:szCs w:val="28"/>
-        </w:rPr>
-      </w:pPr>
-      <w:r>
-        <w:rPr>
-          <w:rFonts w:asciiTheme="majorBidi" w:hAnsiTheme="majorBidi" w:cstheme="majorBidi"/>
-          <w:noProof/>
-          <w:sz w:val="28"/>
-          <w:szCs w:val="28"/>
-          <w:u w:val="single"/>
-        </w:rPr>
-        <w:lastRenderedPageBreak/>
-        <mc:AlternateContent>
-          <mc:Choice Requires="wps">
-            <w:drawing>
-              <wp:anchor distT="0" distB="0" distL="114300" distR="114300" simplePos="0" relativeHeight="251684864" behindDoc="0" locked="0" layoutInCell="1" allowOverlap="1" wp14:anchorId="7CD5FF13" wp14:editId="1767D5FE">
-                <wp:simplePos x="0" y="0"/>
-                <wp:positionH relativeFrom="margin">
-                  <wp:align>left</wp:align>
-                </wp:positionH>
-                <wp:positionV relativeFrom="paragraph">
-                  <wp:posOffset>-4445</wp:posOffset>
-                </wp:positionV>
-                <wp:extent cx="1927860" cy="806765"/>
-                <wp:effectExtent l="0" t="0" r="15240" b="12700"/>
-                <wp:wrapNone/>
-                <wp:docPr id="913740416" name="Rectangle 2"/>
-                <wp:cNvGraphicFramePr/>
-                <a:graphic xmlns:a="http://schemas.openxmlformats.org/drawingml/2006/main">
-                  <a:graphicData uri="http://schemas.microsoft.com/office/word/2010/wordprocessingShape">
-                    <wps:wsp>
-                      <wps:cNvSpPr/>
-                      <wps:spPr>
-                        <a:xfrm>
-                          <a:off x="0" y="0"/>
-                          <a:ext cx="1927860" cy="806765"/>
-                        </a:xfrm>
-                        <a:prstGeom prst="rect">
-                          <a:avLst/>
-                        </a:prstGeom>
-                      </wps:spPr>
-                      <wps:style>
-                        <a:lnRef idx="2">
-                          <a:schemeClr val="dk1">
-                            <a:shade val="15000"/>
-                          </a:schemeClr>
-                        </a:lnRef>
-                        <a:fillRef idx="1">
-                          <a:schemeClr val="dk1"/>
-                        </a:fillRef>
-                        <a:effectRef idx="0">
-                          <a:schemeClr val="dk1"/>
-                        </a:effectRef>
-                        <a:fontRef idx="minor">
-                          <a:schemeClr val="lt1"/>
-                        </a:fontRef>
-                      </wps:style>
-                      <wps:txbx>
-                        <w:txbxContent>
-                          <w:p>
-                            <w:pPr>
-                              <w:spacing w:after="0"/>
-                              <w:rPr>
-                                <w:rFonts w:asciiTheme="majorBidi" w:hAnsiTheme="majorBidi" w:cstheme="majorBidi"/>
-                                <w:b/>
-                                <w:bCs/>
-                                <w:i/>
-                                <w:iCs/>
-                                <w:sz w:val="28"/>
-                                <w:szCs w:val="28"/>
-                              </w:rPr>
-                            </w:pPr>
-                            <w:r>
-                              <w:rPr>
-                                <w:rFonts w:asciiTheme="majorBidi" w:hAnsiTheme="majorBidi" w:cstheme="majorBidi"/>
-                                <w:b/>
-                                <w:bCs/>
-                                <w:i/>
-                                <w:iCs/>
-                                <w:sz w:val="28"/>
-                                <w:szCs w:val="28"/>
-                              </w:rPr>
-                              <w:t xml:space="preserve">      apt:</w:t>
-                            </w:r>
-                          </w:p>
-                          <w:p>
-                            <w:pPr>
-                              <w:spacing w:after="0"/>
-                              <w:rPr>
-                                <w:rFonts w:asciiTheme="majorBidi" w:hAnsiTheme="majorBidi" w:cstheme="majorBidi"/>
-                                <w:b/>
-                                <w:bCs/>
-                                <w:i/>
-                                <w:iCs/>
-                                <w:sz w:val="28"/>
-                                <w:szCs w:val="28"/>
-                              </w:rPr>
-                            </w:pPr>
-                            <w:r>
-                              <w:rPr>
-                                <w:rFonts w:asciiTheme="majorBidi" w:hAnsiTheme="majorBidi" w:cstheme="majorBidi"/>
-                                <w:b/>
-                                <w:bCs/>
-                                <w:i/>
-                                <w:iCs/>
-                                <w:sz w:val="28"/>
-                                <w:szCs w:val="28"/>
-                              </w:rPr>
-                              <w:t xml:space="preserve">        name: nginx</w:t>
-                            </w:r>
-                          </w:p>
-                          <w:p>
-                            <w:pPr>
-                              <w:spacing w:after="0"/>
-                              <w:rPr>
-                                <w:rFonts w:asciiTheme="majorBidi" w:hAnsiTheme="majorBidi" w:cstheme="majorBidi"/>
-                                <w:b/>
-                                <w:bCs/>
-                                <w:i/>
-                                <w:iCs/>
-                                <w:sz w:val="28"/>
-                                <w:szCs w:val="28"/>
-                              </w:rPr>
-                            </w:pPr>
-                            <w:r>
-                              <w:rPr>
-                                <w:rFonts w:asciiTheme="majorBidi" w:hAnsiTheme="majorBidi" w:cstheme="majorBidi"/>
-                                <w:b/>
-                                <w:bCs/>
-                                <w:i/>
-                                <w:iCs/>
-                                <w:sz w:val="28"/>
-                                <w:szCs w:val="28"/>
-                              </w:rPr>
-                              <w:t xml:space="preserve">        state: present</w:t>
-                            </w:r>
-                          </w:p>
-                          <w:p>
-                            <w:pPr>
-                              <w:spacing w:after="0"/>
-                              <w:jc w:val="center"/>
-                              <w:rPr>
-                                <w:b/>
-                                <w:bCs/>
-                                <w:i/>
-                                <w:iCs/>
-                              </w:rPr>
-                            </w:pPr>
-                          </w:p>
-                        </w:txbxContent>
-                      </wps:txbx>
-                      <wps:bodyPr rot="0" spcFirstLastPara="0" vertOverflow="overflow" horzOverflow="overflow" vert="horz" wrap="square" lIns="91440" tIns="45720" rIns="91440" bIns="45720" numCol="1" spcCol="0" rtlCol="0" fromWordArt="0" anchor="ctr" anchorCtr="0" forceAA="0" compatLnSpc="1">
-                        <a:prstTxWarp prst="textNoShape">
-                          <a:avLst/>
-                        </a:prstTxWarp>
-                        <a:noAutofit/>
-                      </wps:bodyPr>
-                    </wps:wsp>
-                  </a:graphicData>
-                </a:graphic>
-                <wp14:sizeRelH relativeFrom="margin">
-                  <wp14:pctWidth>0</wp14:pctWidth>
-                </wp14:sizeRelH>
-                <wp14:sizeRelV relativeFrom="margin">
-                  <wp14:pctHeight>0</wp14:pctHeight>
-                </wp14:sizeRelV>
-              </wp:anchor>
-            </w:drawing>
-          </mc:Choice>
-          <mc:Fallback>
-            <w:pict>
-              <v:rect w14:anchorId="7CD5FF13" id="_x0000_s1030" style="position:absolute;left:0;text-align:left;margin-left:0;margin-top:-.35pt;width:151.8pt;height:63.5pt;z-index:251684864;visibility:visible;mso-wrap-style:square;mso-width-percent:0;mso-height-percent:0;mso-wrap-distance-left:9pt;mso-wrap-distance-top:0;mso-wrap-distance-right:9pt;mso-wrap-distance-bottom:0;mso-position-horizontal:left;mso-position-horizontal-relative:margin;mso-position-vertical:absolute;mso-position-vertical-relative:text;mso-width-percent:0;mso-height-percent:0;mso-width-relative:margin;mso-height-relative:margin;v-text-anchor:middle" o:gfxdata="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" fillcolor="black [3200]" strokecolor="black [480]" strokeweight="1pt">
-                <v:textbox>
-                  <w:txbxContent>
-                    <w:p>
-                      <w:pPr>
-                        <w:spacing w:after="0"/>
                         <w:rPr>
                           <w:rFonts w:asciiTheme="majorBidi" w:hAnsiTheme="majorBidi" w:cstheme="majorBidi"/>
                           <w:b/>
@@ -7977,6 +8036,20 @@
                     <w:p>
                       <w:pPr>
                         <w:spacing w:after="0"/>
+                        <w:rPr>
+                          <w:rFonts w:asciiTheme="majorBidi" w:hAnsiTheme="majorBidi" w:cstheme="majorBidi"/>
+                          <w:b/>
+                          <w:bCs/>
+                          <w:i/>
+                          <w:iCs/>
+                          <w:sz w:val="28"/>
+                          <w:szCs w:val="28"/>
+                        </w:rPr>
+                      </w:pPr>
+                    </w:p>
+                    <w:p>
+                      <w:pPr>
+                        <w:spacing w:after="0"/>
                         <w:jc w:val="center"/>
                         <w:rPr>
                           <w:b/>
@@ -8000,18 +8073,48 @@
         <w:jc w:val="both"/>
         <w:rPr>
           <w:rFonts w:asciiTheme="majorBidi" w:hAnsiTheme="majorBidi" w:cstheme="majorBidi"/>
-          <w:sz w:val="40"/>
-          <w:szCs w:val="40"/>
-        </w:rPr>
-      </w:pPr>
-    </w:p>
-    <w:p>
-      <w:pPr>
-        <w:jc w:val="both"/>
-        <w:rPr>
-          <w:rFonts w:asciiTheme="majorBidi" w:hAnsiTheme="majorBidi" w:cstheme="majorBidi"/>
-          <w:sz w:val="4"/>
-          <w:szCs w:val="4"/>
+          <w:sz w:val="28"/>
+          <w:szCs w:val="28"/>
+        </w:rPr>
+      </w:pPr>
+    </w:p>
+    <w:p>
+      <w:pPr>
+        <w:jc w:val="both"/>
+        <w:rPr>
+          <w:rFonts w:asciiTheme="majorBidi" w:hAnsiTheme="majorBidi" w:cstheme="majorBidi"/>
+          <w:sz w:val="28"/>
+          <w:szCs w:val="28"/>
+        </w:rPr>
+      </w:pPr>
+    </w:p>
+    <w:p>
+      <w:pPr>
+        <w:jc w:val="both"/>
+        <w:rPr>
+          <w:rFonts w:asciiTheme="majorBidi" w:hAnsiTheme="majorBidi" w:cstheme="majorBidi"/>
+          <w:sz w:val="28"/>
+          <w:szCs w:val="28"/>
+        </w:rPr>
+      </w:pPr>
+    </w:p>
+    <w:p>
+      <w:pPr>
+        <w:jc w:val="both"/>
+        <w:rPr>
+          <w:rFonts w:asciiTheme="majorBidi" w:hAnsiTheme="majorBidi" w:cstheme="majorBidi"/>
+          <w:sz w:val="28"/>
+          <w:szCs w:val="28"/>
+        </w:rPr>
+      </w:pPr>
+    </w:p>
+    <w:p>
+      <w:pPr>
+        <w:jc w:val="both"/>
+        <w:rPr>
+          <w:rFonts w:asciiTheme="majorBidi" w:hAnsiTheme="majorBidi" w:cstheme="majorBidi"/>
+          <w:sz w:val="8"/>
+          <w:szCs w:val="8"/>
         </w:rPr>
       </w:pPr>
     </w:p>
@@ -8999,6 +9102,7 @@
           <w:sz w:val="28"/>
           <w:szCs w:val="28"/>
         </w:rPr>
+        <w:lastRenderedPageBreak/>
         <w:t>Privilege escalation can also be defined in inventory.</w:t>
       </w:r>
     </w:p>
@@ -10189,7 +10293,6 @@
           <w:sz w:val="28"/>
           <w:szCs w:val="28"/>
         </w:rPr>
-        <w:lastRenderedPageBreak/>
         <mc:AlternateContent>
           <mc:Choice Requires="wps">
             <w:drawing>
@@ -11370,6 +11473,7 @@
           <w:sz w:val="36"/>
           <w:szCs w:val="36"/>
         </w:rPr>
+        <w:lastRenderedPageBreak/>
         <w:t>Passwordless</w:t>
       </w:r>
       <w:proofErr w:type="spellEnd"/>
@@ -12243,7 +12347,6 @@
           <w:sz w:val="32"/>
           <w:szCs w:val="32"/>
         </w:rPr>
-        <w:lastRenderedPageBreak/>
         <w:t>Edge Case: Privilege Escalation and Python</w:t>
       </w:r>
     </w:p>
@@ -12663,6 +12766,7 @@
           <w:sz w:val="28"/>
           <w:szCs w:val="28"/>
         </w:rPr>
+        <w:lastRenderedPageBreak/>
         <w:t>Debugging Privilege Escalation</w:t>
       </w:r>
       <w:r>
@@ -13728,7 +13832,6 @@
           <w:sz w:val="28"/>
           <w:szCs w:val="28"/>
         </w:rPr>
-        <w:lastRenderedPageBreak/>
         <w:t>This runs on each web server.</w:t>
       </w:r>
     </w:p>
@@ -14631,6 +14734,7 @@
           <w:sz w:val="28"/>
           <w:szCs w:val="28"/>
         </w:rPr>
+        <w:lastRenderedPageBreak/>
         <w:t>web3 → command runs on lb1</w:t>
       </w:r>
     </w:p>
@@ -15801,32 +15905,6 @@
           <w:szCs w:val="32"/>
         </w:rPr>
       </w:pPr>
-    </w:p>
-    <w:p>
-      <w:pPr>
-        <w:spacing w:after="60"/>
-        <w:jc w:val="both"/>
-        <w:rPr>
-          <w:rFonts w:asciiTheme="majorBidi" w:hAnsiTheme="majorBidi" w:cstheme="majorBidi"/>
-          <w:b/>
-          <w:bCs/>
-          <w:sz w:val="32"/>
-          <w:szCs w:val="32"/>
-        </w:rPr>
-      </w:pPr>
-    </w:p>
-    <w:p>
-      <w:pPr>
-        <w:spacing w:after="60"/>
-        <w:jc w:val="both"/>
-        <w:rPr>
-          <w:rFonts w:asciiTheme="majorBidi" w:hAnsiTheme="majorBidi" w:cstheme="majorBidi"/>
-          <w:b/>
-          <w:bCs/>
-          <w:sz w:val="32"/>
-          <w:szCs w:val="32"/>
-        </w:rPr>
-      </w:pPr>
       <w:r>
         <w:rPr>
           <w:rFonts w:asciiTheme="majorBidi" w:hAnsiTheme="majorBidi" w:cstheme="majorBidi"/>
@@ -16746,6 +16824,7 @@
           <w:sz w:val="28"/>
           <w:szCs w:val="28"/>
         </w:rPr>
+        <w:lastRenderedPageBreak/>
         <w:t>--become-user</w:t>
       </w:r>
       <w:r>
@@ -17058,6 +17137,146 @@
         </w:rPr>
         <w:t xml:space="preserve"> for automation users.</w:t>
       </w:r>
+    </w:p>
+    <w:p>
+      <w:pPr>
+        <w:jc w:val="both"/>
+        <w:rPr>
+          <w:rFonts w:asciiTheme="majorBidi" w:hAnsiTheme="majorBidi" w:cstheme="majorBidi"/>
+          <w:sz w:val="28"/>
+          <w:szCs w:val="28"/>
+        </w:rPr>
+      </w:pPr>
+    </w:p>
+    <w:p>
+      <w:pPr>
+        <w:jc w:val="both"/>
+        <w:rPr>
+          <w:rFonts w:asciiTheme="majorBidi" w:hAnsiTheme="majorBidi" w:cstheme="majorBidi"/>
+          <w:sz w:val="28"/>
+          <w:szCs w:val="28"/>
+        </w:rPr>
+      </w:pPr>
+    </w:p>
+    <w:p>
+      <w:pPr>
+        <w:jc w:val="both"/>
+        <w:rPr>
+          <w:rFonts w:asciiTheme="majorBidi" w:hAnsiTheme="majorBidi" w:cstheme="majorBidi"/>
+          <w:sz w:val="28"/>
+          <w:szCs w:val="28"/>
+        </w:rPr>
+      </w:pPr>
+    </w:p>
+    <w:p>
+      <w:pPr>
+        <w:jc w:val="both"/>
+        <w:rPr>
+          <w:rFonts w:asciiTheme="majorBidi" w:hAnsiTheme="majorBidi" w:cstheme="majorBidi"/>
+          <w:sz w:val="28"/>
+          <w:szCs w:val="28"/>
+        </w:rPr>
+      </w:pPr>
+    </w:p>
+    <w:p>
+      <w:pPr>
+        <w:jc w:val="both"/>
+        <w:rPr>
+          <w:rFonts w:asciiTheme="majorBidi" w:hAnsiTheme="majorBidi" w:cstheme="majorBidi"/>
+          <w:sz w:val="28"/>
+          <w:szCs w:val="28"/>
+        </w:rPr>
+      </w:pPr>
+    </w:p>
+    <w:p>
+      <w:pPr>
+        <w:jc w:val="both"/>
+        <w:rPr>
+          <w:rFonts w:asciiTheme="majorBidi" w:hAnsiTheme="majorBidi" w:cstheme="majorBidi"/>
+          <w:sz w:val="28"/>
+          <w:szCs w:val="28"/>
+        </w:rPr>
+      </w:pPr>
+    </w:p>
+    <w:p>
+      <w:pPr>
+        <w:jc w:val="both"/>
+        <w:rPr>
+          <w:rFonts w:asciiTheme="majorBidi" w:hAnsiTheme="majorBidi" w:cstheme="majorBidi"/>
+          <w:sz w:val="28"/>
+          <w:szCs w:val="28"/>
+        </w:rPr>
+      </w:pPr>
+    </w:p>
+    <w:p>
+      <w:pPr>
+        <w:jc w:val="both"/>
+        <w:rPr>
+          <w:rFonts w:asciiTheme="majorBidi" w:hAnsiTheme="majorBidi" w:cstheme="majorBidi"/>
+          <w:sz w:val="28"/>
+          <w:szCs w:val="28"/>
+        </w:rPr>
+      </w:pPr>
+    </w:p>
+    <w:p>
+      <w:pPr>
+        <w:jc w:val="both"/>
+        <w:rPr>
+          <w:rFonts w:asciiTheme="majorBidi" w:hAnsiTheme="majorBidi" w:cstheme="majorBidi"/>
+          <w:sz w:val="28"/>
+          <w:szCs w:val="28"/>
+        </w:rPr>
+      </w:pPr>
+    </w:p>
+    <w:p>
+      <w:pPr>
+        <w:jc w:val="both"/>
+        <w:rPr>
+          <w:rFonts w:asciiTheme="majorBidi" w:hAnsiTheme="majorBidi" w:cstheme="majorBidi"/>
+          <w:sz w:val="28"/>
+          <w:szCs w:val="28"/>
+        </w:rPr>
+      </w:pPr>
+    </w:p>
+    <w:p>
+      <w:pPr>
+        <w:jc w:val="both"/>
+        <w:rPr>
+          <w:rFonts w:asciiTheme="majorBidi" w:hAnsiTheme="majorBidi" w:cstheme="majorBidi"/>
+          <w:sz w:val="28"/>
+          <w:szCs w:val="28"/>
+        </w:rPr>
+      </w:pPr>
+    </w:p>
+    <w:p>
+      <w:pPr>
+        <w:jc w:val="both"/>
+        <w:rPr>
+          <w:rFonts w:asciiTheme="majorBidi" w:hAnsiTheme="majorBidi" w:cstheme="majorBidi"/>
+          <w:sz w:val="28"/>
+          <w:szCs w:val="28"/>
+        </w:rPr>
+      </w:pPr>
+    </w:p>
+    <w:p>
+      <w:pPr>
+        <w:jc w:val="both"/>
+        <w:rPr>
+          <w:rFonts w:asciiTheme="majorBidi" w:hAnsiTheme="majorBidi" w:cstheme="majorBidi"/>
+          <w:sz w:val="28"/>
+          <w:szCs w:val="28"/>
+        </w:rPr>
+      </w:pPr>
+    </w:p>
+    <w:p>
+      <w:pPr>
+        <w:jc w:val="both"/>
+        <w:rPr>
+          <w:rFonts w:asciiTheme="majorBidi" w:hAnsiTheme="majorBidi" w:cstheme="majorBidi"/>
+          <w:sz w:val="28"/>
+          <w:szCs w:val="28"/>
+        </w:rPr>
+      </w:pPr>
     </w:p>
     <w:p>
       <w:pPr>
@@ -28258,6 +28477,119 @@
     </w:lvl>
   </w:abstractNum>
   <w:abstractNum w:abstractNumId="9" w15:restartNumberingAfterBreak="0">
+    <w:nsid w:val="16A85039"/>
+    <w:multiLevelType w:val="hybridMultilevel"/>
+    <w:tmpl w:val="C67C0672"/>
+    <w:lvl w:ilvl="0" w:tplc="0409000D">
+      <w:start w:val="1"/>
+      <w:numFmt w:val="bullet"/>
+      <w:lvlText w:val=""/>
+      <w:lvlJc w:val="left"/>
+      <w:pPr>
+        <w:ind w:left="1080" w:hanging="360"/>
+      </w:pPr>
+      <w:rPr>
+        <w:rFonts w:ascii="Wingdings" w:hAnsi="Wingdings" w:hint="default"/>
+      </w:rPr>
+    </w:lvl>
+    <w:lvl w:ilvl="1" w:tplc="04090003" w:tentative="1">
+      <w:start w:val="1"/>
+      <w:numFmt w:val="bullet"/>
+      <w:lvlText w:val="o"/>
+      <w:lvlJc w:val="left"/>
+      <w:pPr>
+        <w:ind w:left="1800" w:hanging="360"/>
+      </w:pPr>
+      <w:rPr>
+        <w:rFonts w:ascii="Courier New" w:hAnsi="Courier New" w:cs="Courier New" w:hint="default"/>
+      </w:rPr>
+    </w:lvl>
+    <w:lvl w:ilvl="2" w:tplc="04090005" w:tentative="1">
+      <w:start w:val="1"/>
+      <w:numFmt w:val="bullet"/>
+      <w:lvlText w:val=""/>
+      <w:lvlJc w:val="left"/>
+      <w:pPr>
+        <w:ind w:left="2520" w:hanging="360"/>
+      </w:pPr>
+      <w:rPr>
+        <w:rFonts w:ascii="Wingdings" w:hAnsi="Wingdings" w:hint="default"/>
+      </w:rPr>
+    </w:lvl>
+    <w:lvl w:ilvl="3" w:tplc="04090001" w:tentative="1">
+      <w:start w:val="1"/>
+      <w:numFmt w:val="bullet"/>
+      <w:lvlText w:val=""/>
+      <w:lvlJc w:val="left"/>
+      <w:pPr>
+        <w:ind w:left="3240" w:hanging="360"/>
+      </w:pPr>
+      <w:rPr>
+        <w:rFonts w:ascii="Symbol" w:hAnsi="Symbol" w:hint="default"/>
+      </w:rPr>
+    </w:lvl>
+    <w:lvl w:ilvl="4" w:tplc="04090003" w:tentative="1">
+      <w:start w:val="1"/>
+      <w:numFmt w:val="bullet"/>
+      <w:lvlText w:val="o"/>
+      <w:lvlJc w:val="left"/>
+      <w:pPr>
+        <w:ind w:left="3960" w:hanging="360"/>
+      </w:pPr>
+      <w:rPr>
+        <w:rFonts w:ascii="Courier New" w:hAnsi="Courier New" w:cs="Courier New" w:hint="default"/>
+      </w:rPr>
+    </w:lvl>
+    <w:lvl w:ilvl="5" w:tplc="04090005" w:tentative="1">
+      <w:start w:val="1"/>
+      <w:numFmt w:val="bullet"/>
+      <w:lvlText w:val=""/>
+      <w:lvlJc w:val="left"/>
+      <w:pPr>
+        <w:ind w:left="4680" w:hanging="360"/>
+      </w:pPr>
+      <w:rPr>
+        <w:rFonts w:ascii="Wingdings" w:hAnsi="Wingdings" w:hint="default"/>
+      </w:rPr>
+    </w:lvl>
+    <w:lvl w:ilvl="6" w:tplc="04090001" w:tentative="1">
+      <w:start w:val="1"/>
+      <w:numFmt w:val="bullet"/>
+      <w:lvlText w:val=""/>
+      <w:lvlJc w:val="left"/>
+      <w:pPr>
+        <w:ind w:left="5400" w:hanging="360"/>
+      </w:pPr>
+      <w:rPr>
+        <w:rFonts w:ascii="Symbol" w:hAnsi="Symbol" w:hint="default"/>
+      </w:rPr>
+    </w:lvl>
+    <w:lvl w:ilvl="7" w:tplc="04090003" w:tentative="1">
+      <w:start w:val="1"/>
+      <w:numFmt w:val="bullet"/>
+      <w:lvlText w:val="o"/>
+      <w:lvlJc w:val="left"/>
+      <w:pPr>
+        <w:ind w:left="6120" w:hanging="360"/>
+      </w:pPr>
+      <w:rPr>
+        <w:rFonts w:ascii="Courier New" w:hAnsi="Courier New" w:cs="Courier New" w:hint="default"/>
+      </w:rPr>
+    </w:lvl>
+    <w:lvl w:ilvl="8" w:tplc="04090005" w:tentative="1">
+      <w:start w:val="1"/>
+      <w:numFmt w:val="bullet"/>
+      <w:lvlText w:val=""/>
+      <w:lvlJc w:val="left"/>
+      <w:pPr>
+        <w:ind w:left="6840" w:hanging="360"/>
+      </w:pPr>
+      <w:rPr>
+        <w:rFonts w:ascii="Wingdings" w:hAnsi="Wingdings" w:hint="default"/>
+      </w:rPr>
+    </w:lvl>
+  </w:abstractNum>
+  <w:abstractNum w:abstractNumId="10" w15:restartNumberingAfterBreak="0">
     <w:nsid w:val="17240254"/>
     <w:multiLevelType w:val="hybridMultilevel"/>
     <w:tmpl w:val="F1EA3B3A"/>
@@ -28370,7 +28702,7 @@
       </w:rPr>
     </w:lvl>
   </w:abstractNum>
-  <w:abstractNum w:abstractNumId="10" w15:restartNumberingAfterBreak="0">
+  <w:abstractNum w:abstractNumId="11" w15:restartNumberingAfterBreak="0">
     <w:nsid w:val="17ED02EB"/>
     <w:multiLevelType w:val="hybridMultilevel"/>
     <w:tmpl w:val="5A96BAC4"/>
@@ -28483,7 +28815,7 @@
       </w:rPr>
     </w:lvl>
   </w:abstractNum>
-  <w:abstractNum w:abstractNumId="11" w15:restartNumberingAfterBreak="0">
+  <w:abstractNum w:abstractNumId="12" w15:restartNumberingAfterBreak="0">
     <w:nsid w:val="18D7236F"/>
     <w:multiLevelType w:val="hybridMultilevel"/>
     <w:tmpl w:val="18586D2E"/>
@@ -28569,7 +28901,7 @@
       </w:pPr>
     </w:lvl>
   </w:abstractNum>
-  <w:abstractNum w:abstractNumId="12" w15:restartNumberingAfterBreak="0">
+  <w:abstractNum w:abstractNumId="13" w15:restartNumberingAfterBreak="0">
     <w:nsid w:val="19352FC2"/>
     <w:multiLevelType w:val="hybridMultilevel"/>
     <w:tmpl w:val="C9E845AE"/>
@@ -28682,7 +29014,7 @@
       </w:rPr>
     </w:lvl>
   </w:abstractNum>
-  <w:abstractNum w:abstractNumId="13" w15:restartNumberingAfterBreak="0">
+  <w:abstractNum w:abstractNumId="14" w15:restartNumberingAfterBreak="0">
     <w:nsid w:val="223E4C82"/>
     <w:multiLevelType w:val="hybridMultilevel"/>
     <w:tmpl w:val="C2A86180"/>
@@ -28795,7 +29127,7 @@
       </w:rPr>
     </w:lvl>
   </w:abstractNum>
-  <w:abstractNum w:abstractNumId="14" w15:restartNumberingAfterBreak="0">
+  <w:abstractNum w:abstractNumId="15" w15:restartNumberingAfterBreak="0">
     <w:nsid w:val="25BD6DEE"/>
     <w:multiLevelType w:val="hybridMultilevel"/>
     <w:tmpl w:val="0D3026D0"/>
@@ -28908,7 +29240,7 @@
       </w:rPr>
     </w:lvl>
   </w:abstractNum>
-  <w:abstractNum w:abstractNumId="15" w15:restartNumberingAfterBreak="0">
+  <w:abstractNum w:abstractNumId="16" w15:restartNumberingAfterBreak="0">
     <w:nsid w:val="277C0B72"/>
     <w:multiLevelType w:val="hybridMultilevel"/>
     <w:tmpl w:val="7CD6B744"/>
@@ -29021,7 +29353,7 @@
       </w:rPr>
     </w:lvl>
   </w:abstractNum>
-  <w:abstractNum w:abstractNumId="16" w15:restartNumberingAfterBreak="0">
+  <w:abstractNum w:abstractNumId="17" w15:restartNumberingAfterBreak="0">
     <w:nsid w:val="2A3158C6"/>
     <w:multiLevelType w:val="hybridMultilevel"/>
     <w:tmpl w:val="901272D0"/>
@@ -29134,7 +29466,7 @@
       </w:rPr>
     </w:lvl>
   </w:abstractNum>
-  <w:abstractNum w:abstractNumId="17" w15:restartNumberingAfterBreak="0">
+  <w:abstractNum w:abstractNumId="18" w15:restartNumberingAfterBreak="0">
     <w:nsid w:val="2AAE7D8F"/>
     <w:multiLevelType w:val="hybridMultilevel"/>
     <w:tmpl w:val="7AA81018"/>
@@ -29247,7 +29579,7 @@
       </w:rPr>
     </w:lvl>
   </w:abstractNum>
-  <w:abstractNum w:abstractNumId="18" w15:restartNumberingAfterBreak="0">
+  <w:abstractNum w:abstractNumId="19" w15:restartNumberingAfterBreak="0">
     <w:nsid w:val="2B58107C"/>
     <w:multiLevelType w:val="hybridMultilevel"/>
     <w:tmpl w:val="3296FF4A"/>
@@ -29360,7 +29692,7 @@
       </w:rPr>
     </w:lvl>
   </w:abstractNum>
-  <w:abstractNum w:abstractNumId="19" w15:restartNumberingAfterBreak="0">
+  <w:abstractNum w:abstractNumId="20" w15:restartNumberingAfterBreak="0">
     <w:nsid w:val="2EEE1079"/>
     <w:multiLevelType w:val="hybridMultilevel"/>
     <w:tmpl w:val="3CFAD006"/>
@@ -29473,7 +29805,7 @@
       </w:rPr>
     </w:lvl>
   </w:abstractNum>
-  <w:abstractNum w:abstractNumId="20" w15:restartNumberingAfterBreak="0">
+  <w:abstractNum w:abstractNumId="21" w15:restartNumberingAfterBreak="0">
     <w:nsid w:val="2F6F6223"/>
     <w:multiLevelType w:val="hybridMultilevel"/>
     <w:tmpl w:val="4E4E9882"/>
@@ -29586,7 +29918,7 @@
       </w:rPr>
     </w:lvl>
   </w:abstractNum>
-  <w:abstractNum w:abstractNumId="21" w15:restartNumberingAfterBreak="0">
+  <w:abstractNum w:abstractNumId="22" w15:restartNumberingAfterBreak="0">
     <w:nsid w:val="2F7A08DD"/>
     <w:multiLevelType w:val="hybridMultilevel"/>
     <w:tmpl w:val="75FE1638"/>
@@ -29699,7 +30031,7 @@
       </w:rPr>
     </w:lvl>
   </w:abstractNum>
-  <w:abstractNum w:abstractNumId="22" w15:restartNumberingAfterBreak="0">
+  <w:abstractNum w:abstractNumId="23" w15:restartNumberingAfterBreak="0">
     <w:nsid w:val="310B27AF"/>
     <w:multiLevelType w:val="hybridMultilevel"/>
     <w:tmpl w:val="3E768804"/>
@@ -29788,7 +30120,7 @@
       </w:pPr>
     </w:lvl>
   </w:abstractNum>
-  <w:abstractNum w:abstractNumId="23" w15:restartNumberingAfterBreak="0">
+  <w:abstractNum w:abstractNumId="24" w15:restartNumberingAfterBreak="0">
     <w:nsid w:val="39647596"/>
     <w:multiLevelType w:val="hybridMultilevel"/>
     <w:tmpl w:val="4C666384"/>
@@ -29901,7 +30233,7 @@
       </w:rPr>
     </w:lvl>
   </w:abstractNum>
-  <w:abstractNum w:abstractNumId="24" w15:restartNumberingAfterBreak="0">
+  <w:abstractNum w:abstractNumId="25" w15:restartNumberingAfterBreak="0">
     <w:nsid w:val="398A324C"/>
     <w:multiLevelType w:val="hybridMultilevel"/>
     <w:tmpl w:val="B49A179A"/>
@@ -30014,7 +30346,7 @@
       </w:rPr>
     </w:lvl>
   </w:abstractNum>
-  <w:abstractNum w:abstractNumId="25" w15:restartNumberingAfterBreak="0">
+  <w:abstractNum w:abstractNumId="26" w15:restartNumberingAfterBreak="0">
     <w:nsid w:val="3CA127B3"/>
     <w:multiLevelType w:val="hybridMultilevel"/>
     <w:tmpl w:val="89145396"/>
@@ -30127,7 +30459,7 @@
       </w:rPr>
     </w:lvl>
   </w:abstractNum>
-  <w:abstractNum w:abstractNumId="26" w15:restartNumberingAfterBreak="0">
+  <w:abstractNum w:abstractNumId="27" w15:restartNumberingAfterBreak="0">
     <w:nsid w:val="3CB53E9B"/>
     <w:multiLevelType w:val="hybridMultilevel"/>
     <w:tmpl w:val="16669956"/>
@@ -30240,7 +30572,7 @@
       </w:rPr>
     </w:lvl>
   </w:abstractNum>
-  <w:abstractNum w:abstractNumId="27" w15:restartNumberingAfterBreak="0">
+  <w:abstractNum w:abstractNumId="28" w15:restartNumberingAfterBreak="0">
     <w:nsid w:val="3F4D282D"/>
     <w:multiLevelType w:val="hybridMultilevel"/>
     <w:tmpl w:val="A6DCCA92"/>
@@ -30353,7 +30685,7 @@
       </w:rPr>
     </w:lvl>
   </w:abstractNum>
-  <w:abstractNum w:abstractNumId="28" w15:restartNumberingAfterBreak="0">
+  <w:abstractNum w:abstractNumId="29" w15:restartNumberingAfterBreak="0">
     <w:nsid w:val="41046606"/>
     <w:multiLevelType w:val="hybridMultilevel"/>
     <w:tmpl w:val="6628A9EE"/>
@@ -30466,7 +30798,7 @@
       </w:rPr>
     </w:lvl>
   </w:abstractNum>
-  <w:abstractNum w:abstractNumId="29" w15:restartNumberingAfterBreak="0">
+  <w:abstractNum w:abstractNumId="30" w15:restartNumberingAfterBreak="0">
     <w:nsid w:val="41C6056F"/>
     <w:multiLevelType w:val="hybridMultilevel"/>
     <w:tmpl w:val="25C2DEE0"/>
@@ -30579,7 +30911,7 @@
       </w:rPr>
     </w:lvl>
   </w:abstractNum>
-  <w:abstractNum w:abstractNumId="30" w15:restartNumberingAfterBreak="0">
+  <w:abstractNum w:abstractNumId="31" w15:restartNumberingAfterBreak="0">
     <w:nsid w:val="44466E59"/>
     <w:multiLevelType w:val="hybridMultilevel"/>
     <w:tmpl w:val="8E6659E4"/>
@@ -30692,7 +31024,7 @@
       </w:rPr>
     </w:lvl>
   </w:abstractNum>
-  <w:abstractNum w:abstractNumId="31" w15:restartNumberingAfterBreak="0">
+  <w:abstractNum w:abstractNumId="32" w15:restartNumberingAfterBreak="0">
     <w:nsid w:val="449B439A"/>
     <w:multiLevelType w:val="hybridMultilevel"/>
     <w:tmpl w:val="69B0F7A2"/>
@@ -30805,7 +31137,7 @@
       </w:rPr>
     </w:lvl>
   </w:abstractNum>
-  <w:abstractNum w:abstractNumId="32" w15:restartNumberingAfterBreak="0">
+  <w:abstractNum w:abstractNumId="33" w15:restartNumberingAfterBreak="0">
     <w:nsid w:val="44BD451E"/>
     <w:multiLevelType w:val="hybridMultilevel"/>
     <w:tmpl w:val="C13CBC6C"/>
@@ -30918,7 +31250,7 @@
       </w:rPr>
     </w:lvl>
   </w:abstractNum>
-  <w:abstractNum w:abstractNumId="33" w15:restartNumberingAfterBreak="0">
+  <w:abstractNum w:abstractNumId="34" w15:restartNumberingAfterBreak="0">
     <w:nsid w:val="46CD764C"/>
     <w:multiLevelType w:val="hybridMultilevel"/>
     <w:tmpl w:val="0DAA90A6"/>
@@ -31031,7 +31363,7 @@
       </w:rPr>
     </w:lvl>
   </w:abstractNum>
-  <w:abstractNum w:abstractNumId="34" w15:restartNumberingAfterBreak="0">
+  <w:abstractNum w:abstractNumId="35" w15:restartNumberingAfterBreak="0">
     <w:nsid w:val="48A068BA"/>
     <w:multiLevelType w:val="hybridMultilevel"/>
     <w:tmpl w:val="F3103312"/>
@@ -31144,7 +31476,7 @@
       </w:rPr>
     </w:lvl>
   </w:abstractNum>
-  <w:abstractNum w:abstractNumId="35" w15:restartNumberingAfterBreak="0">
+  <w:abstractNum w:abstractNumId="36" w15:restartNumberingAfterBreak="0">
     <w:nsid w:val="49615AB7"/>
     <w:multiLevelType w:val="hybridMultilevel"/>
     <w:tmpl w:val="F1A632FA"/>
@@ -31257,7 +31589,7 @@
       </w:rPr>
     </w:lvl>
   </w:abstractNum>
-  <w:abstractNum w:abstractNumId="36" w15:restartNumberingAfterBreak="0">
+  <w:abstractNum w:abstractNumId="37" w15:restartNumberingAfterBreak="0">
     <w:nsid w:val="4BBA7059"/>
     <w:multiLevelType w:val="hybridMultilevel"/>
     <w:tmpl w:val="A6E4EB9C"/>
@@ -31370,7 +31702,7 @@
       </w:rPr>
     </w:lvl>
   </w:abstractNum>
-  <w:abstractNum w:abstractNumId="37" w15:restartNumberingAfterBreak="0">
+  <w:abstractNum w:abstractNumId="38" w15:restartNumberingAfterBreak="0">
     <w:nsid w:val="4C117287"/>
     <w:multiLevelType w:val="hybridMultilevel"/>
     <w:tmpl w:val="6120849E"/>
@@ -31483,7 +31815,7 @@
       </w:rPr>
     </w:lvl>
   </w:abstractNum>
-  <w:abstractNum w:abstractNumId="38" w15:restartNumberingAfterBreak="0">
+  <w:abstractNum w:abstractNumId="39" w15:restartNumberingAfterBreak="0">
     <w:nsid w:val="4DCC618C"/>
     <w:multiLevelType w:val="hybridMultilevel"/>
     <w:tmpl w:val="A568096A"/>
@@ -31572,7 +31904,7 @@
       </w:pPr>
     </w:lvl>
   </w:abstractNum>
-  <w:abstractNum w:abstractNumId="39" w15:restartNumberingAfterBreak="0">
+  <w:abstractNum w:abstractNumId="40" w15:restartNumberingAfterBreak="0">
     <w:nsid w:val="4F9A0E40"/>
     <w:multiLevelType w:val="hybridMultilevel"/>
     <w:tmpl w:val="6C4065CE"/>
@@ -31661,7 +31993,7 @@
       </w:pPr>
     </w:lvl>
   </w:abstractNum>
-  <w:abstractNum w:abstractNumId="40" w15:restartNumberingAfterBreak="0">
+  <w:abstractNum w:abstractNumId="41" w15:restartNumberingAfterBreak="0">
     <w:nsid w:val="52E139E7"/>
     <w:multiLevelType w:val="hybridMultilevel"/>
     <w:tmpl w:val="1C6A66B2"/>
@@ -31774,7 +32106,7 @@
       </w:rPr>
     </w:lvl>
   </w:abstractNum>
-  <w:abstractNum w:abstractNumId="41" w15:restartNumberingAfterBreak="0">
+  <w:abstractNum w:abstractNumId="42" w15:restartNumberingAfterBreak="0">
     <w:nsid w:val="531A42D5"/>
     <w:multiLevelType w:val="hybridMultilevel"/>
     <w:tmpl w:val="3AA63F3C"/>
@@ -31887,7 +32219,7 @@
       </w:rPr>
     </w:lvl>
   </w:abstractNum>
-  <w:abstractNum w:abstractNumId="42" w15:restartNumberingAfterBreak="0">
+  <w:abstractNum w:abstractNumId="43" w15:restartNumberingAfterBreak="0">
     <w:nsid w:val="582F4861"/>
     <w:multiLevelType w:val="hybridMultilevel"/>
     <w:tmpl w:val="2BC483EA"/>
@@ -32000,7 +32332,7 @@
       </w:rPr>
     </w:lvl>
   </w:abstractNum>
-  <w:abstractNum w:abstractNumId="43" w15:restartNumberingAfterBreak="0">
+  <w:abstractNum w:abstractNumId="44" w15:restartNumberingAfterBreak="0">
     <w:nsid w:val="59BE2178"/>
     <w:multiLevelType w:val="hybridMultilevel"/>
     <w:tmpl w:val="80C80762"/>
@@ -32113,7 +32445,7 @@
       </w:rPr>
     </w:lvl>
   </w:abstractNum>
-  <w:abstractNum w:abstractNumId="44" w15:restartNumberingAfterBreak="0">
+  <w:abstractNum w:abstractNumId="45" w15:restartNumberingAfterBreak="0">
     <w:nsid w:val="5A0D7A9A"/>
     <w:multiLevelType w:val="hybridMultilevel"/>
     <w:tmpl w:val="51FCC29E"/>
@@ -32226,7 +32558,7 @@
       </w:rPr>
     </w:lvl>
   </w:abstractNum>
-  <w:abstractNum w:abstractNumId="45" w15:restartNumberingAfterBreak="0">
+  <w:abstractNum w:abstractNumId="46" w15:restartNumberingAfterBreak="0">
     <w:nsid w:val="5B3D6A12"/>
     <w:multiLevelType w:val="hybridMultilevel"/>
     <w:tmpl w:val="F8FA1508"/>
@@ -32339,7 +32671,7 @@
       </w:rPr>
     </w:lvl>
   </w:abstractNum>
-  <w:abstractNum w:abstractNumId="46" w15:restartNumberingAfterBreak="0">
+  <w:abstractNum w:abstractNumId="47" w15:restartNumberingAfterBreak="0">
     <w:nsid w:val="5D455CC8"/>
     <w:multiLevelType w:val="hybridMultilevel"/>
     <w:tmpl w:val="1FEE39E8"/>
@@ -32452,7 +32784,7 @@
       </w:rPr>
     </w:lvl>
   </w:abstractNum>
-  <w:abstractNum w:abstractNumId="47" w15:restartNumberingAfterBreak="0">
+  <w:abstractNum w:abstractNumId="48" w15:restartNumberingAfterBreak="0">
     <w:nsid w:val="5EB216F7"/>
     <w:multiLevelType w:val="hybridMultilevel"/>
     <w:tmpl w:val="68C8468C"/>
@@ -32565,7 +32897,7 @@
       </w:rPr>
     </w:lvl>
   </w:abstractNum>
-  <w:abstractNum w:abstractNumId="48" w15:restartNumberingAfterBreak="0">
+  <w:abstractNum w:abstractNumId="49" w15:restartNumberingAfterBreak="0">
     <w:nsid w:val="5F0D47E6"/>
     <w:multiLevelType w:val="hybridMultilevel"/>
     <w:tmpl w:val="4FF83556"/>
@@ -32678,7 +33010,7 @@
       </w:rPr>
     </w:lvl>
   </w:abstractNum>
-  <w:abstractNum w:abstractNumId="49" w15:restartNumberingAfterBreak="0">
+  <w:abstractNum w:abstractNumId="50" w15:restartNumberingAfterBreak="0">
     <w:nsid w:val="60F72CBD"/>
     <w:multiLevelType w:val="hybridMultilevel"/>
     <w:tmpl w:val="FDB0EE6E"/>
@@ -32791,7 +33123,7 @@
       </w:rPr>
     </w:lvl>
   </w:abstractNum>
-  <w:abstractNum w:abstractNumId="50" w15:restartNumberingAfterBreak="0">
+  <w:abstractNum w:abstractNumId="51" w15:restartNumberingAfterBreak="0">
     <w:nsid w:val="616404AD"/>
     <w:multiLevelType w:val="hybridMultilevel"/>
     <w:tmpl w:val="27A66576"/>
@@ -32880,7 +33212,7 @@
       </w:pPr>
     </w:lvl>
   </w:abstractNum>
-  <w:abstractNum w:abstractNumId="51" w15:restartNumberingAfterBreak="0">
+  <w:abstractNum w:abstractNumId="52" w15:restartNumberingAfterBreak="0">
     <w:nsid w:val="66052B1C"/>
     <w:multiLevelType w:val="hybridMultilevel"/>
     <w:tmpl w:val="ACAA9A16"/>
@@ -32993,7 +33325,7 @@
       </w:rPr>
     </w:lvl>
   </w:abstractNum>
-  <w:abstractNum w:abstractNumId="52" w15:restartNumberingAfterBreak="0">
+  <w:abstractNum w:abstractNumId="53" w15:restartNumberingAfterBreak="0">
     <w:nsid w:val="67D10D1E"/>
     <w:multiLevelType w:val="hybridMultilevel"/>
     <w:tmpl w:val="C554AA3A"/>
@@ -33106,7 +33438,7 @@
       </w:rPr>
     </w:lvl>
   </w:abstractNum>
-  <w:abstractNum w:abstractNumId="53" w15:restartNumberingAfterBreak="0">
+  <w:abstractNum w:abstractNumId="54" w15:restartNumberingAfterBreak="0">
     <w:nsid w:val="68234217"/>
     <w:multiLevelType w:val="hybridMultilevel"/>
     <w:tmpl w:val="3A3C77BE"/>
@@ -33219,7 +33551,7 @@
       </w:rPr>
     </w:lvl>
   </w:abstractNum>
-  <w:abstractNum w:abstractNumId="54" w15:restartNumberingAfterBreak="0">
+  <w:abstractNum w:abstractNumId="55" w15:restartNumberingAfterBreak="0">
     <w:nsid w:val="69B33DA1"/>
     <w:multiLevelType w:val="hybridMultilevel"/>
     <w:tmpl w:val="309AEB4C"/>
@@ -33332,7 +33664,7 @@
       </w:rPr>
     </w:lvl>
   </w:abstractNum>
-  <w:abstractNum w:abstractNumId="55" w15:restartNumberingAfterBreak="0">
+  <w:abstractNum w:abstractNumId="56" w15:restartNumberingAfterBreak="0">
     <w:nsid w:val="6B6A018A"/>
     <w:multiLevelType w:val="hybridMultilevel"/>
     <w:tmpl w:val="59EE6A1E"/>
@@ -33445,7 +33777,7 @@
       </w:rPr>
     </w:lvl>
   </w:abstractNum>
-  <w:abstractNum w:abstractNumId="56" w15:restartNumberingAfterBreak="0">
+  <w:abstractNum w:abstractNumId="57" w15:restartNumberingAfterBreak="0">
     <w:nsid w:val="6EC14096"/>
     <w:multiLevelType w:val="hybridMultilevel"/>
     <w:tmpl w:val="F95A9E8C"/>
@@ -33558,7 +33890,7 @@
       </w:rPr>
     </w:lvl>
   </w:abstractNum>
-  <w:abstractNum w:abstractNumId="57" w15:restartNumberingAfterBreak="0">
+  <w:abstractNum w:abstractNumId="58" w15:restartNumberingAfterBreak="0">
     <w:nsid w:val="6FFF6011"/>
     <w:multiLevelType w:val="hybridMultilevel"/>
     <w:tmpl w:val="6F929624"/>
@@ -33671,7 +34003,7 @@
       </w:rPr>
     </w:lvl>
   </w:abstractNum>
-  <w:abstractNum w:abstractNumId="58" w15:restartNumberingAfterBreak="0">
+  <w:abstractNum w:abstractNumId="59" w15:restartNumberingAfterBreak="0">
     <w:nsid w:val="70C57E1A"/>
     <w:multiLevelType w:val="hybridMultilevel"/>
     <w:tmpl w:val="1F2AFAD6"/>
@@ -33784,7 +34116,7 @@
       </w:rPr>
     </w:lvl>
   </w:abstractNum>
-  <w:abstractNum w:abstractNumId="59" w15:restartNumberingAfterBreak="0">
+  <w:abstractNum w:abstractNumId="60" w15:restartNumberingAfterBreak="0">
     <w:nsid w:val="72A859E8"/>
     <w:multiLevelType w:val="hybridMultilevel"/>
     <w:tmpl w:val="D7820D56"/>
@@ -33897,7 +34229,7 @@
       </w:rPr>
     </w:lvl>
   </w:abstractNum>
-  <w:abstractNum w:abstractNumId="60" w15:restartNumberingAfterBreak="0">
+  <w:abstractNum w:abstractNumId="61" w15:restartNumberingAfterBreak="0">
     <w:nsid w:val="72AE4BA8"/>
     <w:multiLevelType w:val="hybridMultilevel"/>
     <w:tmpl w:val="4B321EFA"/>
@@ -34010,7 +34342,7 @@
       </w:rPr>
     </w:lvl>
   </w:abstractNum>
-  <w:abstractNum w:abstractNumId="61" w15:restartNumberingAfterBreak="0">
+  <w:abstractNum w:abstractNumId="62" w15:restartNumberingAfterBreak="0">
     <w:nsid w:val="72D52529"/>
     <w:multiLevelType w:val="hybridMultilevel"/>
     <w:tmpl w:val="87729476"/>
@@ -34123,7 +34455,7 @@
       </w:rPr>
     </w:lvl>
   </w:abstractNum>
-  <w:abstractNum w:abstractNumId="62" w15:restartNumberingAfterBreak="0">
+  <w:abstractNum w:abstractNumId="63" w15:restartNumberingAfterBreak="0">
     <w:nsid w:val="7304338D"/>
     <w:multiLevelType w:val="hybridMultilevel"/>
     <w:tmpl w:val="E95E55B0"/>
@@ -34236,7 +34568,7 @@
       </w:rPr>
     </w:lvl>
   </w:abstractNum>
-  <w:abstractNum w:abstractNumId="63" w15:restartNumberingAfterBreak="0">
+  <w:abstractNum w:abstractNumId="64" w15:restartNumberingAfterBreak="0">
     <w:nsid w:val="74A07DD0"/>
     <w:multiLevelType w:val="hybridMultilevel"/>
     <w:tmpl w:val="E5DE3130"/>
@@ -34349,7 +34681,7 @@
       </w:rPr>
     </w:lvl>
   </w:abstractNum>
-  <w:abstractNum w:abstractNumId="64" w15:restartNumberingAfterBreak="0">
+  <w:abstractNum w:abstractNumId="65" w15:restartNumberingAfterBreak="0">
     <w:nsid w:val="760C0504"/>
     <w:multiLevelType w:val="hybridMultilevel"/>
     <w:tmpl w:val="89E47ADC"/>
@@ -34462,7 +34794,7 @@
       </w:rPr>
     </w:lvl>
   </w:abstractNum>
-  <w:abstractNum w:abstractNumId="65" w15:restartNumberingAfterBreak="0">
+  <w:abstractNum w:abstractNumId="66" w15:restartNumberingAfterBreak="0">
     <w:nsid w:val="78AA651A"/>
     <w:multiLevelType w:val="hybridMultilevel"/>
     <w:tmpl w:val="A5E26828"/>
@@ -34575,7 +34907,7 @@
       </w:rPr>
     </w:lvl>
   </w:abstractNum>
-  <w:abstractNum w:abstractNumId="66" w15:restartNumberingAfterBreak="0">
+  <w:abstractNum w:abstractNumId="67" w15:restartNumberingAfterBreak="0">
     <w:nsid w:val="795C1299"/>
     <w:multiLevelType w:val="hybridMultilevel"/>
     <w:tmpl w:val="A8D8E346"/>
@@ -34688,7 +35020,7 @@
       </w:rPr>
     </w:lvl>
   </w:abstractNum>
-  <w:abstractNum w:abstractNumId="67" w15:restartNumberingAfterBreak="0">
+  <w:abstractNum w:abstractNumId="68" w15:restartNumberingAfterBreak="0">
     <w:nsid w:val="79EF228F"/>
     <w:multiLevelType w:val="hybridMultilevel"/>
     <w:tmpl w:val="5CB2B418"/>
@@ -34801,7 +35133,7 @@
       </w:rPr>
     </w:lvl>
   </w:abstractNum>
-  <w:abstractNum w:abstractNumId="68" w15:restartNumberingAfterBreak="0">
+  <w:abstractNum w:abstractNumId="69" w15:restartNumberingAfterBreak="0">
     <w:nsid w:val="7A40364C"/>
     <w:multiLevelType w:val="hybridMultilevel"/>
     <w:tmpl w:val="165C486A"/>
@@ -34914,7 +35246,7 @@
       </w:rPr>
     </w:lvl>
   </w:abstractNum>
-  <w:abstractNum w:abstractNumId="69" w15:restartNumberingAfterBreak="0">
+  <w:abstractNum w:abstractNumId="70" w15:restartNumberingAfterBreak="0">
     <w:nsid w:val="7B8747A7"/>
     <w:multiLevelType w:val="hybridMultilevel"/>
     <w:tmpl w:val="34CCCEA8"/>
@@ -35027,7 +35359,7 @@
       </w:rPr>
     </w:lvl>
   </w:abstractNum>
-  <w:abstractNum w:abstractNumId="70" w15:restartNumberingAfterBreak="0">
+  <w:abstractNum w:abstractNumId="71" w15:restartNumberingAfterBreak="0">
     <w:nsid w:val="7C6A320D"/>
     <w:multiLevelType w:val="hybridMultilevel"/>
     <w:tmpl w:val="C12E93C8"/>
@@ -35140,7 +35472,7 @@
       </w:rPr>
     </w:lvl>
   </w:abstractNum>
-  <w:abstractNum w:abstractNumId="71" w15:restartNumberingAfterBreak="0">
+  <w:abstractNum w:abstractNumId="72" w15:restartNumberingAfterBreak="0">
     <w:nsid w:val="7CA75990"/>
     <w:multiLevelType w:val="hybridMultilevel"/>
     <w:tmpl w:val="4B78C07E"/>
@@ -35253,7 +35585,7 @@
       </w:rPr>
     </w:lvl>
   </w:abstractNum>
-  <w:abstractNum w:abstractNumId="72" w15:restartNumberingAfterBreak="0">
+  <w:abstractNum w:abstractNumId="73" w15:restartNumberingAfterBreak="0">
     <w:nsid w:val="7CB204A1"/>
     <w:multiLevelType w:val="hybridMultilevel"/>
     <w:tmpl w:val="95F661C4"/>
@@ -35366,7 +35698,7 @@
       </w:rPr>
     </w:lvl>
   </w:abstractNum>
-  <w:abstractNum w:abstractNumId="73" w15:restartNumberingAfterBreak="0">
+  <w:abstractNum w:abstractNumId="74" w15:restartNumberingAfterBreak="0">
     <w:nsid w:val="7E4E4B2D"/>
     <w:multiLevelType w:val="hybridMultilevel"/>
     <w:tmpl w:val="66DEE0C4"/>
@@ -35479,7 +35811,7 @@
       </w:rPr>
     </w:lvl>
   </w:abstractNum>
-  <w:abstractNum w:abstractNumId="74" w15:restartNumberingAfterBreak="0">
+  <w:abstractNum w:abstractNumId="75" w15:restartNumberingAfterBreak="0">
     <w:nsid w:val="7E6F2F1E"/>
     <w:multiLevelType w:val="hybridMultilevel"/>
     <w:tmpl w:val="48F09C90"/>
@@ -35593,100 +35925,100 @@
     </w:lvl>
   </w:abstractNum>
   <w:num w:numId="1" w16cid:durableId="1296568888">
-    <w:abstractNumId w:val="19"/>
+    <w:abstractNumId w:val="20"/>
   </w:num>
   <w:num w:numId="2" w16cid:durableId="1735665888">
-    <w:abstractNumId w:val="35"/>
+    <w:abstractNumId w:val="36"/>
   </w:num>
   <w:num w:numId="3" w16cid:durableId="1952131848">
-    <w:abstractNumId w:val="11"/>
+    <w:abstractNumId w:val="12"/>
   </w:num>
   <w:num w:numId="4" w16cid:durableId="1895382378">
-    <w:abstractNumId w:val="36"/>
+    <w:abstractNumId w:val="37"/>
   </w:num>
   <w:num w:numId="5" w16cid:durableId="2145341825">
-    <w:abstractNumId w:val="73"/>
+    <w:abstractNumId w:val="74"/>
   </w:num>
   <w:num w:numId="6" w16cid:durableId="1019350556">
     <w:abstractNumId w:val="3"/>
   </w:num>
   <w:num w:numId="7" w16cid:durableId="516161777">
-    <w:abstractNumId w:val="37"/>
+    <w:abstractNumId w:val="38"/>
   </w:num>
   <w:num w:numId="8" w16cid:durableId="224921923">
-    <w:abstractNumId w:val="61"/>
+    <w:abstractNumId w:val="62"/>
   </w:num>
   <w:num w:numId="9" w16cid:durableId="850727383">
     <w:abstractNumId w:val="2"/>
   </w:num>
   <w:num w:numId="10" w16cid:durableId="1640575075">
-    <w:abstractNumId w:val="67"/>
+    <w:abstractNumId w:val="68"/>
   </w:num>
   <w:num w:numId="11" w16cid:durableId="919215980">
-    <w:abstractNumId w:val="10"/>
+    <w:abstractNumId w:val="11"/>
   </w:num>
   <w:num w:numId="12" w16cid:durableId="1934820377">
-    <w:abstractNumId w:val="54"/>
+    <w:abstractNumId w:val="55"/>
   </w:num>
   <w:num w:numId="13" w16cid:durableId="1781608435">
-    <w:abstractNumId w:val="16"/>
+    <w:abstractNumId w:val="17"/>
   </w:num>
   <w:num w:numId="14" w16cid:durableId="1970041389">
     <w:abstractNumId w:val="0"/>
   </w:num>
   <w:num w:numId="15" w16cid:durableId="1725637943">
-    <w:abstractNumId w:val="34"/>
+    <w:abstractNumId w:val="35"/>
   </w:num>
   <w:num w:numId="16" w16cid:durableId="445348997">
+    <w:abstractNumId w:val="42"/>
+  </w:num>
+  <w:num w:numId="17" w16cid:durableId="1944456301">
     <w:abstractNumId w:val="41"/>
   </w:num>
-  <w:num w:numId="17" w16cid:durableId="1944456301">
-    <w:abstractNumId w:val="40"/>
-  </w:num>
   <w:num w:numId="18" w16cid:durableId="729616162">
-    <w:abstractNumId w:val="30"/>
+    <w:abstractNumId w:val="31"/>
   </w:num>
   <w:num w:numId="19" w16cid:durableId="1838498867">
-    <w:abstractNumId w:val="12"/>
+    <w:abstractNumId w:val="13"/>
   </w:num>
   <w:num w:numId="20" w16cid:durableId="1869292370">
-    <w:abstractNumId w:val="18"/>
+    <w:abstractNumId w:val="19"/>
   </w:num>
   <w:num w:numId="21" w16cid:durableId="835460535">
-    <w:abstractNumId w:val="20"/>
+    <w:abstractNumId w:val="21"/>
   </w:num>
   <w:num w:numId="22" w16cid:durableId="1293101376">
-    <w:abstractNumId w:val="24"/>
+    <w:abstractNumId w:val="25"/>
   </w:num>
   <w:num w:numId="23" w16cid:durableId="1353651711">
-    <w:abstractNumId w:val="69"/>
+    <w:abstractNumId w:val="70"/>
   </w:num>
   <w:num w:numId="24" w16cid:durableId="1664041347">
-    <w:abstractNumId w:val="60"/>
+    <w:abstractNumId w:val="61"/>
   </w:num>
   <w:num w:numId="25" w16cid:durableId="476990610">
-    <w:abstractNumId w:val="26"/>
+    <w:abstractNumId w:val="27"/>
   </w:num>
   <w:num w:numId="26" w16cid:durableId="211498592">
-    <w:abstractNumId w:val="25"/>
+    <w:abstractNumId w:val="26"/>
   </w:num>
   <w:num w:numId="27" w16cid:durableId="1707486314">
     <w:abstractNumId w:val="8"/>
   </w:num>
   <w:num w:numId="28" w16cid:durableId="1027566498">
-    <w:abstractNumId w:val="65"/>
+    <w:abstractNumId w:val="66"/>
   </w:num>
   <w:num w:numId="29" w16cid:durableId="979840888">
-    <w:abstractNumId w:val="28"/>
+    <w:abstractNumId w:val="29"/>
   </w:num>
   <w:num w:numId="30" w16cid:durableId="1025323814">
+    <w:abstractNumId w:val="64"/>
+  </w:num>
+  <w:num w:numId="31" w16cid:durableId="572160834">
     <w:abstractNumId w:val="63"/>
   </w:num>
-  <w:num w:numId="31" w16cid:durableId="572160834">
-    <w:abstractNumId w:val="62"/>
-  </w:num>
   <w:num w:numId="32" w16cid:durableId="635599666">
-    <w:abstractNumId w:val="64"/>
+    <w:abstractNumId w:val="65"/>
   </w:num>
   <w:num w:numId="33" w16cid:durableId="1716536781">
     <w:abstractNumId w:val="6"/>
@@ -35695,127 +36027,130 @@
     <w:abstractNumId w:val="4"/>
   </w:num>
   <w:num w:numId="35" w16cid:durableId="584535214">
-    <w:abstractNumId w:val="55"/>
+    <w:abstractNumId w:val="56"/>
   </w:num>
   <w:num w:numId="36" w16cid:durableId="2040280222">
+    <w:abstractNumId w:val="49"/>
+  </w:num>
+  <w:num w:numId="37" w16cid:durableId="322205196">
+    <w:abstractNumId w:val="58"/>
+  </w:num>
+  <w:num w:numId="38" w16cid:durableId="945579640">
     <w:abstractNumId w:val="48"/>
   </w:num>
-  <w:num w:numId="37" w16cid:durableId="322205196">
-    <w:abstractNumId w:val="57"/>
-  </w:num>
-  <w:num w:numId="38" w16cid:durableId="945579640">
-    <w:abstractNumId w:val="47"/>
-  </w:num>
   <w:num w:numId="39" w16cid:durableId="1061518593">
-    <w:abstractNumId w:val="43"/>
+    <w:abstractNumId w:val="44"/>
   </w:num>
   <w:num w:numId="40" w16cid:durableId="1599406133">
-    <w:abstractNumId w:val="21"/>
+    <w:abstractNumId w:val="22"/>
   </w:num>
   <w:num w:numId="41" w16cid:durableId="436756851">
-    <w:abstractNumId w:val="51"/>
+    <w:abstractNumId w:val="52"/>
   </w:num>
   <w:num w:numId="42" w16cid:durableId="1784688585">
-    <w:abstractNumId w:val="49"/>
+    <w:abstractNumId w:val="50"/>
   </w:num>
   <w:num w:numId="43" w16cid:durableId="1812088806">
-    <w:abstractNumId w:val="72"/>
+    <w:abstractNumId w:val="73"/>
   </w:num>
   <w:num w:numId="44" w16cid:durableId="195657557">
-    <w:abstractNumId w:val="17"/>
+    <w:abstractNumId w:val="18"/>
   </w:num>
   <w:num w:numId="45" w16cid:durableId="841241357">
-    <w:abstractNumId w:val="44"/>
+    <w:abstractNumId w:val="45"/>
   </w:num>
   <w:num w:numId="46" w16cid:durableId="1696038040">
-    <w:abstractNumId w:val="14"/>
+    <w:abstractNumId w:val="15"/>
   </w:num>
   <w:num w:numId="47" w16cid:durableId="79061021">
-    <w:abstractNumId w:val="58"/>
+    <w:abstractNumId w:val="59"/>
   </w:num>
   <w:num w:numId="48" w16cid:durableId="600991287">
-    <w:abstractNumId w:val="15"/>
+    <w:abstractNumId w:val="16"/>
   </w:num>
   <w:num w:numId="49" w16cid:durableId="1322612271">
-    <w:abstractNumId w:val="33"/>
+    <w:abstractNumId w:val="34"/>
   </w:num>
   <w:num w:numId="50" w16cid:durableId="1052384627">
-    <w:abstractNumId w:val="74"/>
+    <w:abstractNumId w:val="75"/>
   </w:num>
   <w:num w:numId="51" w16cid:durableId="787310942">
     <w:abstractNumId w:val="1"/>
   </w:num>
   <w:num w:numId="52" w16cid:durableId="496043113">
-    <w:abstractNumId w:val="42"/>
+    <w:abstractNumId w:val="43"/>
   </w:num>
   <w:num w:numId="53" w16cid:durableId="902181582">
-    <w:abstractNumId w:val="32"/>
+    <w:abstractNumId w:val="33"/>
   </w:num>
   <w:num w:numId="54" w16cid:durableId="21711973">
     <w:abstractNumId w:val="5"/>
   </w:num>
   <w:num w:numId="55" w16cid:durableId="2125034640">
-    <w:abstractNumId w:val="71"/>
+    <w:abstractNumId w:val="72"/>
   </w:num>
   <w:num w:numId="56" w16cid:durableId="117144356">
-    <w:abstractNumId w:val="45"/>
+    <w:abstractNumId w:val="46"/>
   </w:num>
   <w:num w:numId="57" w16cid:durableId="1421025386">
-    <w:abstractNumId w:val="27"/>
+    <w:abstractNumId w:val="28"/>
   </w:num>
   <w:num w:numId="58" w16cid:durableId="540433697">
-    <w:abstractNumId w:val="46"/>
+    <w:abstractNumId w:val="47"/>
   </w:num>
   <w:num w:numId="59" w16cid:durableId="1048843247">
-    <w:abstractNumId w:val="53"/>
+    <w:abstractNumId w:val="54"/>
   </w:num>
   <w:num w:numId="60" w16cid:durableId="1407189402">
-    <w:abstractNumId w:val="23"/>
+    <w:abstractNumId w:val="24"/>
   </w:num>
   <w:num w:numId="61" w16cid:durableId="309094460">
     <w:abstractNumId w:val="7"/>
   </w:num>
   <w:num w:numId="62" w16cid:durableId="879170590">
-    <w:abstractNumId w:val="59"/>
+    <w:abstractNumId w:val="60"/>
   </w:num>
   <w:num w:numId="63" w16cid:durableId="474641774">
-    <w:abstractNumId w:val="29"/>
+    <w:abstractNumId w:val="30"/>
   </w:num>
   <w:num w:numId="64" w16cid:durableId="616641617">
-    <w:abstractNumId w:val="31"/>
+    <w:abstractNumId w:val="32"/>
   </w:num>
   <w:num w:numId="65" w16cid:durableId="477233928">
-    <w:abstractNumId w:val="70"/>
+    <w:abstractNumId w:val="71"/>
   </w:num>
   <w:num w:numId="66" w16cid:durableId="1771121128">
-    <w:abstractNumId w:val="56"/>
+    <w:abstractNumId w:val="57"/>
   </w:num>
   <w:num w:numId="67" w16cid:durableId="514002414">
-    <w:abstractNumId w:val="13"/>
+    <w:abstractNumId w:val="14"/>
   </w:num>
   <w:num w:numId="68" w16cid:durableId="994991438">
-    <w:abstractNumId w:val="22"/>
+    <w:abstractNumId w:val="23"/>
   </w:num>
   <w:num w:numId="69" w16cid:durableId="380371239">
-    <w:abstractNumId w:val="52"/>
+    <w:abstractNumId w:val="53"/>
   </w:num>
   <w:num w:numId="70" w16cid:durableId="698700689">
-    <w:abstractNumId w:val="50"/>
+    <w:abstractNumId w:val="51"/>
   </w:num>
   <w:num w:numId="71" w16cid:durableId="150949584">
-    <w:abstractNumId w:val="9"/>
+    <w:abstractNumId w:val="10"/>
   </w:num>
   <w:num w:numId="72" w16cid:durableId="1467892507">
+    <w:abstractNumId w:val="40"/>
+  </w:num>
+  <w:num w:numId="73" w16cid:durableId="1134641105">
+    <w:abstractNumId w:val="67"/>
+  </w:num>
+  <w:num w:numId="74" w16cid:durableId="1053694936">
     <w:abstractNumId w:val="39"/>
   </w:num>
-  <w:num w:numId="73" w16cid:durableId="1134641105">
-    <w:abstractNumId w:val="66"/>
+  <w:num w:numId="75" w16cid:durableId="1032150362">
+    <w:abstractNumId w:val="69"/>
   </w:num>
-  <w:num w:numId="74" w16cid:durableId="1053694936">
-    <w:abstractNumId w:val="38"/>
-  </w:num>
-  <w:num w:numId="75" w16cid:durableId="1032150362">
-    <w:abstractNumId w:val="68"/>
+  <w:num w:numId="76" w16cid:durableId="906453465">
+    <w:abstractNumId w:val="9"/>
   </w:num>
   <w:numIdMacAtCleanup w:val="72"/>
 </w:numbering>
@@ -36225,7 +36560,6 @@
   <w:style w:type="character" w:default="1" w:styleId="DefaultParagraphFont">
     <w:name w:val="Default Paragraph Font"/>
     <w:uiPriority w:val="1"/>
-    <w:semiHidden/>
     <w:unhideWhenUsed/>
   </w:style>
   <w:style w:type="table" w:default="1" w:styleId="TableNormal">

</xml_diff>